<commit_message>
Relocate DOCX pipeline to Vietnamese Educational Document Formatting Standard with new custom exporters
</commit_message>
<xml_diff>
--- a/agent soạn tài liệu/output/bai3_noi_nang_nhiet_luong/ready/bai3_noi_nang_nhiet_luong_phieu_hoc_tap.docx
+++ b/agent soạn tài liệu/output/bai3_noi_nang_nhiet_luong/ready/bai3_noi_nang_nhiet_luong_phieu_hoc_tap.docx
@@ -4,151 +4,283 @@
   <w:body>
     <w:p>
       <w:pPr>
-        <w:spacing w:before="360" w:after="160"/>
+        <w:spacing w:after="40"/>
+        <w:jc w:val="left"/>
+      </w:pPr>
+      <w:r>
+        <w:rPr>
+          <w:rFonts w:ascii="Times New Roman" w:hAnsi="Times New Roman"/>
+          <w:i/>
+          <w:color w:val="666666"/>
+          <w:sz w:val="22"/>
+        </w:rPr>
+        <w:t>TRƯỜNG THPT: ................................................</w:t>
+        <w:br/>
+      </w:r>
+    </w:p>
+    <w:p>
+      <w:pPr>
+        <w:keepNext/>
+        <w:spacing w:before="240" w:after="240"/>
         <w:jc w:val="center"/>
       </w:pPr>
       <w:r>
         <w:rPr>
           <w:rFonts w:ascii="Times New Roman" w:hAnsi="Times New Roman"/>
           <w:b/>
-          <w:color w:val="1E3A5F"/>
+          <w:color w:val="1F4E79"/>
           <w:sz w:val="32"/>
         </w:rPr>
-        <w:t>BÀI 3 - NỘI NĂNG, NHIỆT LƯỢNG</w:t>
+        <w:t>PHIẾU HỌC TẬP</w:t>
+      </w:r>
+    </w:p>
+    <w:p>
+      <w:pPr>
+        <w:spacing w:before="0" w:after="200"/>
+        <w:jc w:val="center"/>
+      </w:pPr>
+      <w:r>
+        <w:rPr>
+          <w:rFonts w:ascii="Times New Roman" w:hAnsi="Times New Roman"/>
+          <w:i/>
+          <w:color w:val="666666"/>
+          <w:sz w:val="18"/>
+        </w:rPr>
+        <w:t>(Mẫu tài liệu học tập theo CTGDPT 2018)</w:t>
       </w:r>
     </w:p>
     <w:tbl>
       <w:tblPr>
         <w:tblW w:type="auto" w:w="0"/>
         <w:jc w:val="center"/>
-        <w:tblLayout w:type="fixed"/>
         <w:tblLook w:firstColumn="1" w:firstRow="1" w:lastColumn="0" w:lastRow="0" w:noHBand="0" w:noVBand="1" w:val="04A0"/>
       </w:tblPr>
       <w:tblGrid>
-        <w:gridCol w:w="3118"/>
-        <w:gridCol w:w="3118"/>
-        <w:gridCol w:w="3118"/>
+        <w:gridCol w:w="4819"/>
+        <w:gridCol w:w="4819"/>
       </w:tblGrid>
       <w:tr>
+        <w:trPr>
+          <w:cantSplit/>
+        </w:trPr>
         <w:tc>
           <w:tcPr>
-            <w:tcW w:type="dxa" w:w="4819"/>
+            <w:tcW w:type="dxa" w:w="5386"/>
+            <w:tcMar>
+              <w:top w:w="120" w:type="dxa"/>
+              <w:bottom w:w="120" w:type="dxa"/>
+              <w:left w:w="120" w:type="dxa"/>
+              <w:right w:w="120" w:type="dxa"/>
+            </w:tcMar>
             <w:tcBorders>
-              <w:top w:val="none"/>
-              <w:left w:val="none"/>
-              <w:bottom w:val="none"/>
-              <w:right w:val="none"/>
+              <w:top w:val="single" w:sz="4" w:space="0" w:color="BFBFBF"/>
+              <w:left w:val="single" w:sz="4" w:space="0" w:color="BFBFBF"/>
+              <w:bottom w:val="single" w:sz="4" w:space="0" w:color="BFBFBF"/>
+              <w:right w:val="single" w:sz="4" w:space="0" w:color="BFBFBF"/>
             </w:tcBorders>
           </w:tcPr>
           <w:p>
             <w:pPr>
-              <w:spacing w:before="0" w:after="40"/>
+              <w:spacing w:before="60" w:after="60"/>
+              <w:ind w:left="113"/>
             </w:pPr>
             <w:r/>
             <w:r>
               <w:rPr>
                 <w:rFonts w:ascii="Times New Roman" w:hAnsi="Times New Roman"/>
-                <w:color w:val="212121"/>
+                <w:color w:val="000000"/>
                 <w:sz w:val="22"/>
               </w:rPr>
-              <w:t>Họ và tên: .......................................</w:t>
+              <w:t>Họ và tên học sinh: .......................................</w:t>
             </w:r>
           </w:p>
         </w:tc>
         <w:tc>
           <w:tcPr>
-            <w:tcW w:type="dxa" w:w="1814"/>
+            <w:tcW w:type="dxa" w:w="4252"/>
+            <w:tcMar>
+              <w:top w:w="120" w:type="dxa"/>
+              <w:bottom w:w="120" w:type="dxa"/>
+              <w:left w:w="120" w:type="dxa"/>
+              <w:right w:w="120" w:type="dxa"/>
+            </w:tcMar>
             <w:tcBorders>
-              <w:top w:val="none"/>
-              <w:left w:val="none"/>
-              <w:bottom w:val="none"/>
-              <w:right w:val="none"/>
+              <w:top w:val="single" w:sz="4" w:space="0" w:color="BFBFBF"/>
+              <w:left w:val="single" w:sz="4" w:space="0" w:color="BFBFBF"/>
+              <w:bottom w:val="single" w:sz="4" w:space="0" w:color="BFBFBF"/>
+              <w:right w:val="single" w:sz="4" w:space="0" w:color="BFBFBF"/>
             </w:tcBorders>
           </w:tcPr>
           <w:p>
             <w:pPr>
-              <w:spacing w:before="0" w:after="40"/>
+              <w:spacing w:before="60" w:after="60"/>
+              <w:ind w:left="113"/>
             </w:pPr>
             <w:r/>
             <w:r>
               <w:rPr>
                 <w:rFonts w:ascii="Times New Roman" w:hAnsi="Times New Roman"/>
-                <w:color w:val="212121"/>
+                <w:color w:val="000000"/>
                 <w:sz w:val="22"/>
               </w:rPr>
-              <w:t>Lớp: ........................</w:t>
+              <w:t>Lớp: .................  Nhóm: .................</w:t>
+            </w:r>
+          </w:p>
+        </w:tc>
+      </w:tr>
+      <w:tr>
+        <w:trPr>
+          <w:cantSplit/>
+        </w:trPr>
+        <w:tc>
+          <w:tcPr>
+            <w:tcW w:type="dxa" w:w="5386"/>
+            <w:tcMar>
+              <w:top w:w="120" w:type="dxa"/>
+              <w:bottom w:w="120" w:type="dxa"/>
+              <w:left w:w="120" w:type="dxa"/>
+              <w:right w:w="120" w:type="dxa"/>
+            </w:tcMar>
+            <w:tcBorders>
+              <w:top w:val="single" w:sz="4" w:space="0" w:color="BFBFBF"/>
+              <w:left w:val="single" w:sz="4" w:space="0" w:color="BFBFBF"/>
+              <w:bottom w:val="single" w:sz="4" w:space="0" w:color="BFBFBF"/>
+              <w:right w:val="single" w:sz="4" w:space="0" w:color="BFBFBF"/>
+            </w:tcBorders>
+          </w:tcPr>
+          <w:p>
+            <w:pPr>
+              <w:spacing w:before="60" w:after="60"/>
+              <w:ind w:left="113"/>
+            </w:pPr>
+            <w:r/>
+            <w:r>
+              <w:rPr>
+                <w:rFonts w:ascii="Times New Roman" w:hAnsi="Times New Roman"/>
+                <w:color w:val="000000"/>
+                <w:sz w:val="22"/>
+              </w:rPr>
+              <w:t>Môn học: Vật lí 12 (CTGDPT 2018)</w:t>
             </w:r>
           </w:p>
         </w:tc>
         <w:tc>
           <w:tcPr>
-            <w:tcW w:type="dxa" w:w="2721"/>
+            <w:tcW w:type="dxa" w:w="4252"/>
+            <w:tcMar>
+              <w:top w:w="120" w:type="dxa"/>
+              <w:bottom w:w="120" w:type="dxa"/>
+              <w:left w:w="120" w:type="dxa"/>
+              <w:right w:w="120" w:type="dxa"/>
+            </w:tcMar>
             <w:tcBorders>
-              <w:top w:val="none"/>
-              <w:left w:val="none"/>
-              <w:bottom w:val="none"/>
-              <w:right w:val="none"/>
+              <w:top w:val="single" w:sz="4" w:space="0" w:color="BFBFBF"/>
+              <w:left w:val="single" w:sz="4" w:space="0" w:color="BFBFBF"/>
+              <w:bottom w:val="single" w:sz="4" w:space="0" w:color="BFBFBF"/>
+              <w:right w:val="single" w:sz="4" w:space="0" w:color="BFBFBF"/>
             </w:tcBorders>
           </w:tcPr>
           <w:p>
             <w:pPr>
-              <w:spacing w:before="0" w:after="40"/>
+              <w:spacing w:before="60" w:after="60"/>
+              <w:ind w:left="113"/>
             </w:pPr>
             <w:r/>
             <w:r>
               <w:rPr>
                 <w:rFonts w:ascii="Times New Roman" w:hAnsi="Times New Roman"/>
-                <w:color w:val="212121"/>
+                <w:color w:val="000000"/>
                 <w:sz w:val="22"/>
               </w:rPr>
-              <w:t>Ngày: ...... / ...... / 2026</w:t>
+              <w:t>Bài học: Bài 3 - Nội năng, nhiệt lượng</w:t>
+            </w:r>
+          </w:p>
+        </w:tc>
+      </w:tr>
+      <w:tr>
+        <w:trPr>
+          <w:cantSplit/>
+        </w:trPr>
+        <w:tc>
+          <w:tcPr>
+            <w:tcW w:type="dxa" w:w="5386"/>
+            <w:tcMar>
+              <w:top w:w="120" w:type="dxa"/>
+              <w:bottom w:w="120" w:type="dxa"/>
+              <w:left w:w="120" w:type="dxa"/>
+              <w:right w:w="120" w:type="dxa"/>
+            </w:tcMar>
+            <w:tcBorders>
+              <w:top w:val="single" w:sz="4" w:space="0" w:color="BFBFBF"/>
+              <w:left w:val="single" w:sz="4" w:space="0" w:color="BFBFBF"/>
+              <w:bottom w:val="single" w:sz="4" w:space="0" w:color="BFBFBF"/>
+              <w:right w:val="single" w:sz="4" w:space="0" w:color="BFBFBF"/>
+            </w:tcBorders>
+          </w:tcPr>
+          <w:p>
+            <w:pPr>
+              <w:spacing w:before="60" w:after="60"/>
+              <w:ind w:left="113"/>
+            </w:pPr>
+            <w:r/>
+            <w:r>
+              <w:rPr>
+                <w:rFonts w:ascii="Times New Roman" w:hAnsi="Times New Roman"/>
+                <w:color w:val="000000"/>
+                <w:sz w:val="22"/>
+              </w:rPr>
+              <w:t>Tiết học: ............ ngày ......../......../202...</w:t>
+            </w:r>
+          </w:p>
+        </w:tc>
+        <w:tc>
+          <w:tcPr>
+            <w:tcW w:type="dxa" w:w="4252"/>
+            <w:tcMar>
+              <w:top w:w="120" w:type="dxa"/>
+              <w:bottom w:w="120" w:type="dxa"/>
+              <w:left w:w="120" w:type="dxa"/>
+              <w:right w:w="120" w:type="dxa"/>
+            </w:tcMar>
+            <w:tcBorders>
+              <w:top w:val="single" w:sz="4" w:space="0" w:color="BFBFBF"/>
+              <w:left w:val="single" w:sz="4" w:space="0" w:color="BFBFBF"/>
+              <w:bottom w:val="single" w:sz="4" w:space="0" w:color="BFBFBF"/>
+              <w:right w:val="single" w:sz="4" w:space="0" w:color="BFBFBF"/>
+            </w:tcBorders>
+          </w:tcPr>
+          <w:p>
+            <w:pPr>
+              <w:spacing w:before="60" w:after="60"/>
+              <w:ind w:left="113"/>
+            </w:pPr>
+            <w:r/>
+            <w:r>
+              <w:rPr>
+                <w:rFonts w:ascii="Times New Roman" w:hAnsi="Times New Roman"/>
+                <w:color w:val="000000"/>
+                <w:sz w:val="22"/>
+              </w:rPr>
+              <w:t>Điểm số: .........  Chữ ký GV: .........</w:t>
             </w:r>
           </w:p>
         </w:tc>
       </w:tr>
     </w:tbl>
+    <w:p/>
     <w:p>
       <w:pPr>
-        <w:spacing w:before="80" w:after="80"/>
-        <w:jc w:val="left"/>
-      </w:pPr>
-      <w:r>
-        <w:rPr>
-          <w:rFonts w:ascii="Times New Roman" w:hAnsi="Times New Roman"/>
-          <w:color w:val="595959"/>
-          <w:sz w:val="22"/>
-        </w:rPr>
-        <w:t>Thời gian: 45 phút</w:t>
-        <w:tab/>
-        <w:tab/>
-        <w:t>Điểm: ....................</w:t>
-        <w:tab/>
-        <w:tab/>
-        <w:t>Ý kiến của Giáo viên: ................................................................</w:t>
-      </w:r>
-    </w:p>
-    <w:p>
-      <w:pPr>
-        <w:spacing w:before="120" w:after="120"/>
-        <w:jc w:val="center"/>
-      </w:pPr>
-      <w:r>
-        <w:rPr>
-          <w:color w:val="BFBFBF"/>
-          <w:sz w:val="16"/>
-        </w:rPr>
-        <w:t>——————————————————————————————————————————————————————————————————————</w:t>
-      </w:r>
-    </w:p>
-    <w:p>
-      <w:pPr>
-        <w:spacing w:before="280" w:after="120"/>
+        <w:pStyle w:val="Heading1"/>
+        <w:keepNext/>
+        <w:spacing w:before="240" w:after="120"/>
+        <w:ind w:left="0" w:firstLine="0"/>
       </w:pPr>
       <w:r>
         <w:rPr>
           <w:rFonts w:ascii="Times New Roman" w:hAnsi="Times New Roman"/>
           <w:b/>
-          <w:color w:val="1E3A5F"/>
+          <w:i w:val="0"/>
+          <w:color w:val="1F4E79"/>
           <w:sz w:val="28"/>
         </w:rPr>
         <w:t>📍 ĐVKT 1: NỘI NĂNG VÀ NGUYÊN LÍ I NHIỆT ĐỘNG LỰC HỌC</w:t>
@@ -156,13 +288,17 @@
     </w:p>
     <w:p>
       <w:pPr>
+        <w:pStyle w:val="Heading2"/>
+        <w:keepNext/>
         <w:spacing w:before="160" w:after="80"/>
+        <w:ind w:left="0" w:firstLine="0"/>
       </w:pPr>
       <w:r>
         <w:rPr>
           <w:rFonts w:ascii="Times New Roman" w:hAnsi="Times New Roman"/>
           <w:b/>
-          <w:color w:val="595959"/>
+          <w:i w:val="0"/>
+          <w:color w:val="000000"/>
           <w:sz w:val="26"/>
         </w:rPr>
         <w:t>1. Khám phá (Nhiệm vụ 1: Biến đổi nội năng)</w:t>
@@ -170,7 +306,8 @@
     </w:p>
     <w:p>
       <w:pPr>
-        <w:spacing w:before="0" w:after="80" w:line="276" w:lineRule="auto"/>
+        <w:spacing w:before="120" w:after="120" w:line="312" w:lineRule="auto"/>
+        <w:ind w:left="0" w:firstLine="567"/>
         <w:jc w:val="both"/>
       </w:pPr>
       <w:r>
@@ -178,7 +315,7 @@
           <w:rFonts w:ascii="Times New Roman" w:hAnsi="Times New Roman"/>
           <w:b/>
           <w:i w:val="0"/>
-          <w:color w:val="212121"/>
+          <w:color w:val="000000"/>
           <w:sz w:val="26"/>
         </w:rPr>
         <w:t>Tình huống:</w:t>
@@ -186,8 +323,9 @@
       <w:r>
         <w:rPr>
           <w:rFonts w:ascii="Times New Roman" w:hAnsi="Times New Roman"/>
+          <w:b w:val="0"/>
           <w:i w:val="0"/>
-          <w:color w:val="212121"/>
+          <w:color w:val="000000"/>
           <w:sz w:val="26"/>
         </w:rPr>
         <w:t xml:space="preserve"> Một ống nghiệm chứa một ít ete được đậy kín bằng nút cao su. GV tiến hành cọ xát mạnh miếng kim loại vào thành ống nghiệm hoặc đun nóng nhẹ đáy ống nghiệm. Sau một thời gian, nút cao su bị đẩy bật ra kèm theo một làn sương mù nhẹ xuất hiện trong ống.</w:t>
@@ -195,14 +333,14 @@
     </w:p>
     <w:p>
       <w:pPr>
-        <w:spacing w:before="0" w:after="80" w:line="276" w:lineRule="auto"/>
+        <w:spacing w:before="60" w:after="60" w:line="312" w:lineRule="auto"/>
         <w:ind w:left="283" w:hanging="170"/>
         <w:jc w:val="both"/>
       </w:pPr>
       <w:r>
         <w:rPr>
           <w:rFonts w:ascii="Times New Roman" w:hAnsi="Times New Roman"/>
-          <w:color w:val="212121"/>
+          <w:color w:val="000000"/>
           <w:sz w:val="26"/>
         </w:rPr>
         <w:t xml:space="preserve">- </w:t>
@@ -210,8 +348,9 @@
       <w:r>
         <w:rPr>
           <w:rFonts w:ascii="Times New Roman" w:hAnsi="Times New Roman"/>
+          <w:b w:val="0"/>
           <w:i w:val="0"/>
-          <w:color w:val="212121"/>
+          <w:color w:val="000000"/>
           <w:sz w:val="26"/>
         </w:rPr>
         <w:t xml:space="preserve">  </w:t>
@@ -221,7 +360,7 @@
           <w:rFonts w:ascii="Times New Roman" w:hAnsi="Times New Roman"/>
           <w:b/>
           <w:i w:val="0"/>
-          <w:color w:val="212121"/>
+          <w:color w:val="000000"/>
           <w:sz w:val="26"/>
         </w:rPr>
         <w:t>Mệnh đề (Assertion):</w:t>
@@ -229,8 +368,9 @@
       <w:r>
         <w:rPr>
           <w:rFonts w:ascii="Times New Roman" w:hAnsi="Times New Roman"/>
+          <w:b w:val="0"/>
           <w:i w:val="0"/>
-          <w:color w:val="212121"/>
+          <w:color w:val="000000"/>
           <w:sz w:val="26"/>
         </w:rPr>
         <w:t xml:space="preserve"> Việc cọ xát hoặc đun nóng đều làm tăng nội năng của hơi ete trong ống nghiệm, dẫn đến áp suất tăng và đẩy nút bật ra.</w:t>
@@ -238,14 +378,14 @@
     </w:p>
     <w:p>
       <w:pPr>
-        <w:spacing w:before="0" w:after="80" w:line="276" w:lineRule="auto"/>
+        <w:spacing w:before="60" w:after="60" w:line="312" w:lineRule="auto"/>
         <w:ind w:left="283" w:hanging="170"/>
         <w:jc w:val="both"/>
       </w:pPr>
       <w:r>
         <w:rPr>
           <w:rFonts w:ascii="Times New Roman" w:hAnsi="Times New Roman"/>
-          <w:color w:val="212121"/>
+          <w:color w:val="000000"/>
           <w:sz w:val="26"/>
         </w:rPr>
         <w:t xml:space="preserve">- </w:t>
@@ -253,8 +393,9 @@
       <w:r>
         <w:rPr>
           <w:rFonts w:ascii="Times New Roman" w:hAnsi="Times New Roman"/>
+          <w:b w:val="0"/>
           <w:i w:val="0"/>
-          <w:color w:val="212121"/>
+          <w:color w:val="000000"/>
           <w:sz w:val="26"/>
         </w:rPr>
         <w:t xml:space="preserve">  </w:t>
@@ -264,7 +405,7 @@
           <w:rFonts w:ascii="Times New Roman" w:hAnsi="Times New Roman"/>
           <w:b/>
           <w:i w:val="0"/>
-          <w:color w:val="212121"/>
+          <w:color w:val="000000"/>
           <w:sz w:val="26"/>
         </w:rPr>
         <w:t>Lý do (Reasoning):</w:t>
@@ -272,8 +413,9 @@
       <w:r>
         <w:rPr>
           <w:rFonts w:ascii="Times New Roman" w:hAnsi="Times New Roman"/>
+          <w:b w:val="0"/>
           <w:i w:val="0"/>
-          <w:color w:val="212121"/>
+          <w:color w:val="000000"/>
           <w:sz w:val="26"/>
         </w:rPr>
         <w:t xml:space="preserve"> Sự xuất hiện của làn sương mù chứng tỏ nhiệt độ của hơi ete tăng lên đột ngột ngay khi nút bật ra.</w:t>
@@ -281,14 +423,14 @@
     </w:p>
     <w:p>
       <w:pPr>
-        <w:spacing w:before="0" w:after="80" w:line="276" w:lineRule="auto"/>
+        <w:spacing w:before="60" w:after="60" w:line="312" w:lineRule="auto"/>
         <w:ind w:left="283" w:hanging="170"/>
         <w:jc w:val="both"/>
       </w:pPr>
       <w:r>
         <w:rPr>
           <w:rFonts w:ascii="Times New Roman" w:hAnsi="Times New Roman"/>
-          <w:color w:val="212121"/>
+          <w:color w:val="000000"/>
           <w:sz w:val="26"/>
         </w:rPr>
         <w:t xml:space="preserve">- </w:t>
@@ -296,8 +438,9 @@
       <w:r>
         <w:rPr>
           <w:rFonts w:ascii="Times New Roman" w:hAnsi="Times New Roman"/>
+          <w:b w:val="0"/>
           <w:i w:val="0"/>
-          <w:color w:val="212121"/>
+          <w:color w:val="000000"/>
           <w:sz w:val="26"/>
         </w:rPr>
         <w:t xml:space="preserve">  </w:t>
@@ -307,7 +450,7 @@
           <w:rFonts w:ascii="Times New Roman" w:hAnsi="Times New Roman"/>
           <w:b/>
           <w:i w:val="0"/>
-          <w:color w:val="212121"/>
+          <w:color w:val="000000"/>
           <w:sz w:val="26"/>
         </w:rPr>
         <w:t>Câu hỏi:</w:t>
@@ -315,50 +458,24 @@
       <w:r>
         <w:rPr>
           <w:rFonts w:ascii="Times New Roman" w:hAnsi="Times New Roman"/>
+          <w:b w:val="0"/>
           <w:i w:val="0"/>
-          <w:color w:val="212121"/>
+          <w:color w:val="000000"/>
           <w:sz w:val="26"/>
         </w:rPr>
-        <w:t xml:space="preserve"> Em hãy nhận xét tính đúng/sai của mệnh đề và lý do trên, đồng thời giải thích quá trình chuyển hóa năng lượng trong hai trường hợp trên dựa vào Nguyên lí I. </w:t>
+        <w:t xml:space="preserve"> Em hãy nhận xét tính đúng/sai của mệnh đề và lý do trên, đồng thời giải thích quá trình chuyển hóa năng lượng trong hai trường hợp trên dựa vào Nguyên lí I.</w:t>
       </w:r>
+    </w:p>
+    <w:p>
+      <w:pPr>
+        <w:spacing w:before="40" w:after="40"/>
+        <w:ind w:left="567"/>
+        <w:jc w:val="left"/>
+      </w:pPr>
       <w:r>
         <w:rPr>
           <w:rFonts w:ascii="Times New Roman" w:hAnsi="Times New Roman"/>
-          <w:color w:val="BFBFBF"/>
-          <w:sz w:val="22"/>
-        </w:rPr>
-        <w:t>..........................................................................................</w:t>
-      </w:r>
-      <w:r>
-        <w:rPr>
-          <w:rFonts w:ascii="Times New Roman" w:hAnsi="Times New Roman"/>
-          <w:i w:val="0"/>
-          <w:color w:val="212121"/>
-          <w:sz w:val="26"/>
-        </w:rPr>
-        <w:t xml:space="preserve"> </w:t>
-      </w:r>
-      <w:r>
-        <w:rPr>
-          <w:rFonts w:ascii="Times New Roman" w:hAnsi="Times New Roman"/>
-          <w:color w:val="BFBFBF"/>
-          <w:sz w:val="22"/>
-        </w:rPr>
-        <w:t>..........................................................................................</w:t>
-      </w:r>
-      <w:r>
-        <w:rPr>
-          <w:rFonts w:ascii="Times New Roman" w:hAnsi="Times New Roman"/>
-          <w:i w:val="0"/>
-          <w:color w:val="212121"/>
-          <w:sz w:val="26"/>
-        </w:rPr>
-        <w:t xml:space="preserve"> </w:t>
-      </w:r>
-      <w:r>
-        <w:rPr>
-          <w:rFonts w:ascii="Times New Roman" w:hAnsi="Times New Roman"/>
-          <w:color w:val="BFBFBF"/>
+          <w:color w:val="666666"/>
           <w:sz w:val="22"/>
         </w:rPr>
         <w:t>..........................................................................................</w:t>
@@ -367,11 +484,13 @@
     <w:p>
       <w:pPr>
         <w:spacing w:before="40" w:after="40"/>
+        <w:ind w:left="567"/>
+        <w:jc w:val="left"/>
       </w:pPr>
       <w:r>
         <w:rPr>
           <w:rFonts w:ascii="Times New Roman" w:hAnsi="Times New Roman"/>
-          <w:color w:val="BFBFBF"/>
+          <w:color w:val="666666"/>
           <w:sz w:val="22"/>
         </w:rPr>
         <w:t>..........................................................................................</w:t>
@@ -380,11 +499,13 @@
     <w:p>
       <w:pPr>
         <w:spacing w:before="40" w:after="40"/>
+        <w:ind w:left="567"/>
+        <w:jc w:val="left"/>
       </w:pPr>
       <w:r>
         <w:rPr>
           <w:rFonts w:ascii="Times New Roman" w:hAnsi="Times New Roman"/>
-          <w:color w:val="BFBFBF"/>
+          <w:color w:val="666666"/>
           <w:sz w:val="22"/>
         </w:rPr>
         <w:t>..........................................................................................</w:t>
@@ -392,39 +513,17 @@
     </w:p>
     <w:p>
       <w:pPr>
-        <w:spacing w:before="40" w:after="40"/>
-      </w:pPr>
-      <w:r>
-        <w:rPr>
-          <w:rFonts w:ascii="Times New Roman" w:hAnsi="Times New Roman"/>
-          <w:color w:val="BFBFBF"/>
-          <w:sz w:val="22"/>
-        </w:rPr>
-        <w:t>..........................................................................................</w:t>
-      </w:r>
-    </w:p>
-    <w:p>
-      <w:pPr>
-        <w:spacing w:before="40" w:after="40"/>
-      </w:pPr>
-      <w:r>
-        <w:rPr>
-          <w:rFonts w:ascii="Times New Roman" w:hAnsi="Times New Roman"/>
-          <w:color w:val="BFBFBF"/>
-          <w:sz w:val="22"/>
-        </w:rPr>
-        <w:t>..........................................................................................</w:t>
-      </w:r>
-    </w:p>
-    <w:p>
-      <w:pPr>
+        <w:pStyle w:val="Heading2"/>
+        <w:keepNext/>
         <w:spacing w:before="160" w:after="80"/>
+        <w:ind w:left="0" w:firstLine="0"/>
       </w:pPr>
       <w:r>
         <w:rPr>
           <w:rFonts w:ascii="Times New Roman" w:hAnsi="Times New Roman"/>
           <w:b/>
-          <w:color w:val="595959"/>
+          <w:i w:val="0"/>
+          <w:color w:val="000000"/>
           <w:sz w:val="26"/>
         </w:rPr>
         <w:t>2. Trọng tâm (Nội dung nội năng &amp; Nguyên lí I)</w:t>
@@ -432,14 +531,14 @@
     </w:p>
     <w:p>
       <w:pPr>
-        <w:spacing w:before="0" w:after="80" w:line="276" w:lineRule="auto"/>
+        <w:spacing w:before="60" w:after="60" w:line="312" w:lineRule="auto"/>
         <w:ind w:left="283" w:hanging="170"/>
         <w:jc w:val="both"/>
       </w:pPr>
       <w:r>
         <w:rPr>
           <w:rFonts w:ascii="Times New Roman" w:hAnsi="Times New Roman"/>
-          <w:color w:val="212121"/>
+          <w:color w:val="000000"/>
           <w:sz w:val="26"/>
         </w:rPr>
         <w:t xml:space="preserve">- </w:t>
@@ -447,8 +546,9 @@
       <w:r>
         <w:rPr>
           <w:rFonts w:ascii="Times New Roman" w:hAnsi="Times New Roman"/>
+          <w:b w:val="0"/>
           <w:i w:val="0"/>
-          <w:color w:val="212121"/>
+          <w:color w:val="000000"/>
           <w:sz w:val="26"/>
         </w:rPr>
         <w:t xml:space="preserve">  Nội năng (</w:t>
@@ -457,7 +557,7 @@
         <w:rPr>
           <w:rFonts w:ascii="Times New Roman" w:hAnsi="Times New Roman"/>
           <w:i/>
-          <w:color w:val="212121"/>
+          <w:color w:val="000000"/>
           <w:sz w:val="26"/>
         </w:rPr>
         <w:t>U</w:t>
@@ -465,23 +565,24 @@
       <w:r>
         <w:rPr>
           <w:rFonts w:ascii="Times New Roman" w:hAnsi="Times New Roman"/>
+          <w:b w:val="0"/>
           <w:i w:val="0"/>
-          <w:color w:val="212121"/>
+          <w:color w:val="000000"/>
           <w:sz w:val="26"/>
         </w:rPr>
-        <w:t>) của một vật là tổng (1).................... của chuyển động nhiệt phân tử và (2).................... phân tử cấu tạo nên vật.</w:t>
+        <w:t>) của một vật là tổng (1) .................... của chuyển động nhiệt phân tử và (2) .................... phân tử cấu tạo nên vật.</w:t>
       </w:r>
     </w:p>
     <w:p>
       <w:pPr>
-        <w:spacing w:before="0" w:after="80" w:line="276" w:lineRule="auto"/>
+        <w:spacing w:before="60" w:after="60" w:line="312" w:lineRule="auto"/>
         <w:ind w:left="283" w:hanging="170"/>
         <w:jc w:val="both"/>
       </w:pPr>
       <w:r>
         <w:rPr>
           <w:rFonts w:ascii="Times New Roman" w:hAnsi="Times New Roman"/>
-          <w:color w:val="212121"/>
+          <w:color w:val="000000"/>
           <w:sz w:val="26"/>
         </w:rPr>
         <w:t xml:space="preserve">- </w:t>
@@ -489,23 +590,24 @@
       <w:r>
         <w:rPr>
           <w:rFonts w:ascii="Times New Roman" w:hAnsi="Times New Roman"/>
+          <w:b w:val="0"/>
           <w:i w:val="0"/>
-          <w:color w:val="212121"/>
+          <w:color w:val="000000"/>
           <w:sz w:val="26"/>
         </w:rPr>
-        <w:t xml:space="preserve">  Nội năng phụ thuộc vào (3).................... và (4).................... của vật.</w:t>
+        <w:t xml:space="preserve">  Nội năng phụ thuộc vào (3) .................... và (4) .................... của vật.</w:t>
       </w:r>
     </w:p>
     <w:p>
       <w:pPr>
-        <w:spacing w:before="0" w:after="80" w:line="276" w:lineRule="auto"/>
+        <w:spacing w:before="60" w:after="60" w:line="312" w:lineRule="auto"/>
         <w:ind w:left="283" w:hanging="170"/>
         <w:jc w:val="both"/>
       </w:pPr>
       <w:r>
         <w:rPr>
           <w:rFonts w:ascii="Times New Roman" w:hAnsi="Times New Roman"/>
-          <w:color w:val="212121"/>
+          <w:color w:val="000000"/>
           <w:sz w:val="26"/>
         </w:rPr>
         <w:t xml:space="preserve">- </w:t>
@@ -513,23 +615,24 @@
       <w:r>
         <w:rPr>
           <w:rFonts w:ascii="Times New Roman" w:hAnsi="Times New Roman"/>
+          <w:b w:val="0"/>
           <w:i w:val="0"/>
-          <w:color w:val="212121"/>
+          <w:color w:val="000000"/>
           <w:sz w:val="26"/>
         </w:rPr>
-        <w:t xml:space="preserve">  Có hai cách làm thay đổi nội năng là (5).................... và (6)....................</w:t>
+        <w:t xml:space="preserve">  Có hai cách làm thay đổi nội năng là (5) .................... và (6) ....................</w:t>
       </w:r>
     </w:p>
     <w:p>
       <w:pPr>
-        <w:spacing w:before="0" w:after="80" w:line="276" w:lineRule="auto"/>
+        <w:spacing w:before="60" w:after="60" w:line="312" w:lineRule="auto"/>
         <w:ind w:left="283" w:hanging="170"/>
         <w:jc w:val="both"/>
       </w:pPr>
       <w:r>
         <w:rPr>
           <w:rFonts w:ascii="Times New Roman" w:hAnsi="Times New Roman"/>
-          <w:color w:val="212121"/>
+          <w:color w:val="000000"/>
           <w:sz w:val="26"/>
         </w:rPr>
         <w:t xml:space="preserve">- </w:t>
@@ -537,8 +640,9 @@
       <w:r>
         <w:rPr>
           <w:rFonts w:ascii="Times New Roman" w:hAnsi="Times New Roman"/>
+          <w:b w:val="0"/>
           <w:i w:val="0"/>
-          <w:color w:val="212121"/>
+          <w:color w:val="000000"/>
           <w:sz w:val="26"/>
         </w:rPr>
         <w:t xml:space="preserve">  Nguyên lí I Nhiệt động lực học: Độ biến thiên nội năng của vật bằng tổng công và nhiệt lượng mà vật nhận được: ==</w:t>
@@ -547,7 +651,7 @@
         <w:rPr>
           <w:rFonts w:ascii="Times New Roman" w:hAnsi="Times New Roman"/>
           <w:i/>
-          <w:color w:val="212121"/>
+          <w:color w:val="000000"/>
           <w:sz w:val="26"/>
         </w:rPr>
         <w:t>Δ U = A + Q</w:t>
@@ -555,8 +659,9 @@
       <w:r>
         <w:rPr>
           <w:rFonts w:ascii="Times New Roman" w:hAnsi="Times New Roman"/>
+          <w:b w:val="0"/>
           <w:i w:val="0"/>
-          <w:color w:val="212121"/>
+          <w:color w:val="000000"/>
           <w:sz w:val="26"/>
         </w:rPr>
         <w:t>==.</w:t>
@@ -564,14 +669,14 @@
     </w:p>
     <w:p>
       <w:pPr>
-        <w:spacing w:before="0" w:after="80" w:line="276" w:lineRule="auto"/>
+        <w:spacing w:before="60" w:after="60" w:line="312" w:lineRule="auto"/>
         <w:ind w:left="283" w:hanging="170"/>
         <w:jc w:val="both"/>
       </w:pPr>
       <w:r>
         <w:rPr>
           <w:rFonts w:ascii="Times New Roman" w:hAnsi="Times New Roman"/>
-          <w:color w:val="212121"/>
+          <w:color w:val="000000"/>
           <w:sz w:val="26"/>
         </w:rPr>
         <w:t xml:space="preserve">- </w:t>
@@ -579,8 +684,9 @@
       <w:r>
         <w:rPr>
           <w:rFonts w:ascii="Times New Roman" w:hAnsi="Times New Roman"/>
+          <w:b w:val="0"/>
           <w:i w:val="0"/>
-          <w:color w:val="212121"/>
+          <w:color w:val="000000"/>
           <w:sz w:val="26"/>
         </w:rPr>
         <w:t xml:space="preserve">  *Gợi ý từ khóa:* thực hiện công, thế năng tương tác, thể tích, nhiệt độ, truyền nhiệt, động năng.</w:t>
@@ -588,13 +694,17 @@
     </w:p>
     <w:p>
       <w:pPr>
+        <w:pStyle w:val="Heading2"/>
+        <w:keepNext/>
         <w:spacing w:before="160" w:after="80"/>
+        <w:ind w:left="0" w:firstLine="0"/>
       </w:pPr>
       <w:r>
         <w:rPr>
           <w:rFonts w:ascii="Times New Roman" w:hAnsi="Times New Roman"/>
           <w:b/>
-          <w:color w:val="595959"/>
+          <w:i w:val="0"/>
+          <w:color w:val="000000"/>
           <w:sz w:val="26"/>
         </w:rPr>
         <w:t>3. Vận dụng (Nhiệm vụ 2: Chu trình khí trong xilanh)</w:t>
@@ -602,7 +712,8 @@
     </w:p>
     <w:p>
       <w:pPr>
-        <w:spacing w:before="0" w:after="80" w:line="276" w:lineRule="auto"/>
+        <w:spacing w:before="120" w:after="120" w:line="312" w:lineRule="auto"/>
+        <w:ind w:left="0" w:firstLine="567"/>
         <w:jc w:val="both"/>
       </w:pPr>
       <w:r>
@@ -610,7 +721,7 @@
           <w:rFonts w:ascii="Times New Roman" w:hAnsi="Times New Roman"/>
           <w:b/>
           <w:i w:val="0"/>
-          <w:color w:val="212121"/>
+          <w:color w:val="000000"/>
           <w:sz w:val="26"/>
         </w:rPr>
         <w:t>Tình huống:</w:t>
@@ -618,8 +729,9 @@
       <w:r>
         <w:rPr>
           <w:rFonts w:ascii="Times New Roman" w:hAnsi="Times New Roman"/>
+          <w:b w:val="0"/>
           <w:i w:val="0"/>
-          <w:color w:val="212121"/>
+          <w:color w:val="000000"/>
           <w:sz w:val="26"/>
         </w:rPr>
         <w:t xml:space="preserve"> Một lượng khí lí tưởng trong xilanh nhận một nhiệt lượng </w:t>
@@ -628,7 +740,7 @@
         <w:rPr>
           <w:rFonts w:ascii="Times New Roman" w:hAnsi="Times New Roman"/>
           <w:i/>
-          <w:color w:val="212121"/>
+          <w:color w:val="000000"/>
           <w:sz w:val="26"/>
         </w:rPr>
         <w:t>Q = 200 J</w:t>
@@ -636,8 +748,9 @@
       <w:r>
         <w:rPr>
           <w:rFonts w:ascii="Times New Roman" w:hAnsi="Times New Roman"/>
+          <w:b w:val="0"/>
           <w:i w:val="0"/>
-          <w:color w:val="212121"/>
+          <w:color w:val="000000"/>
           <w:sz w:val="26"/>
         </w:rPr>
         <w:t xml:space="preserve"> từ nguồn nhiệt bên ngoài, đồng thời khí giãn nở đẩy pit-tông thực hiện một công </w:t>
@@ -646,7 +759,7 @@
         <w:rPr>
           <w:rFonts w:ascii="Times New Roman" w:hAnsi="Times New Roman"/>
           <w:i/>
-          <w:color w:val="212121"/>
+          <w:color w:val="000000"/>
           <w:sz w:val="26"/>
         </w:rPr>
         <w:t>A' = 120 J</w:t>
@@ -654,8 +767,9 @@
       <w:r>
         <w:rPr>
           <w:rFonts w:ascii="Times New Roman" w:hAnsi="Times New Roman"/>
+          <w:b w:val="0"/>
           <w:i w:val="0"/>
-          <w:color w:val="212121"/>
+          <w:color w:val="000000"/>
           <w:sz w:val="26"/>
         </w:rPr>
         <w:t xml:space="preserve"> đẩy ra môi trường.</w:t>
@@ -663,14 +777,14 @@
     </w:p>
     <w:p>
       <w:pPr>
-        <w:spacing w:before="0" w:after="80" w:line="276" w:lineRule="auto"/>
+        <w:spacing w:before="60" w:after="60" w:line="312" w:lineRule="auto"/>
         <w:ind w:left="283" w:hanging="170"/>
         <w:jc w:val="both"/>
       </w:pPr>
       <w:r>
         <w:rPr>
           <w:rFonts w:ascii="Times New Roman" w:hAnsi="Times New Roman"/>
-          <w:color w:val="212121"/>
+          <w:color w:val="000000"/>
           <w:sz w:val="26"/>
         </w:rPr>
         <w:t xml:space="preserve">- </w:t>
@@ -678,8 +792,9 @@
       <w:r>
         <w:rPr>
           <w:rFonts w:ascii="Times New Roman" w:hAnsi="Times New Roman"/>
+          <w:b w:val="0"/>
           <w:i w:val="0"/>
-          <w:color w:val="212121"/>
+          <w:color w:val="000000"/>
           <w:sz w:val="26"/>
         </w:rPr>
         <w:t xml:space="preserve">  </w:t>
@@ -689,7 +804,7 @@
           <w:rFonts w:ascii="Times New Roman" w:hAnsi="Times New Roman"/>
           <w:b/>
           <w:i w:val="0"/>
-          <w:color w:val="212121"/>
+          <w:color w:val="000000"/>
           <w:sz w:val="26"/>
         </w:rPr>
         <w:t>Câu hỏi:</w:t>
@@ -697,8 +812,9 @@
       <w:r>
         <w:rPr>
           <w:rFonts w:ascii="Times New Roman" w:hAnsi="Times New Roman"/>
+          <w:b w:val="0"/>
           <w:i w:val="0"/>
-          <w:color w:val="212121"/>
+          <w:color w:val="000000"/>
           <w:sz w:val="26"/>
         </w:rPr>
         <w:t xml:space="preserve"> Hãy tính độ biến thiên nội năng (</w:t>
@@ -707,7 +823,7 @@
         <w:rPr>
           <w:rFonts w:ascii="Times New Roman" w:hAnsi="Times New Roman"/>
           <w:i/>
-          <w:color w:val="212121"/>
+          <w:color w:val="000000"/>
           <w:sz w:val="26"/>
         </w:rPr>
         <w:t>Δ U</w:t>
@@ -715,50 +831,24 @@
       <w:r>
         <w:rPr>
           <w:rFonts w:ascii="Times New Roman" w:hAnsi="Times New Roman"/>
+          <w:b w:val="0"/>
           <w:i w:val="0"/>
-          <w:color w:val="212121"/>
+          <w:color w:val="000000"/>
           <w:sz w:val="26"/>
         </w:rPr>
-        <w:t xml:space="preserve">) của lượng khí trên. Xác định rõ dấu của các đại lượng theo quy ước. </w:t>
+        <w:t>) của lượng khí trên. Xác định rõ dấu của các đại lượng theo quy ước.</w:t>
       </w:r>
+    </w:p>
+    <w:p>
+      <w:pPr>
+        <w:spacing w:before="40" w:after="40"/>
+        <w:ind w:left="567"/>
+        <w:jc w:val="left"/>
+      </w:pPr>
       <w:r>
         <w:rPr>
           <w:rFonts w:ascii="Times New Roman" w:hAnsi="Times New Roman"/>
-          <w:color w:val="BFBFBF"/>
-          <w:sz w:val="22"/>
-        </w:rPr>
-        <w:t>..........................................................................................</w:t>
-      </w:r>
-      <w:r>
-        <w:rPr>
-          <w:rFonts w:ascii="Times New Roman" w:hAnsi="Times New Roman"/>
-          <w:i w:val="0"/>
-          <w:color w:val="212121"/>
-          <w:sz w:val="26"/>
-        </w:rPr>
-        <w:t xml:space="preserve"> </w:t>
-      </w:r>
-      <w:r>
-        <w:rPr>
-          <w:rFonts w:ascii="Times New Roman" w:hAnsi="Times New Roman"/>
-          <w:color w:val="BFBFBF"/>
-          <w:sz w:val="22"/>
-        </w:rPr>
-        <w:t>..........................................................................................</w:t>
-      </w:r>
-      <w:r>
-        <w:rPr>
-          <w:rFonts w:ascii="Times New Roman" w:hAnsi="Times New Roman"/>
-          <w:i w:val="0"/>
-          <w:color w:val="212121"/>
-          <w:sz w:val="26"/>
-        </w:rPr>
-        <w:t xml:space="preserve"> </w:t>
-      </w:r>
-      <w:r>
-        <w:rPr>
-          <w:rFonts w:ascii="Times New Roman" w:hAnsi="Times New Roman"/>
-          <w:color w:val="BFBFBF"/>
+          <w:color w:val="666666"/>
           <w:sz w:val="22"/>
         </w:rPr>
         <w:t>..........................................................................................</w:t>
@@ -767,11 +857,13 @@
     <w:p>
       <w:pPr>
         <w:spacing w:before="40" w:after="40"/>
+        <w:ind w:left="567"/>
+        <w:jc w:val="left"/>
       </w:pPr>
       <w:r>
         <w:rPr>
           <w:rFonts w:ascii="Times New Roman" w:hAnsi="Times New Roman"/>
-          <w:color w:val="BFBFBF"/>
+          <w:color w:val="666666"/>
           <w:sz w:val="22"/>
         </w:rPr>
         <w:t>..........................................................................................</w:t>
@@ -779,13 +871,32 @@
     </w:p>
     <w:p>
       <w:pPr>
+        <w:spacing w:before="40" w:after="40"/>
+        <w:ind w:left="567"/>
+        <w:jc w:val="left"/>
+      </w:pPr>
+      <w:r>
+        <w:rPr>
+          <w:rFonts w:ascii="Times New Roman" w:hAnsi="Times New Roman"/>
+          <w:color w:val="666666"/>
+          <w:sz w:val="22"/>
+        </w:rPr>
+        <w:t>..........................................................................................</w:t>
+      </w:r>
+    </w:p>
+    <w:p>
+      <w:pPr>
+        <w:pStyle w:val="Heading2"/>
+        <w:keepNext/>
         <w:spacing w:before="160" w:after="80"/>
+        <w:ind w:left="0" w:firstLine="0"/>
       </w:pPr>
       <w:r>
         <w:rPr>
           <w:rFonts w:ascii="Times New Roman" w:hAnsi="Times New Roman"/>
           <w:b/>
-          <w:color w:val="595959"/>
+          <w:i w:val="0"/>
+          <w:color w:val="000000"/>
           <w:sz w:val="26"/>
         </w:rPr>
         <w:t>4. Mở rộng (STEM Connection)</w:t>
@@ -793,65 +904,86 @@
     </w:p>
     <w:p>
       <w:pPr>
-        <w:spacing w:before="0" w:after="80" w:line="276" w:lineRule="auto"/>
-        <w:ind w:left="567"/>
+        <w:pStyle w:val="Heading3"/>
+        <w:keepNext/>
+        <w:spacing w:before="120" w:after="60"/>
+        <w:ind w:left="0" w:firstLine="0"/>
+      </w:pPr>
+      <w:r>
+        <w:rPr>
+          <w:rFonts w:ascii="Times New Roman" w:hAnsi="Times New Roman"/>
+          <w:b w:val="0"/>
+          <w:i/>
+          <w:color w:val="000000"/>
+          <w:sz w:val="26"/>
+        </w:rPr>
+        <w:t>Động cơ hơi nước của James Watt:</w:t>
+      </w:r>
+    </w:p>
+    <w:p>
+      <w:pPr>
+        <w:spacing w:before="120" w:after="120" w:line="312" w:lineRule="auto"/>
+        <w:ind w:left="567" w:firstLine="0"/>
         <w:jc w:val="both"/>
       </w:pPr>
       <w:r>
         <w:rPr>
           <w:rFonts w:ascii="Times New Roman" w:hAnsi="Times New Roman"/>
-          <w:b/>
+          <w:b w:val="0"/>
           <w:i/>
-          <w:color w:val="212121"/>
+          <w:color w:val="000000"/>
           <w:sz w:val="26"/>
         </w:rPr>
-        <w:t>Động cơ hơi nước của James Watt:</w:t>
-      </w:r>
-      <w:r>
-        <w:rPr>
-          <w:rFonts w:ascii="Times New Roman" w:hAnsi="Times New Roman"/>
-          <w:i/>
-          <w:color w:val="212121"/>
-          <w:sz w:val="26"/>
-        </w:rPr>
-        <w:t xml:space="preserve"> &gt; Năm 1765, James Watt đã cải tiến động cơ hơi nước của Newcomen bằng cách thêm một bình ngưng tụ hơi nước độc lập. Phát minh này giúp giảm thiểu lượng nhiệt hao phí dùng để làm nóng xilanh liên tục, nâng cao hiệu suất động cơ lên gấp 4 lần. Đây là một ứng dụng thực tiễn vĩ đại của Nguyên lí I Nhiệt động lực học, trực tiếp châm ngòi cho cuộc Cách mạng Công nghiệp lần thứ nhất trên toàn cầu. &gt; *(Nguồn: Lịch sử Khoa học kỹ thuật - NXB Khoa học)*</w:t>
+        <w:t>Năm 1765, James Watt đã cải tiến động cơ hơi nước của Newcomen bằng cách thêm một bình ngưng tụ hơi nước độc lập. Phát minh này giúp giảm thiểu lượng nhiệt hao phí dùng để làm nóng xilanh liên tục, nâng cao hiệu suất động cơ lên gấp 4 lần. Đây là một ứng dụng thực tiễn vĩ đại của Nguyên lí I Nhiệt động lực học, trực tiếp châm ngòi cho cuộc Cách mạng Công nghiệp lần thứ nhất trên toàn cầu.</w:t>
       </w:r>
     </w:p>
     <w:p>
       <w:pPr>
-        <w:spacing w:before="40" w:after="40"/>
+        <w:spacing w:before="120" w:after="120" w:line="312" w:lineRule="auto"/>
+        <w:ind w:left="567" w:firstLine="0"/>
+        <w:jc w:val="both"/>
       </w:pPr>
       <w:r>
         <w:rPr>
           <w:rFonts w:ascii="Times New Roman" w:hAnsi="Times New Roman"/>
-          <w:color w:val="BFBFBF"/>
-          <w:sz w:val="22"/>
+          <w:b w:val="0"/>
+          <w:i/>
+          <w:color w:val="000000"/>
+          <w:sz w:val="26"/>
         </w:rPr>
-        <w:t>..........................................................................................</w:t>
+        <w:t>*(Nguồn: Lịch sử Khoa học kỹ thuật - NXB Khoa học)*</w:t>
       </w:r>
     </w:p>
     <w:p>
       <w:pPr>
-        <w:spacing w:before="120" w:after="120"/>
-        <w:jc w:val="center"/>
+        <w:spacing w:before="120" w:after="120" w:line="312" w:lineRule="auto"/>
+        <w:ind w:left="0" w:firstLine="567"/>
+        <w:jc w:val="both"/>
       </w:pPr>
       <w:r>
         <w:rPr>
-          <w:color w:val="BFBFBF"/>
-          <w:sz w:val="16"/>
+          <w:rFonts w:ascii="Times New Roman" w:hAnsi="Times New Roman"/>
+          <w:b w:val="0"/>
+          <w:i w:val="0"/>
+          <w:color w:val="000000"/>
+          <w:sz w:val="26"/>
         </w:rPr>
-        <w:t>——————————————————————————————————————————————————————————————————————</w:t>
+        <w:t>---</w:t>
       </w:r>
     </w:p>
     <w:p>
       <w:pPr>
-        <w:spacing w:before="280" w:after="120"/>
+        <w:pStyle w:val="Heading1"/>
+        <w:keepNext/>
+        <w:spacing w:before="240" w:after="120"/>
+        <w:ind w:left="0" w:firstLine="0"/>
       </w:pPr>
       <w:r>
         <w:rPr>
           <w:rFonts w:ascii="Times New Roman" w:hAnsi="Times New Roman"/>
           <w:b/>
-          <w:color w:val="1E3A5F"/>
+          <w:i w:val="0"/>
+          <w:color w:val="1F4E79"/>
           <w:sz w:val="28"/>
         </w:rPr>
         <w:t>📍 ĐVKT 2: NHIỆT LƯỢNG VÀ CÔNG THỨC TÍNH NHIỆT LƯỢNG</w:t>
@@ -859,13 +991,17 @@
     </w:p>
     <w:p>
       <w:pPr>
+        <w:pStyle w:val="Heading2"/>
+        <w:keepNext/>
         <w:spacing w:before="160" w:after="80"/>
+        <w:ind w:left="0" w:firstLine="0"/>
       </w:pPr>
       <w:r>
         <w:rPr>
           <w:rFonts w:ascii="Times New Roman" w:hAnsi="Times New Roman"/>
           <w:b/>
-          <w:color w:val="595959"/>
+          <w:i w:val="0"/>
+          <w:color w:val="000000"/>
           <w:sz w:val="26"/>
         </w:rPr>
         <w:t>1. Khám phá (Nhiệm vụ 3: Đun nóng nước và rượu)</w:t>
@@ -873,7 +1009,8 @@
     </w:p>
     <w:p>
       <w:pPr>
-        <w:spacing w:before="0" w:after="80" w:line="276" w:lineRule="auto"/>
+        <w:spacing w:before="120" w:after="120" w:line="312" w:lineRule="auto"/>
+        <w:ind w:left="0" w:firstLine="567"/>
         <w:jc w:val="both"/>
       </w:pPr>
       <w:r>
@@ -881,7 +1018,7 @@
           <w:rFonts w:ascii="Times New Roman" w:hAnsi="Times New Roman"/>
           <w:b/>
           <w:i w:val="0"/>
-          <w:color w:val="212121"/>
+          <w:color w:val="000000"/>
           <w:sz w:val="26"/>
         </w:rPr>
         <w:t>Thực nghiệm:</w:t>
@@ -889,8 +1026,9 @@
       <w:r>
         <w:rPr>
           <w:rFonts w:ascii="Times New Roman" w:hAnsi="Times New Roman"/>
+          <w:b w:val="0"/>
           <w:i w:val="0"/>
-          <w:color w:val="212121"/>
+          <w:color w:val="000000"/>
           <w:sz w:val="26"/>
         </w:rPr>
         <w:t xml:space="preserve"> GV dùng hai đèn cồn giống hệt nhau để đun nóng </w:t>
@@ -899,7 +1037,7 @@
         <w:rPr>
           <w:rFonts w:ascii="Times New Roman" w:hAnsi="Times New Roman"/>
           <w:i/>
-          <w:color w:val="212121"/>
+          <w:color w:val="000000"/>
           <w:sz w:val="26"/>
         </w:rPr>
         <w:t>100 g</w:t>
@@ -907,8 +1045,9 @@
       <w:r>
         <w:rPr>
           <w:rFonts w:ascii="Times New Roman" w:hAnsi="Times New Roman"/>
+          <w:b w:val="0"/>
           <w:i w:val="0"/>
-          <w:color w:val="212121"/>
+          <w:color w:val="000000"/>
           <w:sz w:val="26"/>
         </w:rPr>
         <w:t xml:space="preserve"> nước và </w:t>
@@ -917,7 +1056,7 @@
         <w:rPr>
           <w:rFonts w:ascii="Times New Roman" w:hAnsi="Times New Roman"/>
           <w:i/>
-          <w:color w:val="212121"/>
+          <w:color w:val="000000"/>
           <w:sz w:val="26"/>
         </w:rPr>
         <w:t>100 g</w:t>
@@ -925,8 +1064,9 @@
       <w:r>
         <w:rPr>
           <w:rFonts w:ascii="Times New Roman" w:hAnsi="Times New Roman"/>
+          <w:b w:val="0"/>
           <w:i w:val="0"/>
-          <w:color w:val="212121"/>
+          <w:color w:val="000000"/>
           <w:sz w:val="26"/>
         </w:rPr>
         <w:t xml:space="preserve"> rượu trong cùng một khoảng thời gian. Kết quả cho thấy nhiệt độ của rượu tăng nhanh hơn nhiều so với nước.</w:t>
@@ -934,14 +1074,14 @@
     </w:p>
     <w:p>
       <w:pPr>
-        <w:spacing w:before="0" w:after="80" w:line="276" w:lineRule="auto"/>
+        <w:spacing w:before="60" w:after="60" w:line="312" w:lineRule="auto"/>
         <w:ind w:left="283" w:hanging="170"/>
         <w:jc w:val="both"/>
       </w:pPr>
       <w:r>
         <w:rPr>
           <w:rFonts w:ascii="Times New Roman" w:hAnsi="Times New Roman"/>
-          <w:color w:val="212121"/>
+          <w:color w:val="000000"/>
           <w:sz w:val="26"/>
         </w:rPr>
         <w:t xml:space="preserve">- </w:t>
@@ -949,8 +1089,9 @@
       <w:r>
         <w:rPr>
           <w:rFonts w:ascii="Times New Roman" w:hAnsi="Times New Roman"/>
+          <w:b w:val="0"/>
           <w:i w:val="0"/>
-          <w:color w:val="212121"/>
+          <w:color w:val="000000"/>
           <w:sz w:val="26"/>
         </w:rPr>
         <w:t xml:space="preserve">  </w:t>
@@ -960,7 +1101,7 @@
           <w:rFonts w:ascii="Times New Roman" w:hAnsi="Times New Roman"/>
           <w:b/>
           <w:i w:val="0"/>
-          <w:color w:val="212121"/>
+          <w:color w:val="000000"/>
           <w:sz w:val="26"/>
         </w:rPr>
         <w:t>Câu hỏi:</w:t>
@@ -968,50 +1109,24 @@
       <w:r>
         <w:rPr>
           <w:rFonts w:ascii="Times New Roman" w:hAnsi="Times New Roman"/>
+          <w:b w:val="0"/>
           <w:i w:val="0"/>
-          <w:color w:val="212121"/>
+          <w:color w:val="000000"/>
           <w:sz w:val="26"/>
         </w:rPr>
-        <w:t xml:space="preserve"> Tại sao cùng nhận một lượng nhiệt như nhau và có cùng khối lượng, nhưng độ tăng nhiệt độ của rượu lại lớn hơn nước? Yếu tố nào đặc trưng cho tính chất này của chất? </w:t>
+        <w:t xml:space="preserve"> Tại sao cùng nhận một lượng nhiệt như nhau và có cùng khối lượng, nhưng độ tăng nhiệt độ của rượu lại lớn hơn nước? Yếu tố nào đặc trưng cho tính chất này của chất?</w:t>
       </w:r>
+    </w:p>
+    <w:p>
+      <w:pPr>
+        <w:spacing w:before="40" w:after="40"/>
+        <w:ind w:left="567"/>
+        <w:jc w:val="left"/>
+      </w:pPr>
       <w:r>
         <w:rPr>
           <w:rFonts w:ascii="Times New Roman" w:hAnsi="Times New Roman"/>
-          <w:color w:val="BFBFBF"/>
-          <w:sz w:val="22"/>
-        </w:rPr>
-        <w:t>..........................................................................................</w:t>
-      </w:r>
-      <w:r>
-        <w:rPr>
-          <w:rFonts w:ascii="Times New Roman" w:hAnsi="Times New Roman"/>
-          <w:i w:val="0"/>
-          <w:color w:val="212121"/>
-          <w:sz w:val="26"/>
-        </w:rPr>
-        <w:t xml:space="preserve"> </w:t>
-      </w:r>
-      <w:r>
-        <w:rPr>
-          <w:rFonts w:ascii="Times New Roman" w:hAnsi="Times New Roman"/>
-          <w:color w:val="BFBFBF"/>
-          <w:sz w:val="22"/>
-        </w:rPr>
-        <w:t>..........................................................................................</w:t>
-      </w:r>
-      <w:r>
-        <w:rPr>
-          <w:rFonts w:ascii="Times New Roman" w:hAnsi="Times New Roman"/>
-          <w:i w:val="0"/>
-          <w:color w:val="212121"/>
-          <w:sz w:val="26"/>
-        </w:rPr>
-        <w:t xml:space="preserve"> </w:t>
-      </w:r>
-      <w:r>
-        <w:rPr>
-          <w:rFonts w:ascii="Times New Roman" w:hAnsi="Times New Roman"/>
-          <w:color w:val="BFBFBF"/>
+          <w:color w:val="666666"/>
           <w:sz w:val="22"/>
         </w:rPr>
         <w:t>..........................................................................................</w:t>
@@ -1020,11 +1135,13 @@
     <w:p>
       <w:pPr>
         <w:spacing w:before="40" w:after="40"/>
+        <w:ind w:left="567"/>
+        <w:jc w:val="left"/>
       </w:pPr>
       <w:r>
         <w:rPr>
           <w:rFonts w:ascii="Times New Roman" w:hAnsi="Times New Roman"/>
-          <w:color w:val="BFBFBF"/>
+          <w:color w:val="666666"/>
           <w:sz w:val="22"/>
         </w:rPr>
         <w:t>..........................................................................................</w:t>
@@ -1032,13 +1149,32 @@
     </w:p>
     <w:p>
       <w:pPr>
+        <w:spacing w:before="40" w:after="40"/>
+        <w:ind w:left="567"/>
+        <w:jc w:val="left"/>
+      </w:pPr>
+      <w:r>
+        <w:rPr>
+          <w:rFonts w:ascii="Times New Roman" w:hAnsi="Times New Roman"/>
+          <w:color w:val="666666"/>
+          <w:sz w:val="22"/>
+        </w:rPr>
+        <w:t>..........................................................................................</w:t>
+      </w:r>
+    </w:p>
+    <w:p>
+      <w:pPr>
+        <w:pStyle w:val="Heading2"/>
+        <w:keepNext/>
         <w:spacing w:before="160" w:after="80"/>
+        <w:ind w:left="0" w:firstLine="0"/>
       </w:pPr>
       <w:r>
         <w:rPr>
           <w:rFonts w:ascii="Times New Roman" w:hAnsi="Times New Roman"/>
           <w:b/>
-          <w:color w:val="595959"/>
+          <w:i w:val="0"/>
+          <w:color w:val="000000"/>
           <w:sz w:val="26"/>
         </w:rPr>
         <w:t>2. Trọng tâm (Công thức tính nhiệt lượng)</w:t>
@@ -1046,14 +1182,14 @@
     </w:p>
     <w:p>
       <w:pPr>
-        <w:spacing w:before="0" w:after="80" w:line="276" w:lineRule="auto"/>
+        <w:spacing w:before="60" w:after="60" w:line="312" w:lineRule="auto"/>
         <w:ind w:left="283" w:hanging="170"/>
         <w:jc w:val="both"/>
       </w:pPr>
       <w:r>
         <w:rPr>
           <w:rFonts w:ascii="Times New Roman" w:hAnsi="Times New Roman"/>
-          <w:color w:val="212121"/>
+          <w:color w:val="000000"/>
           <w:sz w:val="26"/>
         </w:rPr>
         <w:t xml:space="preserve">- </w:t>
@@ -1061,8 +1197,9 @@
       <w:r>
         <w:rPr>
           <w:rFonts w:ascii="Times New Roman" w:hAnsi="Times New Roman"/>
+          <w:b w:val="0"/>
           <w:i w:val="0"/>
-          <w:color w:val="212121"/>
+          <w:color w:val="000000"/>
           <w:sz w:val="26"/>
         </w:rPr>
         <w:t xml:space="preserve">  Nhiệt lượng (</w:t>
@@ -1071,7 +1208,7 @@
         <w:rPr>
           <w:rFonts w:ascii="Times New Roman" w:hAnsi="Times New Roman"/>
           <w:i/>
-          <w:color w:val="212121"/>
+          <w:color w:val="000000"/>
           <w:sz w:val="26"/>
         </w:rPr>
         <w:t>Q</w:t>
@@ -1079,23 +1216,24 @@
       <w:r>
         <w:rPr>
           <w:rFonts w:ascii="Times New Roman" w:hAnsi="Times New Roman"/>
+          <w:b w:val="0"/>
           <w:i w:val="0"/>
-          <w:color w:val="212121"/>
+          <w:color w:val="000000"/>
           <w:sz w:val="26"/>
         </w:rPr>
-        <w:t>) là số đo phần (1).................... bị biến đổi trong quá trình truyền nhiệt.</w:t>
+        <w:t>) là số đo phần (1) .................... bị biến đổi trong quá trình truyền nhiệt.</w:t>
       </w:r>
     </w:p>
     <w:p>
       <w:pPr>
-        <w:spacing w:before="0" w:after="80" w:line="276" w:lineRule="auto"/>
+        <w:spacing w:before="60" w:after="60" w:line="312" w:lineRule="auto"/>
         <w:ind w:left="283" w:hanging="170"/>
         <w:jc w:val="both"/>
       </w:pPr>
       <w:r>
         <w:rPr>
           <w:rFonts w:ascii="Times New Roman" w:hAnsi="Times New Roman"/>
-          <w:color w:val="212121"/>
+          <w:color w:val="000000"/>
           <w:sz w:val="26"/>
         </w:rPr>
         <w:t xml:space="preserve">- </w:t>
@@ -1103,8 +1241,9 @@
       <w:r>
         <w:rPr>
           <w:rFonts w:ascii="Times New Roman" w:hAnsi="Times New Roman"/>
+          <w:b w:val="0"/>
           <w:i w:val="0"/>
-          <w:color w:val="212121"/>
+          <w:color w:val="000000"/>
           <w:sz w:val="26"/>
         </w:rPr>
         <w:t xml:space="preserve">  Công thức tính nhiệt lượng thu vào để tăng nhiệt độ từ </w:t>
@@ -1113,7 +1252,7 @@
         <w:rPr>
           <w:rFonts w:ascii="Times New Roman" w:hAnsi="Times New Roman"/>
           <w:i/>
-          <w:color w:val="212121"/>
+          <w:color w:val="000000"/>
           <w:sz w:val="26"/>
         </w:rPr>
         <w:t>t_1</w:t>
@@ -1121,8 +1260,9 @@
       <w:r>
         <w:rPr>
           <w:rFonts w:ascii="Times New Roman" w:hAnsi="Times New Roman"/>
+          <w:b w:val="0"/>
           <w:i w:val="0"/>
-          <w:color w:val="212121"/>
+          <w:color w:val="000000"/>
           <w:sz w:val="26"/>
         </w:rPr>
         <w:t xml:space="preserve"> lên </w:t>
@@ -1131,7 +1271,7 @@
         <w:rPr>
           <w:rFonts w:ascii="Times New Roman" w:hAnsi="Times New Roman"/>
           <w:i/>
-          <w:color w:val="212121"/>
+          <w:color w:val="000000"/>
           <w:sz w:val="26"/>
         </w:rPr>
         <w:t>t_2</w:t>
@@ -1139,8 +1279,9 @@
       <w:r>
         <w:rPr>
           <w:rFonts w:ascii="Times New Roman" w:hAnsi="Times New Roman"/>
+          <w:b w:val="0"/>
           <w:i w:val="0"/>
-          <w:color w:val="212121"/>
+          <w:color w:val="000000"/>
           <w:sz w:val="26"/>
         </w:rPr>
         <w:t>: ==</w:t>
@@ -1149,7 +1290,7 @@
         <w:rPr>
           <w:rFonts w:ascii="Times New Roman" w:hAnsi="Times New Roman"/>
           <w:i/>
-          <w:color w:val="212121"/>
+          <w:color w:val="000000"/>
           <w:sz w:val="26"/>
         </w:rPr>
         <w:t>Q = mc(t_2 - t_1) = mcΔ t</w:t>
@@ -1157,8 +1298,9 @@
       <w:r>
         <w:rPr>
           <w:rFonts w:ascii="Times New Roman" w:hAnsi="Times New Roman"/>
+          <w:b w:val="0"/>
           <w:i w:val="0"/>
-          <w:color w:val="212121"/>
+          <w:color w:val="000000"/>
           <w:sz w:val="26"/>
         </w:rPr>
         <w:t>==.</w:t>
@@ -1166,14 +1308,14 @@
     </w:p>
     <w:p>
       <w:pPr>
-        <w:spacing w:before="0" w:after="80" w:line="276" w:lineRule="auto"/>
+        <w:spacing w:before="60" w:after="60" w:line="312" w:lineRule="auto"/>
         <w:ind w:left="283" w:hanging="170"/>
         <w:jc w:val="both"/>
       </w:pPr>
       <w:r>
         <w:rPr>
           <w:rFonts w:ascii="Times New Roman" w:hAnsi="Times New Roman"/>
-          <w:color w:val="212121"/>
+          <w:color w:val="000000"/>
           <w:sz w:val="26"/>
         </w:rPr>
         <w:t xml:space="preserve">- </w:t>
@@ -1181,8 +1323,9 @@
       <w:r>
         <w:rPr>
           <w:rFonts w:ascii="Times New Roman" w:hAnsi="Times New Roman"/>
+          <w:b w:val="0"/>
           <w:i w:val="0"/>
-          <w:color w:val="212121"/>
+          <w:color w:val="000000"/>
           <w:sz w:val="26"/>
         </w:rPr>
         <w:t xml:space="preserve">  Trong đó: </w:t>
@@ -1191,7 +1334,7 @@
         <w:rPr>
           <w:rFonts w:ascii="Times New Roman" w:hAnsi="Times New Roman"/>
           <w:i/>
-          <w:color w:val="212121"/>
+          <w:color w:val="000000"/>
           <w:sz w:val="26"/>
         </w:rPr>
         <w:t>m</w:t>
@@ -1199,8 +1342,9 @@
       <w:r>
         <w:rPr>
           <w:rFonts w:ascii="Times New Roman" w:hAnsi="Times New Roman"/>
+          <w:b w:val="0"/>
           <w:i w:val="0"/>
-          <w:color w:val="212121"/>
+          <w:color w:val="000000"/>
           <w:sz w:val="26"/>
         </w:rPr>
         <w:t xml:space="preserve"> là khối lượng (</w:t>
@@ -1209,7 +1353,7 @@
         <w:rPr>
           <w:rFonts w:ascii="Times New Roman" w:hAnsi="Times New Roman"/>
           <w:i/>
-          <w:color w:val="212121"/>
+          <w:color w:val="000000"/>
           <w:sz w:val="26"/>
         </w:rPr>
         <w:t>kg</w:t>
@@ -1217,8 +1361,9 @@
       <w:r>
         <w:rPr>
           <w:rFonts w:ascii="Times New Roman" w:hAnsi="Times New Roman"/>
+          <w:b w:val="0"/>
           <w:i w:val="0"/>
-          <w:color w:val="212121"/>
+          <w:color w:val="000000"/>
           <w:sz w:val="26"/>
         </w:rPr>
         <w:t xml:space="preserve">), </w:t>
@@ -1227,7 +1372,7 @@
         <w:rPr>
           <w:rFonts w:ascii="Times New Roman" w:hAnsi="Times New Roman"/>
           <w:i/>
-          <w:color w:val="212121"/>
+          <w:color w:val="000000"/>
           <w:sz w:val="26"/>
         </w:rPr>
         <w:t>c</w:t>
@@ -1235,17 +1380,18 @@
       <w:r>
         <w:rPr>
           <w:rFonts w:ascii="Times New Roman" w:hAnsi="Times New Roman"/>
+          <w:b w:val="0"/>
           <w:i w:val="0"/>
-          <w:color w:val="212121"/>
+          <w:color w:val="000000"/>
           <w:sz w:val="26"/>
         </w:rPr>
-        <w:t xml:space="preserve"> là (2).................... (</w:t>
+        <w:t xml:space="preserve"> là (2) .................... (</w:t>
       </w:r>
       <w:r>
         <w:rPr>
           <w:rFonts w:ascii="Times New Roman" w:hAnsi="Times New Roman"/>
           <w:i/>
-          <w:color w:val="212121"/>
+          <w:color w:val="000000"/>
           <w:sz w:val="26"/>
         </w:rPr>
         <w:t>J/kg.K</w:t>
@@ -1253,8 +1399,9 @@
       <w:r>
         <w:rPr>
           <w:rFonts w:ascii="Times New Roman" w:hAnsi="Times New Roman"/>
+          <w:b w:val="0"/>
           <w:i w:val="0"/>
-          <w:color w:val="212121"/>
+          <w:color w:val="000000"/>
           <w:sz w:val="26"/>
         </w:rPr>
         <w:t xml:space="preserve">), </w:t>
@@ -1263,7 +1410,7 @@
         <w:rPr>
           <w:rFonts w:ascii="Times New Roman" w:hAnsi="Times New Roman"/>
           <w:i/>
-          <w:color w:val="212121"/>
+          <w:color w:val="000000"/>
           <w:sz w:val="26"/>
         </w:rPr>
         <w:t>Δ t</w:t>
@@ -1271,8 +1418,9 @@
       <w:r>
         <w:rPr>
           <w:rFonts w:ascii="Times New Roman" w:hAnsi="Times New Roman"/>
+          <w:b w:val="0"/>
           <w:i w:val="0"/>
-          <w:color w:val="212121"/>
+          <w:color w:val="000000"/>
           <w:sz w:val="26"/>
         </w:rPr>
         <w:t xml:space="preserve"> là độ tăng nhiệt độ (</w:t>
@@ -1281,16 +1429,17 @@
         <w:rPr>
           <w:rFonts w:ascii="Times New Roman" w:hAnsi="Times New Roman"/>
           <w:i/>
-          <w:color w:val="212121"/>
+          <w:color w:val="000000"/>
           <w:sz w:val="26"/>
         </w:rPr>
-        <w:t>° C</w:t>
+        <w:t>^° C</w:t>
       </w:r>
       <w:r>
         <w:rPr>
           <w:rFonts w:ascii="Times New Roman" w:hAnsi="Times New Roman"/>
+          <w:b w:val="0"/>
           <w:i w:val="0"/>
-          <w:color w:val="212121"/>
+          <w:color w:val="000000"/>
           <w:sz w:val="26"/>
         </w:rPr>
         <w:t xml:space="preserve"> hoặc </w:t>
@@ -1299,7 +1448,7 @@
         <w:rPr>
           <w:rFonts w:ascii="Times New Roman" w:hAnsi="Times New Roman"/>
           <w:i/>
-          <w:color w:val="212121"/>
+          <w:color w:val="000000"/>
           <w:sz w:val="26"/>
         </w:rPr>
         <w:t>K</w:t>
@@ -1307,8 +1456,9 @@
       <w:r>
         <w:rPr>
           <w:rFonts w:ascii="Times New Roman" w:hAnsi="Times New Roman"/>
+          <w:b w:val="0"/>
           <w:i w:val="0"/>
-          <w:color w:val="212121"/>
+          <w:color w:val="000000"/>
           <w:sz w:val="26"/>
         </w:rPr>
         <w:t>).</w:t>
@@ -1316,14 +1466,14 @@
     </w:p>
     <w:p>
       <w:pPr>
-        <w:spacing w:before="0" w:after="80" w:line="276" w:lineRule="auto"/>
+        <w:spacing w:before="60" w:after="60" w:line="312" w:lineRule="auto"/>
         <w:ind w:left="283" w:hanging="170"/>
         <w:jc w:val="both"/>
       </w:pPr>
       <w:r>
         <w:rPr>
           <w:rFonts w:ascii="Times New Roman" w:hAnsi="Times New Roman"/>
-          <w:color w:val="212121"/>
+          <w:color w:val="000000"/>
           <w:sz w:val="26"/>
         </w:rPr>
         <w:t xml:space="preserve">- </w:t>
@@ -1331,8 +1481,9 @@
       <w:r>
         <w:rPr>
           <w:rFonts w:ascii="Times New Roman" w:hAnsi="Times New Roman"/>
+          <w:b w:val="0"/>
           <w:i w:val="0"/>
-          <w:color w:val="212121"/>
+          <w:color w:val="000000"/>
           <w:sz w:val="26"/>
         </w:rPr>
         <w:t xml:space="preserve">  *Gợi ý từ khóa:* nội năng, nhiệt dung riêng.</w:t>
@@ -1340,13 +1491,17 @@
     </w:p>
     <w:p>
       <w:pPr>
+        <w:pStyle w:val="Heading2"/>
+        <w:keepNext/>
         <w:spacing w:before="160" w:after="80"/>
+        <w:ind w:left="0" w:firstLine="0"/>
       </w:pPr>
       <w:r>
         <w:rPr>
           <w:rFonts w:ascii="Times New Roman" w:hAnsi="Times New Roman"/>
           <w:b/>
-          <w:color w:val="595959"/>
+          <w:i w:val="0"/>
+          <w:color w:val="000000"/>
           <w:sz w:val="26"/>
         </w:rPr>
         <w:t>3. Vận dụng (Nhiệm vụ 4: Thực tế đun nước)</w:t>
@@ -1354,7 +1509,8 @@
     </w:p>
     <w:p>
       <w:pPr>
-        <w:spacing w:before="0" w:after="80" w:line="276" w:lineRule="auto"/>
+        <w:spacing w:before="120" w:after="120" w:line="312" w:lineRule="auto"/>
+        <w:ind w:left="0" w:firstLine="567"/>
         <w:jc w:val="both"/>
       </w:pPr>
       <w:r>
@@ -1362,7 +1518,7 @@
           <w:rFonts w:ascii="Times New Roman" w:hAnsi="Times New Roman"/>
           <w:b/>
           <w:i w:val="0"/>
-          <w:color w:val="212121"/>
+          <w:color w:val="000000"/>
           <w:sz w:val="26"/>
         </w:rPr>
         <w:t>Tình huống:</w:t>
@@ -1370,8 +1526,9 @@
       <w:r>
         <w:rPr>
           <w:rFonts w:ascii="Times New Roman" w:hAnsi="Times New Roman"/>
+          <w:b w:val="0"/>
           <w:i w:val="0"/>
-          <w:color w:val="212121"/>
+          <w:color w:val="000000"/>
           <w:sz w:val="26"/>
         </w:rPr>
         <w:t xml:space="preserve"> Một ấm đun nước bằng nhôm có khối lượng </w:t>
@@ -1380,7 +1537,7 @@
         <w:rPr>
           <w:rFonts w:ascii="Times New Roman" w:hAnsi="Times New Roman"/>
           <w:i/>
-          <w:color w:val="212121"/>
+          <w:color w:val="000000"/>
           <w:sz w:val="26"/>
         </w:rPr>
         <w:t>m_1 = 0,5 kg</w:t>
@@ -1388,8 +1545,9 @@
       <w:r>
         <w:rPr>
           <w:rFonts w:ascii="Times New Roman" w:hAnsi="Times New Roman"/>
+          <w:b w:val="0"/>
           <w:i w:val="0"/>
-          <w:color w:val="212121"/>
+          <w:color w:val="000000"/>
           <w:sz w:val="26"/>
         </w:rPr>
         <w:t xml:space="preserve"> chứa </w:t>
@@ -1398,7 +1556,7 @@
         <w:rPr>
           <w:rFonts w:ascii="Times New Roman" w:hAnsi="Times New Roman"/>
           <w:i/>
-          <w:color w:val="212121"/>
+          <w:color w:val="000000"/>
           <w:sz w:val="26"/>
         </w:rPr>
         <w:t>m_2 = 2 kg</w:t>
@@ -1406,8 +1564,9 @@
       <w:r>
         <w:rPr>
           <w:rFonts w:ascii="Times New Roman" w:hAnsi="Times New Roman"/>
+          <w:b w:val="0"/>
           <w:i w:val="0"/>
-          <w:color w:val="212121"/>
+          <w:color w:val="000000"/>
           <w:sz w:val="26"/>
         </w:rPr>
         <w:t xml:space="preserve"> nước ở nhiệt độ ban đầu </w:t>
@@ -1416,16 +1575,17 @@
         <w:rPr>
           <w:rFonts w:ascii="Times New Roman" w:hAnsi="Times New Roman"/>
           <w:i/>
-          <w:color w:val="212121"/>
+          <w:color w:val="000000"/>
           <w:sz w:val="26"/>
         </w:rPr>
-        <w:t>t_1 = 20° C</w:t>
+        <w:t>t_1 = 20^° C</w:t>
       </w:r>
       <w:r>
         <w:rPr>
           <w:rFonts w:ascii="Times New Roman" w:hAnsi="Times New Roman"/>
+          <w:b w:val="0"/>
           <w:i w:val="0"/>
-          <w:color w:val="212121"/>
+          <w:color w:val="000000"/>
           <w:sz w:val="26"/>
         </w:rPr>
         <w:t>. Cần cung cấp một nhiệt lượng bao nhiêu để đun sôi lượng nước này (</w:t>
@@ -1434,16 +1594,17 @@
         <w:rPr>
           <w:rFonts w:ascii="Times New Roman" w:hAnsi="Times New Roman"/>
           <w:i/>
-          <w:color w:val="212121"/>
+          <w:color w:val="000000"/>
           <w:sz w:val="26"/>
         </w:rPr>
-        <w:t>t_2 = 100° C</w:t>
+        <w:t>t_2 = 100^° C</w:t>
       </w:r>
       <w:r>
         <w:rPr>
           <w:rFonts w:ascii="Times New Roman" w:hAnsi="Times New Roman"/>
+          <w:b w:val="0"/>
           <w:i w:val="0"/>
-          <w:color w:val="212121"/>
+          <w:color w:val="000000"/>
           <w:sz w:val="26"/>
         </w:rPr>
         <w:t xml:space="preserve">). Biết nhiệt dung riêng của nhôm </w:t>
@@ -1452,7 +1613,7 @@
         <w:rPr>
           <w:rFonts w:ascii="Times New Roman" w:hAnsi="Times New Roman"/>
           <w:i/>
-          <w:color w:val="212121"/>
+          <w:color w:val="000000"/>
           <w:sz w:val="26"/>
         </w:rPr>
         <w:t>c_1 = 880 J/kg.K</w:t>
@@ -1460,8 +1621,9 @@
       <w:r>
         <w:rPr>
           <w:rFonts w:ascii="Times New Roman" w:hAnsi="Times New Roman"/>
+          <w:b w:val="0"/>
           <w:i w:val="0"/>
-          <w:color w:val="212121"/>
+          <w:color w:val="000000"/>
           <w:sz w:val="26"/>
         </w:rPr>
         <w:t xml:space="preserve"> và của nước </w:t>
@@ -1470,7 +1632,7 @@
         <w:rPr>
           <w:rFonts w:ascii="Times New Roman" w:hAnsi="Times New Roman"/>
           <w:i/>
-          <w:color w:val="212121"/>
+          <w:color w:val="000000"/>
           <w:sz w:val="26"/>
         </w:rPr>
         <w:t>c_2 = 4200 J/kg.K</w:t>
@@ -1478,8 +1640,9 @@
       <w:r>
         <w:rPr>
           <w:rFonts w:ascii="Times New Roman" w:hAnsi="Times New Roman"/>
+          <w:b w:val="0"/>
           <w:i w:val="0"/>
-          <w:color w:val="212121"/>
+          <w:color w:val="000000"/>
           <w:sz w:val="26"/>
         </w:rPr>
         <w:t>. Bỏ qua hao phí nhiệt ra môi trường.</w:t>
@@ -1487,14 +1650,14 @@
     </w:p>
     <w:p>
       <w:pPr>
-        <w:spacing w:before="0" w:after="80" w:line="276" w:lineRule="auto"/>
+        <w:spacing w:before="60" w:after="60" w:line="312" w:lineRule="auto"/>
         <w:ind w:left="283" w:hanging="170"/>
         <w:jc w:val="both"/>
       </w:pPr>
       <w:r>
         <w:rPr>
           <w:rFonts w:ascii="Times New Roman" w:hAnsi="Times New Roman"/>
-          <w:color w:val="212121"/>
+          <w:color w:val="000000"/>
           <w:sz w:val="26"/>
         </w:rPr>
         <w:t xml:space="preserve">- </w:t>
@@ -1502,8 +1665,9 @@
       <w:r>
         <w:rPr>
           <w:rFonts w:ascii="Times New Roman" w:hAnsi="Times New Roman"/>
+          <w:b w:val="0"/>
           <w:i w:val="0"/>
-          <w:color w:val="212121"/>
+          <w:color w:val="000000"/>
           <w:sz w:val="26"/>
         </w:rPr>
         <w:t xml:space="preserve">  </w:t>
@@ -1513,7 +1677,7 @@
           <w:rFonts w:ascii="Times New Roman" w:hAnsi="Times New Roman"/>
           <w:b/>
           <w:i w:val="0"/>
-          <w:color w:val="212121"/>
+          <w:color w:val="000000"/>
           <w:sz w:val="26"/>
         </w:rPr>
         <w:t>Câu hỏi:</w:t>
@@ -1521,50 +1685,24 @@
       <w:r>
         <w:rPr>
           <w:rFonts w:ascii="Times New Roman" w:hAnsi="Times New Roman"/>
+          <w:b w:val="0"/>
           <w:i w:val="0"/>
-          <w:color w:val="212121"/>
+          <w:color w:val="000000"/>
           <w:sz w:val="26"/>
         </w:rPr>
-        <w:t xml:space="preserve"> Tính tổng nhiệt lượng cần cung cấp cho ấm và nước. </w:t>
+        <w:t xml:space="preserve"> Tính tổng nhiệt lượng cần cung cấp cho ấm và nước.</w:t>
       </w:r>
+    </w:p>
+    <w:p>
+      <w:pPr>
+        <w:spacing w:before="40" w:after="40"/>
+        <w:ind w:left="567"/>
+        <w:jc w:val="left"/>
+      </w:pPr>
       <w:r>
         <w:rPr>
           <w:rFonts w:ascii="Times New Roman" w:hAnsi="Times New Roman"/>
-          <w:color w:val="BFBFBF"/>
-          <w:sz w:val="22"/>
-        </w:rPr>
-        <w:t>..........................................................................................</w:t>
-      </w:r>
-      <w:r>
-        <w:rPr>
-          <w:rFonts w:ascii="Times New Roman" w:hAnsi="Times New Roman"/>
-          <w:i w:val="0"/>
-          <w:color w:val="212121"/>
-          <w:sz w:val="26"/>
-        </w:rPr>
-        <w:t xml:space="preserve"> </w:t>
-      </w:r>
-      <w:r>
-        <w:rPr>
-          <w:rFonts w:ascii="Times New Roman" w:hAnsi="Times New Roman"/>
-          <w:color w:val="BFBFBF"/>
-          <w:sz w:val="22"/>
-        </w:rPr>
-        <w:t>..........................................................................................</w:t>
-      </w:r>
-      <w:r>
-        <w:rPr>
-          <w:rFonts w:ascii="Times New Roman" w:hAnsi="Times New Roman"/>
-          <w:i w:val="0"/>
-          <w:color w:val="212121"/>
-          <w:sz w:val="26"/>
-        </w:rPr>
-        <w:t xml:space="preserve"> </w:t>
-      </w:r>
-      <w:r>
-        <w:rPr>
-          <w:rFonts w:ascii="Times New Roman" w:hAnsi="Times New Roman"/>
-          <w:color w:val="BFBFBF"/>
+          <w:color w:val="666666"/>
           <w:sz w:val="22"/>
         </w:rPr>
         <w:t>..........................................................................................</w:t>
@@ -1573,82 +1711,13 @@
     <w:p>
       <w:pPr>
         <w:spacing w:before="40" w:after="40"/>
+        <w:ind w:left="567"/>
+        <w:jc w:val="left"/>
       </w:pPr>
       <w:r>
         <w:rPr>
           <w:rFonts w:ascii="Times New Roman" w:hAnsi="Times New Roman"/>
-          <w:color w:val="BFBFBF"/>
-          <w:sz w:val="22"/>
-        </w:rPr>
-        <w:t>..........................................................................................</w:t>
-      </w:r>
-    </w:p>
-    <w:p>
-      <w:pPr>
-        <w:spacing w:before="160" w:after="80"/>
-      </w:pPr>
-      <w:r>
-        <w:rPr>
-          <w:rFonts w:ascii="Times New Roman" w:hAnsi="Times New Roman"/>
-          <w:b/>
-          <w:color w:val="595959"/>
-          <w:sz w:val="26"/>
-        </w:rPr>
-        <w:t>4. Mở rộng (STEM Connection)</w:t>
-      </w:r>
-    </w:p>
-    <w:p>
-      <w:pPr>
-        <w:spacing w:before="0" w:after="80" w:line="276" w:lineRule="auto"/>
-        <w:ind w:left="567"/>
-        <w:jc w:val="both"/>
-      </w:pPr>
-      <w:r>
-        <w:rPr>
-          <w:rFonts w:ascii="Times New Roman" w:hAnsi="Times New Roman"/>
-          <w:b/>
-          <w:i/>
-          <w:color w:val="212121"/>
-          <w:sz w:val="26"/>
-        </w:rPr>
-        <w:t>Nhiệt dung riêng của nước và khí hậu:</w:t>
-      </w:r>
-      <w:r>
-        <w:rPr>
-          <w:rFonts w:ascii="Times New Roman" w:hAnsi="Times New Roman"/>
-          <w:i/>
-          <w:color w:val="212121"/>
-          <w:sz w:val="26"/>
-        </w:rPr>
-        <w:t xml:space="preserve"> &gt; Nước có nhiệt dung riêng rất lớn (</w:t>
-      </w:r>
-      <w:r>
-        <w:rPr>
-          <w:rFonts w:ascii="Times New Roman" w:hAnsi="Times New Roman"/>
-          <w:i/>
-          <w:color w:val="212121"/>
-          <w:sz w:val="26"/>
-        </w:rPr>
-        <w:t>4200 J/kg.K</w:t>
-      </w:r>
-      <w:r>
-        <w:rPr>
-          <w:rFonts w:ascii="Times New Roman" w:hAnsi="Times New Roman"/>
-          <w:i/>
-          <w:color w:val="212121"/>
-          <w:sz w:val="26"/>
-        </w:rPr>
-        <w:t>) so với đất đá hay không khí. Điều này giải thích tại sao vùng ven biển có khí hậu điều hòa ôn hòa hơn sâu trong lục địa. Ban ngày dưới nắng gắt, nước biển hấp thụ nhiệt tăng nhiệt độ chậm; ban đêm khi trời lạnh, nước tỏa nhiệt giảm nhiệt độ từ từ. Sự chênh lệch nhiệt dung riêng này cũng tạo ra các luồng gió biển thổi luân phiên ngày và đêm. &gt; *(Nguồn: Khí tượng thủy văn đại cương - NXB Địa chất)*</w:t>
-      </w:r>
-    </w:p>
-    <w:p>
-      <w:pPr>
-        <w:spacing w:before="40" w:after="40"/>
-      </w:pPr>
-      <w:r>
-        <w:rPr>
-          <w:rFonts w:ascii="Times New Roman" w:hAnsi="Times New Roman"/>
-          <w:color w:val="BFBFBF"/>
+          <w:color w:val="666666"/>
           <w:sz w:val="22"/>
         </w:rPr>
         <w:t>..........................................................................................</w:t>
@@ -1657,11 +1726,13 @@
     <w:p>
       <w:pPr>
         <w:spacing w:before="40" w:after="40"/>
+        <w:ind w:left="567"/>
+        <w:jc w:val="left"/>
       </w:pPr>
       <w:r>
         <w:rPr>
           <w:rFonts w:ascii="Times New Roman" w:hAnsi="Times New Roman"/>
-          <w:color w:val="BFBFBF"/>
+          <w:color w:val="666666"/>
           <w:sz w:val="22"/>
         </w:rPr>
         <w:t>..........................................................................................</w:t>
@@ -1669,779 +1740,17 @@
     </w:p>
     <w:p>
       <w:pPr>
-        <w:spacing w:before="40" w:after="40"/>
-      </w:pPr>
-      <w:r>
-        <w:rPr>
-          <w:rFonts w:ascii="Times New Roman" w:hAnsi="Times New Roman"/>
-          <w:color w:val="BFBFBF"/>
-          <w:sz w:val="22"/>
-        </w:rPr>
-        <w:t>..........................................................................................</w:t>
-      </w:r>
-    </w:p>
-    <w:p>
-      <w:pPr>
-        <w:spacing w:before="40" w:after="40"/>
-      </w:pPr>
-      <w:r>
-        <w:rPr>
-          <w:rFonts w:ascii="Times New Roman" w:hAnsi="Times New Roman"/>
-          <w:color w:val="BFBFBF"/>
-          <w:sz w:val="22"/>
-        </w:rPr>
-        <w:t>..........................................................................................</w:t>
-      </w:r>
-    </w:p>
-    <w:p>
-      <w:pPr>
-        <w:spacing w:before="280" w:after="120"/>
-      </w:pPr>
-      <w:r>
-        <w:rPr>
-          <w:rFonts w:ascii="Times New Roman" w:hAnsi="Times New Roman"/>
-          <w:b/>
-          <w:color w:val="1E3A5F"/>
-          <w:sz w:val="28"/>
-        </w:rPr>
-        <w:t>📍 ĐVKT 2: NHIỆT LƯỢNG VÀ CÔNG THỨC TÍNH NHIỆT LƯỢNG</w:t>
-      </w:r>
-    </w:p>
-    <w:p>
-      <w:pPr>
+        <w:pStyle w:val="Heading2"/>
+        <w:keepNext/>
         <w:spacing w:before="160" w:after="80"/>
-      </w:pPr>
-      <w:r>
-        <w:rPr>
-          <w:rFonts w:ascii="Times New Roman" w:hAnsi="Times New Roman"/>
-          <w:b/>
-          <w:color w:val="595959"/>
-          <w:sz w:val="26"/>
-        </w:rPr>
-        <w:t>1. Khám phá (Nhiệm vụ 3: Đun nóng nước và rượu)</w:t>
-      </w:r>
-    </w:p>
-    <w:p>
-      <w:pPr>
-        <w:spacing w:before="0" w:after="80" w:line="276" w:lineRule="auto"/>
-        <w:jc w:val="both"/>
+        <w:ind w:left="0" w:firstLine="0"/>
       </w:pPr>
       <w:r>
         <w:rPr>
           <w:rFonts w:ascii="Times New Roman" w:hAnsi="Times New Roman"/>
           <w:b/>
           <w:i w:val="0"/>
-          <w:color w:val="212121"/>
-          <w:sz w:val="26"/>
-        </w:rPr>
-        <w:t>Thực nghiệm:</w:t>
-      </w:r>
-      <w:r>
-        <w:rPr>
-          <w:rFonts w:ascii="Times New Roman" w:hAnsi="Times New Roman"/>
-          <w:i w:val="0"/>
-          <w:color w:val="212121"/>
-          <w:sz w:val="26"/>
-        </w:rPr>
-        <w:t xml:space="preserve"> GV dùng hai đèn cồn giống hệt nhau để đun nóng </w:t>
-      </w:r>
-      <w:r>
-        <w:rPr>
-          <w:rFonts w:ascii="Times New Roman" w:hAnsi="Times New Roman"/>
-          <w:i/>
-          <w:color w:val="212121"/>
-          <w:sz w:val="26"/>
-        </w:rPr>
-        <w:t>100 g</w:t>
-      </w:r>
-      <w:r>
-        <w:rPr>
-          <w:rFonts w:ascii="Times New Roman" w:hAnsi="Times New Roman"/>
-          <w:i w:val="0"/>
-          <w:color w:val="212121"/>
-          <w:sz w:val="26"/>
-        </w:rPr>
-        <w:t xml:space="preserve"> nước và </w:t>
-      </w:r>
-      <w:r>
-        <w:rPr>
-          <w:rFonts w:ascii="Times New Roman" w:hAnsi="Times New Roman"/>
-          <w:i/>
-          <w:color w:val="212121"/>
-          <w:sz w:val="26"/>
-        </w:rPr>
-        <w:t>100 g</w:t>
-      </w:r>
-      <w:r>
-        <w:rPr>
-          <w:rFonts w:ascii="Times New Roman" w:hAnsi="Times New Roman"/>
-          <w:i w:val="0"/>
-          <w:color w:val="212121"/>
-          <w:sz w:val="26"/>
-        </w:rPr>
-        <w:t xml:space="preserve"> rượu trong cùng một khoảng thời gian. Kết quả cho thấy nhiệt độ của rượu tăng nhanh hơn nhiều so với nước.</w:t>
-      </w:r>
-    </w:p>
-    <w:p>
-      <w:pPr>
-        <w:spacing w:before="0" w:after="80" w:line="276" w:lineRule="auto"/>
-        <w:ind w:left="283" w:hanging="170"/>
-        <w:jc w:val="both"/>
-      </w:pPr>
-      <w:r>
-        <w:rPr>
-          <w:rFonts w:ascii="Times New Roman" w:hAnsi="Times New Roman"/>
-          <w:color w:val="212121"/>
-          <w:sz w:val="26"/>
-        </w:rPr>
-        <w:t xml:space="preserve">- </w:t>
-      </w:r>
-      <w:r>
-        <w:rPr>
-          <w:rFonts w:ascii="Times New Roman" w:hAnsi="Times New Roman"/>
-          <w:i w:val="0"/>
-          <w:color w:val="212121"/>
-          <w:sz w:val="26"/>
-        </w:rPr>
-        <w:t xml:space="preserve">  </w:t>
-      </w:r>
-      <w:r>
-        <w:rPr>
-          <w:rFonts w:ascii="Times New Roman" w:hAnsi="Times New Roman"/>
-          <w:b/>
-          <w:i w:val="0"/>
-          <w:color w:val="212121"/>
-          <w:sz w:val="26"/>
-        </w:rPr>
-        <w:t>Câu hỏi:</w:t>
-      </w:r>
-      <w:r>
-        <w:rPr>
-          <w:rFonts w:ascii="Times New Roman" w:hAnsi="Times New Roman"/>
-          <w:i w:val="0"/>
-          <w:color w:val="212121"/>
-          <w:sz w:val="26"/>
-        </w:rPr>
-        <w:t xml:space="preserve"> Tại sao cùng nhận một lượng nhiệt như nhau và có cùng khối lượng, nhưng độ tăng nhiệt độ của rượu lại lớn hơn nước? Yếu tố nào đặc trưng cho tính chất này của chất? </w:t>
-      </w:r>
-      <w:r>
-        <w:rPr>
-          <w:rFonts w:ascii="Times New Roman" w:hAnsi="Times New Roman"/>
-          <w:color w:val="BFBFBF"/>
-          <w:sz w:val="22"/>
-        </w:rPr>
-        <w:t>..........................................................................................</w:t>
-      </w:r>
-      <w:r>
-        <w:rPr>
-          <w:rFonts w:ascii="Times New Roman" w:hAnsi="Times New Roman"/>
-          <w:i w:val="0"/>
-          <w:color w:val="212121"/>
-          <w:sz w:val="26"/>
-        </w:rPr>
-        <w:t xml:space="preserve"> </w:t>
-      </w:r>
-      <w:r>
-        <w:rPr>
-          <w:rFonts w:ascii="Times New Roman" w:hAnsi="Times New Roman"/>
-          <w:color w:val="BFBFBF"/>
-          <w:sz w:val="22"/>
-        </w:rPr>
-        <w:t>..........................................................................................</w:t>
-      </w:r>
-      <w:r>
-        <w:rPr>
-          <w:rFonts w:ascii="Times New Roman" w:hAnsi="Times New Roman"/>
-          <w:i w:val="0"/>
-          <w:color w:val="212121"/>
-          <w:sz w:val="26"/>
-        </w:rPr>
-        <w:t xml:space="preserve"> </w:t>
-      </w:r>
-      <w:r>
-        <w:rPr>
-          <w:rFonts w:ascii="Times New Roman" w:hAnsi="Times New Roman"/>
-          <w:color w:val="BFBFBF"/>
-          <w:sz w:val="22"/>
-        </w:rPr>
-        <w:t>..........................................................................................</w:t>
-      </w:r>
-    </w:p>
-    <w:p>
-      <w:pPr>
-        <w:spacing w:before="40" w:after="40"/>
-      </w:pPr>
-      <w:r>
-        <w:rPr>
-          <w:rFonts w:ascii="Times New Roman" w:hAnsi="Times New Roman"/>
-          <w:color w:val="BFBFBF"/>
-          <w:sz w:val="22"/>
-        </w:rPr>
-        <w:t>..........................................................................................</w:t>
-      </w:r>
-    </w:p>
-    <w:p>
-      <w:pPr>
-        <w:spacing w:before="160" w:after="80"/>
-      </w:pPr>
-      <w:r>
-        <w:rPr>
-          <w:rFonts w:ascii="Times New Roman" w:hAnsi="Times New Roman"/>
-          <w:b/>
-          <w:color w:val="595959"/>
-          <w:sz w:val="26"/>
-        </w:rPr>
-        <w:t>2. Trọng tâm (Công thức tính nhiệt lượng)</w:t>
-      </w:r>
-    </w:p>
-    <w:p>
-      <w:pPr>
-        <w:spacing w:before="0" w:after="80" w:line="276" w:lineRule="auto"/>
-        <w:ind w:left="283" w:hanging="170"/>
-        <w:jc w:val="both"/>
-      </w:pPr>
-      <w:r>
-        <w:rPr>
-          <w:rFonts w:ascii="Times New Roman" w:hAnsi="Times New Roman"/>
-          <w:color w:val="212121"/>
-          <w:sz w:val="26"/>
-        </w:rPr>
-        <w:t xml:space="preserve">- </w:t>
-      </w:r>
-      <w:r>
-        <w:rPr>
-          <w:rFonts w:ascii="Times New Roman" w:hAnsi="Times New Roman"/>
-          <w:i w:val="0"/>
-          <w:color w:val="212121"/>
-          <w:sz w:val="26"/>
-        </w:rPr>
-        <w:t xml:space="preserve">  Nhiệt lượng (</w:t>
-      </w:r>
-      <w:r>
-        <w:rPr>
-          <w:rFonts w:ascii="Times New Roman" w:hAnsi="Times New Roman"/>
-          <w:i/>
-          <w:color w:val="212121"/>
-          <w:sz w:val="26"/>
-        </w:rPr>
-        <w:t>Q</w:t>
-      </w:r>
-      <w:r>
-        <w:rPr>
-          <w:rFonts w:ascii="Times New Roman" w:hAnsi="Times New Roman"/>
-          <w:i w:val="0"/>
-          <w:color w:val="212121"/>
-          <w:sz w:val="26"/>
-        </w:rPr>
-        <w:t>) là số đo phần (1).................... bị biến đổi trong quá trình truyền nhiệt.</w:t>
-      </w:r>
-    </w:p>
-    <w:p>
-      <w:pPr>
-        <w:spacing w:before="0" w:after="80" w:line="276" w:lineRule="auto"/>
-        <w:ind w:left="283" w:hanging="170"/>
-        <w:jc w:val="both"/>
-      </w:pPr>
-      <w:r>
-        <w:rPr>
-          <w:rFonts w:ascii="Times New Roman" w:hAnsi="Times New Roman"/>
-          <w:color w:val="212121"/>
-          <w:sz w:val="26"/>
-        </w:rPr>
-        <w:t xml:space="preserve">- </w:t>
-      </w:r>
-      <w:r>
-        <w:rPr>
-          <w:rFonts w:ascii="Times New Roman" w:hAnsi="Times New Roman"/>
-          <w:i w:val="0"/>
-          <w:color w:val="212121"/>
-          <w:sz w:val="26"/>
-        </w:rPr>
-        <w:t xml:space="preserve">  Công thức tính nhiệt lượng thu vào để tăng nhiệt độ từ </w:t>
-      </w:r>
-      <w:r>
-        <w:rPr>
-          <w:rFonts w:ascii="Times New Roman" w:hAnsi="Times New Roman"/>
-          <w:i/>
-          <w:color w:val="212121"/>
-          <w:sz w:val="26"/>
-        </w:rPr>
-        <w:t>t_1</w:t>
-      </w:r>
-      <w:r>
-        <w:rPr>
-          <w:rFonts w:ascii="Times New Roman" w:hAnsi="Times New Roman"/>
-          <w:i w:val="0"/>
-          <w:color w:val="212121"/>
-          <w:sz w:val="26"/>
-        </w:rPr>
-        <w:t xml:space="preserve"> lên </w:t>
-      </w:r>
-      <w:r>
-        <w:rPr>
-          <w:rFonts w:ascii="Times New Roman" w:hAnsi="Times New Roman"/>
-          <w:i/>
-          <w:color w:val="212121"/>
-          <w:sz w:val="26"/>
-        </w:rPr>
-        <w:t>t_2</w:t>
-      </w:r>
-      <w:r>
-        <w:rPr>
-          <w:rFonts w:ascii="Times New Roman" w:hAnsi="Times New Roman"/>
-          <w:i w:val="0"/>
-          <w:color w:val="212121"/>
-          <w:sz w:val="26"/>
-        </w:rPr>
-        <w:t>: ==</w:t>
-      </w:r>
-      <w:r>
-        <w:rPr>
-          <w:rFonts w:ascii="Times New Roman" w:hAnsi="Times New Roman"/>
-          <w:i/>
-          <w:color w:val="212121"/>
-          <w:sz w:val="26"/>
-        </w:rPr>
-        <w:t>Q = mc(t_2 - t_1) = mcΔ t</w:t>
-      </w:r>
-      <w:r>
-        <w:rPr>
-          <w:rFonts w:ascii="Times New Roman" w:hAnsi="Times New Roman"/>
-          <w:i w:val="0"/>
-          <w:color w:val="212121"/>
-          <w:sz w:val="26"/>
-        </w:rPr>
-        <w:t>==.</w:t>
-      </w:r>
-    </w:p>
-    <w:p>
-      <w:pPr>
-        <w:spacing w:before="0" w:after="80" w:line="276" w:lineRule="auto"/>
-        <w:ind w:left="283" w:hanging="170"/>
-        <w:jc w:val="both"/>
-      </w:pPr>
-      <w:r>
-        <w:rPr>
-          <w:rFonts w:ascii="Times New Roman" w:hAnsi="Times New Roman"/>
-          <w:color w:val="212121"/>
-          <w:sz w:val="26"/>
-        </w:rPr>
-        <w:t xml:space="preserve">- </w:t>
-      </w:r>
-      <w:r>
-        <w:rPr>
-          <w:rFonts w:ascii="Times New Roman" w:hAnsi="Times New Roman"/>
-          <w:i w:val="0"/>
-          <w:color w:val="212121"/>
-          <w:sz w:val="26"/>
-        </w:rPr>
-        <w:t xml:space="preserve">  Trong đó: </w:t>
-      </w:r>
-      <w:r>
-        <w:rPr>
-          <w:rFonts w:ascii="Times New Roman" w:hAnsi="Times New Roman"/>
-          <w:i/>
-          <w:color w:val="212121"/>
-          <w:sz w:val="26"/>
-        </w:rPr>
-        <w:t>m</w:t>
-      </w:r>
-      <w:r>
-        <w:rPr>
-          <w:rFonts w:ascii="Times New Roman" w:hAnsi="Times New Roman"/>
-          <w:i w:val="0"/>
-          <w:color w:val="212121"/>
-          <w:sz w:val="26"/>
-        </w:rPr>
-        <w:t xml:space="preserve"> là khối lượng (</w:t>
-      </w:r>
-      <w:r>
-        <w:rPr>
-          <w:rFonts w:ascii="Times New Roman" w:hAnsi="Times New Roman"/>
-          <w:i/>
-          <w:color w:val="212121"/>
-          <w:sz w:val="26"/>
-        </w:rPr>
-        <w:t>kg</w:t>
-      </w:r>
-      <w:r>
-        <w:rPr>
-          <w:rFonts w:ascii="Times New Roman" w:hAnsi="Times New Roman"/>
-          <w:i w:val="0"/>
-          <w:color w:val="212121"/>
-          <w:sz w:val="26"/>
-        </w:rPr>
-        <w:t xml:space="preserve">), </w:t>
-      </w:r>
-      <w:r>
-        <w:rPr>
-          <w:rFonts w:ascii="Times New Roman" w:hAnsi="Times New Roman"/>
-          <w:i/>
-          <w:color w:val="212121"/>
-          <w:sz w:val="26"/>
-        </w:rPr>
-        <w:t>c</w:t>
-      </w:r>
-      <w:r>
-        <w:rPr>
-          <w:rFonts w:ascii="Times New Roman" w:hAnsi="Times New Roman"/>
-          <w:i w:val="0"/>
-          <w:color w:val="212121"/>
-          <w:sz w:val="26"/>
-        </w:rPr>
-        <w:t xml:space="preserve"> là (2).................... (</w:t>
-      </w:r>
-      <w:r>
-        <w:rPr>
-          <w:rFonts w:ascii="Times New Roman" w:hAnsi="Times New Roman"/>
-          <w:i/>
-          <w:color w:val="212121"/>
-          <w:sz w:val="26"/>
-        </w:rPr>
-        <w:t>J/kg.K</w:t>
-      </w:r>
-      <w:r>
-        <w:rPr>
-          <w:rFonts w:ascii="Times New Roman" w:hAnsi="Times New Roman"/>
-          <w:i w:val="0"/>
-          <w:color w:val="212121"/>
-          <w:sz w:val="26"/>
-        </w:rPr>
-        <w:t xml:space="preserve">), </w:t>
-      </w:r>
-      <w:r>
-        <w:rPr>
-          <w:rFonts w:ascii="Times New Roman" w:hAnsi="Times New Roman"/>
-          <w:i/>
-          <w:color w:val="212121"/>
-          <w:sz w:val="26"/>
-        </w:rPr>
-        <w:t>Δ t</w:t>
-      </w:r>
-      <w:r>
-        <w:rPr>
-          <w:rFonts w:ascii="Times New Roman" w:hAnsi="Times New Roman"/>
-          <w:i w:val="0"/>
-          <w:color w:val="212121"/>
-          <w:sz w:val="26"/>
-        </w:rPr>
-        <w:t xml:space="preserve"> là độ tăng nhiệt độ (</w:t>
-      </w:r>
-      <w:r>
-        <w:rPr>
-          <w:rFonts w:ascii="Times New Roman" w:hAnsi="Times New Roman"/>
-          <w:i/>
-          <w:color w:val="212121"/>
-          <w:sz w:val="26"/>
-        </w:rPr>
-        <w:t>° C</w:t>
-      </w:r>
-      <w:r>
-        <w:rPr>
-          <w:rFonts w:ascii="Times New Roman" w:hAnsi="Times New Roman"/>
-          <w:i w:val="0"/>
-          <w:color w:val="212121"/>
-          <w:sz w:val="26"/>
-        </w:rPr>
-        <w:t xml:space="preserve"> hoặc </w:t>
-      </w:r>
-      <w:r>
-        <w:rPr>
-          <w:rFonts w:ascii="Times New Roman" w:hAnsi="Times New Roman"/>
-          <w:i/>
-          <w:color w:val="212121"/>
-          <w:sz w:val="26"/>
-        </w:rPr>
-        <w:t>K</w:t>
-      </w:r>
-      <w:r>
-        <w:rPr>
-          <w:rFonts w:ascii="Times New Roman" w:hAnsi="Times New Roman"/>
-          <w:i w:val="0"/>
-          <w:color w:val="212121"/>
-          <w:sz w:val="26"/>
-        </w:rPr>
-        <w:t>).</w:t>
-      </w:r>
-    </w:p>
-    <w:p>
-      <w:pPr>
-        <w:spacing w:before="0" w:after="80" w:line="276" w:lineRule="auto"/>
-        <w:ind w:left="283" w:hanging="170"/>
-        <w:jc w:val="both"/>
-      </w:pPr>
-      <w:r>
-        <w:rPr>
-          <w:rFonts w:ascii="Times New Roman" w:hAnsi="Times New Roman"/>
-          <w:color w:val="212121"/>
-          <w:sz w:val="26"/>
-        </w:rPr>
-        <w:t xml:space="preserve">- </w:t>
-      </w:r>
-      <w:r>
-        <w:rPr>
-          <w:rFonts w:ascii="Times New Roman" w:hAnsi="Times New Roman"/>
-          <w:i w:val="0"/>
-          <w:color w:val="212121"/>
-          <w:sz w:val="26"/>
-        </w:rPr>
-        <w:t xml:space="preserve">  *Gợi ý từ khóa:* nội năng, nhiệt dung riêng.</w:t>
-      </w:r>
-    </w:p>
-    <w:p>
-      <w:pPr>
-        <w:spacing w:before="160" w:after="80"/>
-      </w:pPr>
-      <w:r>
-        <w:rPr>
-          <w:rFonts w:ascii="Times New Roman" w:hAnsi="Times New Roman"/>
-          <w:b/>
-          <w:color w:val="595959"/>
-          <w:sz w:val="26"/>
-        </w:rPr>
-        <w:t>3. Vận dụng (Nhiệm vụ 4: Thực tế đun nước)</w:t>
-      </w:r>
-    </w:p>
-    <w:p>
-      <w:pPr>
-        <w:spacing w:before="0" w:after="80" w:line="276" w:lineRule="auto"/>
-        <w:jc w:val="both"/>
-      </w:pPr>
-      <w:r>
-        <w:rPr>
-          <w:rFonts w:ascii="Times New Roman" w:hAnsi="Times New Roman"/>
-          <w:b/>
-          <w:i w:val="0"/>
-          <w:color w:val="212121"/>
-          <w:sz w:val="26"/>
-        </w:rPr>
-        <w:t>Tình huống:</w:t>
-      </w:r>
-      <w:r>
-        <w:rPr>
-          <w:rFonts w:ascii="Times New Roman" w:hAnsi="Times New Roman"/>
-          <w:i w:val="0"/>
-          <w:color w:val="212121"/>
-          <w:sz w:val="26"/>
-        </w:rPr>
-        <w:t xml:space="preserve"> Một ấm đun nước bằng nhôm có khối lượng </w:t>
-      </w:r>
-      <w:r>
-        <w:rPr>
-          <w:rFonts w:ascii="Times New Roman" w:hAnsi="Times New Roman"/>
-          <w:i/>
-          <w:color w:val="212121"/>
-          <w:sz w:val="26"/>
-        </w:rPr>
-        <w:t>m_1 = 0,5 kg</w:t>
-      </w:r>
-      <w:r>
-        <w:rPr>
-          <w:rFonts w:ascii="Times New Roman" w:hAnsi="Times New Roman"/>
-          <w:i w:val="0"/>
-          <w:color w:val="212121"/>
-          <w:sz w:val="26"/>
-        </w:rPr>
-        <w:t xml:space="preserve"> chứa </w:t>
-      </w:r>
-      <w:r>
-        <w:rPr>
-          <w:rFonts w:ascii="Times New Roman" w:hAnsi="Times New Roman"/>
-          <w:i/>
-          <w:color w:val="212121"/>
-          <w:sz w:val="26"/>
-        </w:rPr>
-        <w:t>m_2 = 2 kg</w:t>
-      </w:r>
-      <w:r>
-        <w:rPr>
-          <w:rFonts w:ascii="Times New Roman" w:hAnsi="Times New Roman"/>
-          <w:i w:val="0"/>
-          <w:color w:val="212121"/>
-          <w:sz w:val="26"/>
-        </w:rPr>
-        <w:t xml:space="preserve"> nước ở nhiệt độ ban đầu </w:t>
-      </w:r>
-      <w:r>
-        <w:rPr>
-          <w:rFonts w:ascii="Times New Roman" w:hAnsi="Times New Roman"/>
-          <w:i/>
-          <w:color w:val="212121"/>
-          <w:sz w:val="26"/>
-        </w:rPr>
-        <w:t>t_1 = 20° C</w:t>
-      </w:r>
-      <w:r>
-        <w:rPr>
-          <w:rFonts w:ascii="Times New Roman" w:hAnsi="Times New Roman"/>
-          <w:i w:val="0"/>
-          <w:color w:val="212121"/>
-          <w:sz w:val="26"/>
-        </w:rPr>
-        <w:t>. Cần cung cấp một nhiệt lượng bao nhiêu để đun sôi lượng nước này (</w:t>
-      </w:r>
-      <w:r>
-        <w:rPr>
-          <w:rFonts w:ascii="Times New Roman" w:hAnsi="Times New Roman"/>
-          <w:i/>
-          <w:color w:val="212121"/>
-          <w:sz w:val="26"/>
-        </w:rPr>
-        <w:t>t_2 = 100° C</w:t>
-      </w:r>
-      <w:r>
-        <w:rPr>
-          <w:rFonts w:ascii="Times New Roman" w:hAnsi="Times New Roman"/>
-          <w:i w:val="0"/>
-          <w:color w:val="212121"/>
-          <w:sz w:val="26"/>
-        </w:rPr>
-        <w:t xml:space="preserve">). Biết nhiệt dung riêng của nhôm </w:t>
-      </w:r>
-      <w:r>
-        <w:rPr>
-          <w:rFonts w:ascii="Times New Roman" w:hAnsi="Times New Roman"/>
-          <w:i/>
-          <w:color w:val="212121"/>
-          <w:sz w:val="26"/>
-        </w:rPr>
-        <w:t>c_1 = 880 J/kg.K</w:t>
-      </w:r>
-      <w:r>
-        <w:rPr>
-          <w:rFonts w:ascii="Times New Roman" w:hAnsi="Times New Roman"/>
-          <w:i w:val="0"/>
-          <w:color w:val="212121"/>
-          <w:sz w:val="26"/>
-        </w:rPr>
-        <w:t xml:space="preserve"> và của nước </w:t>
-      </w:r>
-      <w:r>
-        <w:rPr>
-          <w:rFonts w:ascii="Times New Roman" w:hAnsi="Times New Roman"/>
-          <w:i/>
-          <w:color w:val="212121"/>
-          <w:sz w:val="26"/>
-        </w:rPr>
-        <w:t>c_2 = 4200 J/kg.K</w:t>
-      </w:r>
-      <w:r>
-        <w:rPr>
-          <w:rFonts w:ascii="Times New Roman" w:hAnsi="Times New Roman"/>
-          <w:i w:val="0"/>
-          <w:color w:val="212121"/>
-          <w:sz w:val="26"/>
-        </w:rPr>
-        <w:t>. Bỏ qua hao phí nhiệt ra môi trường.</w:t>
-      </w:r>
-    </w:p>
-    <w:p>
-      <w:pPr>
-        <w:spacing w:before="0" w:after="80" w:line="276" w:lineRule="auto"/>
-        <w:ind w:left="283" w:hanging="170"/>
-        <w:jc w:val="both"/>
-      </w:pPr>
-      <w:r>
-        <w:rPr>
-          <w:rFonts w:ascii="Times New Roman" w:hAnsi="Times New Roman"/>
-          <w:color w:val="212121"/>
-          <w:sz w:val="26"/>
-        </w:rPr>
-        <w:t xml:space="preserve">- </w:t>
-      </w:r>
-      <w:r>
-        <w:rPr>
-          <w:rFonts w:ascii="Times New Roman" w:hAnsi="Times New Roman"/>
-          <w:i w:val="0"/>
-          <w:color w:val="212121"/>
-          <w:sz w:val="26"/>
-        </w:rPr>
-        <w:t xml:space="preserve">  </w:t>
-      </w:r>
-      <w:r>
-        <w:rPr>
-          <w:rFonts w:ascii="Times New Roman" w:hAnsi="Times New Roman"/>
-          <w:b/>
-          <w:i w:val="0"/>
-          <w:color w:val="212121"/>
-          <w:sz w:val="26"/>
-        </w:rPr>
-        <w:t>Câu hỏi:</w:t>
-      </w:r>
-      <w:r>
-        <w:rPr>
-          <w:rFonts w:ascii="Times New Roman" w:hAnsi="Times New Roman"/>
-          <w:i w:val="0"/>
-          <w:color w:val="212121"/>
-          <w:sz w:val="26"/>
-        </w:rPr>
-        <w:t xml:space="preserve"> Tính tổng nhiệt lượng cần cung cấp cho ấm và nước. </w:t>
-      </w:r>
-      <w:r>
-        <w:rPr>
-          <w:rFonts w:ascii="Times New Roman" w:hAnsi="Times New Roman"/>
-          <w:color w:val="BFBFBF"/>
-          <w:sz w:val="22"/>
-        </w:rPr>
-        <w:t>..........................................................................................</w:t>
-      </w:r>
-      <w:r>
-        <w:rPr>
-          <w:rFonts w:ascii="Times New Roman" w:hAnsi="Times New Roman"/>
-          <w:i w:val="0"/>
-          <w:color w:val="212121"/>
-          <w:sz w:val="26"/>
-        </w:rPr>
-        <w:t xml:space="preserve"> </w:t>
-      </w:r>
-      <w:r>
-        <w:rPr>
-          <w:rFonts w:ascii="Times New Roman" w:hAnsi="Times New Roman"/>
-          <w:color w:val="BFBFBF"/>
-          <w:sz w:val="22"/>
-        </w:rPr>
-        <w:t>..........................................................................................</w:t>
-      </w:r>
-      <w:r>
-        <w:rPr>
-          <w:rFonts w:ascii="Times New Roman" w:hAnsi="Times New Roman"/>
-          <w:i w:val="0"/>
-          <w:color w:val="212121"/>
-          <w:sz w:val="26"/>
-        </w:rPr>
-        <w:t xml:space="preserve"> </w:t>
-      </w:r>
-      <w:r>
-        <w:rPr>
-          <w:rFonts w:ascii="Times New Roman" w:hAnsi="Times New Roman"/>
-          <w:color w:val="BFBFBF"/>
-          <w:sz w:val="22"/>
-        </w:rPr>
-        <w:t>..........................................................................................</w:t>
-      </w:r>
-    </w:p>
-    <w:p>
-      <w:pPr>
-        <w:spacing w:before="40" w:after="40"/>
-      </w:pPr>
-      <w:r>
-        <w:rPr>
-          <w:rFonts w:ascii="Times New Roman" w:hAnsi="Times New Roman"/>
-          <w:color w:val="BFBFBF"/>
-          <w:sz w:val="22"/>
-        </w:rPr>
-        <w:t>..........................................................................................</w:t>
-      </w:r>
-    </w:p>
-    <w:p>
-      <w:pPr>
-        <w:spacing w:before="160" w:after="80"/>
-      </w:pPr>
-      <w:r>
-        <w:rPr>
-          <w:rFonts w:ascii="Times New Roman" w:hAnsi="Times New Roman"/>
-          <w:b/>
-          <w:color w:val="595959"/>
+          <w:color w:val="000000"/>
           <w:sz w:val="26"/>
         </w:rPr>
         <w:t>4. Mở rộng (STEM Connection)</w:t>
@@ -2449,34 +1758,43 @@
     </w:p>
     <w:p>
       <w:pPr>
-        <w:spacing w:before="0" w:after="80" w:line="276" w:lineRule="auto"/>
-        <w:ind w:left="567"/>
+        <w:pStyle w:val="Heading3"/>
+        <w:keepNext/>
+        <w:spacing w:before="120" w:after="60"/>
+        <w:ind w:left="0" w:firstLine="0"/>
+      </w:pPr>
+      <w:r>
+        <w:rPr>
+          <w:rFonts w:ascii="Times New Roman" w:hAnsi="Times New Roman"/>
+          <w:b w:val="0"/>
+          <w:i/>
+          <w:color w:val="000000"/>
+          <w:sz w:val="26"/>
+        </w:rPr>
+        <w:t>Nhiệt dung riêng của nước và khí hậu:</w:t>
+      </w:r>
+    </w:p>
+    <w:p>
+      <w:pPr>
+        <w:spacing w:before="120" w:after="120" w:line="312" w:lineRule="auto"/>
+        <w:ind w:left="567" w:firstLine="0"/>
         <w:jc w:val="both"/>
       </w:pPr>
       <w:r>
         <w:rPr>
           <w:rFonts w:ascii="Times New Roman" w:hAnsi="Times New Roman"/>
-          <w:b/>
+          <w:b w:val="0"/>
           <w:i/>
-          <w:color w:val="212121"/>
+          <w:color w:val="000000"/>
           <w:sz w:val="26"/>
         </w:rPr>
-        <w:t>Nhiệt dung riêng của nước và khí hậu:</w:t>
+        <w:t>Nước có nhiệt dung riêng rất lớn (</w:t>
       </w:r>
       <w:r>
         <w:rPr>
           <w:rFonts w:ascii="Times New Roman" w:hAnsi="Times New Roman"/>
           <w:i/>
-          <w:color w:val="212121"/>
-          <w:sz w:val="26"/>
-        </w:rPr>
-        <w:t xml:space="preserve"> &gt; Nước có nhiệt dung riêng rất lớn (</w:t>
-      </w:r>
-      <w:r>
-        <w:rPr>
-          <w:rFonts w:ascii="Times New Roman" w:hAnsi="Times New Roman"/>
-          <w:i/>
-          <w:color w:val="212121"/>
+          <w:color w:val="000000"/>
           <w:sz w:val="26"/>
         </w:rPr>
         <w:t>4200 J/kg.K</w:t>
@@ -2484,103 +1802,544 @@
       <w:r>
         <w:rPr>
           <w:rFonts w:ascii="Times New Roman" w:hAnsi="Times New Roman"/>
+          <w:b w:val="0"/>
           <w:i/>
-          <w:color w:val="212121"/>
+          <w:color w:val="000000"/>
           <w:sz w:val="26"/>
         </w:rPr>
-        <w:t>) so với đất đá hay không khí. Điều này giải thích tại sao vùng ven biển có khí hậu điều hòa ôn hòa hơn sâu trong lục địa. Ban ngày dưới nắng gắt, nước biển hấp thụ nhiệt tăng nhiệt độ chậm; ban đêm khi trời lạnh, nước tỏa nhiệt giảm nhiệt độ từ từ. Sự chênh lệch nhiệt dung riêng này cũng tạo ra các luồng gió biển thổi luân phiên ngày và đêm. &gt; *(Nguồn: Khí tượng thủy văn đại cương - NXB Địa chất)*</w:t>
+        <w:t>) so với đất đá hay không khí. Điều này giải thích tại sao vùng ven biển có khí hậu điều hòa ôn hòa hơn sâu trong lục địa. Ban ngày dưới nắng gắt, nước biển hấp thụ nhiệt tăng nhiệt độ chậm; ban đêm khi trời lạnh, nước tỏa nhiệt giảm nhiệt độ từ từ. Sự chênh lệch nhiệt dung riêng này cũng tạo ra các luồng gió biển thổi luân phiên ngày và đêm.</w:t>
       </w:r>
     </w:p>
     <w:p>
       <w:pPr>
-        <w:spacing w:before="40" w:after="40"/>
-      </w:pPr>
-      <w:r>
-        <w:rPr>
-          <w:rFonts w:ascii="Times New Roman" w:hAnsi="Times New Roman"/>
-          <w:color w:val="BFBFBF"/>
-          <w:sz w:val="22"/>
-        </w:rPr>
-        <w:t>..........................................................................................</w:t>
-      </w:r>
-    </w:p>
-    <w:p>
-      <w:pPr>
-        <w:spacing w:before="40" w:after="40"/>
-      </w:pPr>
-      <w:r>
-        <w:rPr>
-          <w:rFonts w:ascii="Times New Roman" w:hAnsi="Times New Roman"/>
-          <w:color w:val="BFBFBF"/>
-          <w:sz w:val="22"/>
-        </w:rPr>
-        <w:t>..........................................................................................</w:t>
-      </w:r>
-    </w:p>
-    <w:p>
-      <w:pPr>
-        <w:spacing w:before="40" w:after="40"/>
-      </w:pPr>
-      <w:r>
-        <w:rPr>
-          <w:rFonts w:ascii="Times New Roman" w:hAnsi="Times New Roman"/>
-          <w:color w:val="BFBFBF"/>
-          <w:sz w:val="22"/>
-        </w:rPr>
-        <w:t>..........................................................................................</w:t>
-      </w:r>
-    </w:p>
-    <w:p>
-      <w:pPr>
-        <w:spacing w:before="40" w:after="40"/>
-      </w:pPr>
-      <w:r>
-        <w:rPr>
-          <w:rFonts w:ascii="Times New Roman" w:hAnsi="Times New Roman"/>
-          <w:color w:val="BFBFBF"/>
-          <w:sz w:val="22"/>
-        </w:rPr>
-        <w:t>..........................................................................................</w:t>
-      </w:r>
-    </w:p>
-    <w:p>
-      <w:pPr>
-        <w:spacing w:before="120" w:after="120"/>
-        <w:jc w:val="center"/>
-      </w:pPr>
-      <w:r>
-        <w:rPr>
-          <w:color w:val="BFBFBF"/>
-          <w:sz w:val="16"/>
-        </w:rPr>
-        <w:t>——————————————————————————————————————————————————————————————————————</w:t>
-      </w:r>
-    </w:p>
-    <w:p>
-      <w:pPr>
-        <w:spacing w:before="0" w:after="80" w:line="276" w:lineRule="auto"/>
-        <w:ind w:firstLine="567"/>
+        <w:spacing w:before="120" w:after="120" w:line="312" w:lineRule="auto"/>
+        <w:ind w:left="567" w:firstLine="0"/>
         <w:jc w:val="both"/>
       </w:pPr>
       <w:r>
         <w:rPr>
           <w:rFonts w:ascii="Times New Roman" w:hAnsi="Times New Roman"/>
           <w:b w:val="0"/>
+          <w:i/>
+          <w:color w:val="000000"/>
+          <w:sz w:val="26"/>
+        </w:rPr>
+        <w:t>*(Nguồn: Khí tượng thủy văn đại cương - NXB Địa chất)*</w:t>
+      </w:r>
+    </w:p>
+    <w:p>
+      <w:pPr>
+        <w:pStyle w:val="Heading1"/>
+        <w:keepNext/>
+        <w:spacing w:before="240" w:after="120"/>
+        <w:ind w:left="0" w:firstLine="0"/>
+      </w:pPr>
+      <w:r>
+        <w:rPr>
+          <w:rFonts w:ascii="Times New Roman" w:hAnsi="Times New Roman"/>
+          <w:b/>
           <w:i w:val="0"/>
-          <w:color w:val="212121"/>
+          <w:color w:val="1F4E79"/>
+          <w:sz w:val="28"/>
+        </w:rPr>
+        <w:t>III. TỰ ĐÁNH GIÁ KẾT QUẢ</w:t>
+      </w:r>
+    </w:p>
+    <w:tbl>
+      <w:tblPr>
+        <w:tblW w:type="auto" w:w="0"/>
+        <w:jc w:val="center"/>
+        <w:tblLayout w:type="fixed"/>
+        <w:tblLook w:firstColumn="1" w:firstRow="1" w:lastColumn="0" w:lastRow="0" w:noHBand="0" w:noVBand="1" w:val="04A0"/>
+        <w:tblW w:w="9639" w:type="dxa"/>
+      </w:tblPr>
+      <w:tblGrid>
+        <w:gridCol w:w="3213"/>
+        <w:gridCol w:w="3213"/>
+        <w:gridCol w:w="3213"/>
+      </w:tblGrid>
+      <w:tr>
+        <w:trPr>
+          <w:tblHeader/>
+        </w:trPr>
+        <w:tc>
+          <w:tcPr>
+            <w:tcW w:type="dxa" w:w="6803"/>
+            <w:shd w:fill="D9D9D9"/>
+            <w:tcMar>
+              <w:top w:w="114" w:type="dxa"/>
+              <w:bottom w:w="114" w:type="dxa"/>
+              <w:left w:w="170" w:type="dxa"/>
+              <w:right w:w="170" w:type="dxa"/>
+            </w:tcMar>
+            <w:tcBorders>
+              <w:top w:val="single" w:sz="4" w:space="0" w:color="BFBFBF"/>
+              <w:left w:val="single" w:sz="4" w:space="0" w:color="BFBFBF"/>
+              <w:bottom w:val="single" w:sz="4" w:space="0" w:color="BFBFBF"/>
+              <w:right w:val="single" w:sz="4" w:space="0" w:color="BFBFBF"/>
+            </w:tcBorders>
+          </w:tcPr>
+          <w:p>
+            <w:pPr>
+              <w:spacing w:before="40" w:after="40"/>
+              <w:jc w:val="center"/>
+            </w:pPr>
+            <w:r/>
+            <w:r>
+              <w:rPr>
+                <w:rFonts w:ascii="Times New Roman" w:hAnsi="Times New Roman"/>
+                <w:b/>
+                <w:color w:val="000000"/>
+                <w:sz w:val="24"/>
+              </w:rPr>
+              <w:t>Tiêu chí học tập</w:t>
+            </w:r>
+          </w:p>
+        </w:tc>
+        <w:tc>
+          <w:tcPr>
+            <w:tcW w:type="dxa" w:w="1417"/>
+            <w:shd w:fill="D9D9D9"/>
+            <w:tcMar>
+              <w:top w:w="114" w:type="dxa"/>
+              <w:bottom w:w="114" w:type="dxa"/>
+              <w:left w:w="170" w:type="dxa"/>
+              <w:right w:w="170" w:type="dxa"/>
+            </w:tcMar>
+            <w:tcBorders>
+              <w:top w:val="single" w:sz="4" w:space="0" w:color="BFBFBF"/>
+              <w:left w:val="single" w:sz="4" w:space="0" w:color="BFBFBF"/>
+              <w:bottom w:val="single" w:sz="4" w:space="0" w:color="BFBFBF"/>
+              <w:right w:val="single" w:sz="4" w:space="0" w:color="BFBFBF"/>
+            </w:tcBorders>
+          </w:tcPr>
+          <w:p>
+            <w:pPr>
+              <w:spacing w:before="40" w:after="40"/>
+              <w:jc w:val="center"/>
+            </w:pPr>
+            <w:r/>
+            <w:r>
+              <w:rPr>
+                <w:rFonts w:ascii="Times New Roman" w:hAnsi="Times New Roman"/>
+                <w:b/>
+                <w:color w:val="000000"/>
+                <w:sz w:val="24"/>
+              </w:rPr>
+              <w:t>Đạt</w:t>
+            </w:r>
+          </w:p>
+        </w:tc>
+        <w:tc>
+          <w:tcPr>
+            <w:tcW w:type="dxa" w:w="1417"/>
+            <w:shd w:fill="D9D9D9"/>
+            <w:tcMar>
+              <w:top w:w="114" w:type="dxa"/>
+              <w:bottom w:w="114" w:type="dxa"/>
+              <w:left w:w="170" w:type="dxa"/>
+              <w:right w:w="170" w:type="dxa"/>
+            </w:tcMar>
+            <w:tcBorders>
+              <w:top w:val="single" w:sz="4" w:space="0" w:color="BFBFBF"/>
+              <w:left w:val="single" w:sz="4" w:space="0" w:color="BFBFBF"/>
+              <w:bottom w:val="single" w:sz="4" w:space="0" w:color="BFBFBF"/>
+              <w:right w:val="single" w:sz="4" w:space="0" w:color="BFBFBF"/>
+            </w:tcBorders>
+          </w:tcPr>
+          <w:p>
+            <w:pPr>
+              <w:spacing w:before="40" w:after="40"/>
+              <w:jc w:val="center"/>
+            </w:pPr>
+            <w:r/>
+            <w:r>
+              <w:rPr>
+                <w:rFonts w:ascii="Times New Roman" w:hAnsi="Times New Roman"/>
+                <w:b/>
+                <w:color w:val="000000"/>
+                <w:sz w:val="24"/>
+              </w:rPr>
+              <w:t>Chưa Đạt</w:t>
+            </w:r>
+          </w:p>
+        </w:tc>
+      </w:tr>
+      <w:tr>
+        <w:trPr>
+          <w:cantSplit/>
+        </w:trPr>
+        <w:tc>
+          <w:tcPr>
+            <w:tcW w:type="dxa" w:w="6803"/>
+            <w:tcMar>
+              <w:top w:w="114" w:type="dxa"/>
+              <w:bottom w:w="114" w:type="dxa"/>
+              <w:left w:w="170" w:type="dxa"/>
+              <w:right w:w="170" w:type="dxa"/>
+            </w:tcMar>
+            <w:tcBorders>
+              <w:top w:val="single" w:sz="4" w:space="0" w:color="BFBFBF"/>
+              <w:left w:val="single" w:sz="4" w:space="0" w:color="BFBFBF"/>
+              <w:bottom w:val="single" w:sz="4" w:space="0" w:color="BFBFBF"/>
+              <w:right w:val="single" w:sz="4" w:space="0" w:color="BFBFBF"/>
+            </w:tcBorders>
+          </w:tcPr>
+          <w:p>
+            <w:pPr>
+              <w:spacing w:before="40" w:after="40" w:line="276" w:lineRule="auto"/>
+              <w:jc w:val="left"/>
+            </w:pPr>
+            <w:r/>
+            <w:r>
+              <w:rPr>
+                <w:rFonts w:ascii="Times New Roman" w:hAnsi="Times New Roman"/>
+                <w:color w:val="000000"/>
+                <w:sz w:val="22"/>
+              </w:rPr>
+              <w:t>1. Nhận biết và phát biểu được các khái niệm cốt lõi của bài học.</w:t>
+            </w:r>
+          </w:p>
+        </w:tc>
+        <w:tc>
+          <w:tcPr>
+            <w:tcW w:type="dxa" w:w="1417"/>
+            <w:tcMar>
+              <w:top w:w="114" w:type="dxa"/>
+              <w:bottom w:w="114" w:type="dxa"/>
+              <w:left w:w="170" w:type="dxa"/>
+              <w:right w:w="170" w:type="dxa"/>
+            </w:tcMar>
+            <w:tcBorders>
+              <w:top w:val="single" w:sz="4" w:space="0" w:color="BFBFBF"/>
+              <w:left w:val="single" w:sz="4" w:space="0" w:color="BFBFBF"/>
+              <w:bottom w:val="single" w:sz="4" w:space="0" w:color="BFBFBF"/>
+              <w:right w:val="single" w:sz="4" w:space="0" w:color="BFBFBF"/>
+            </w:tcBorders>
+          </w:tcPr>
+          <w:p>
+            <w:pPr>
+              <w:spacing w:before="40" w:after="40" w:line="276" w:lineRule="auto"/>
+              <w:jc w:val="left"/>
+            </w:pPr>
+            <w:r/>
+            <w:r>
+              <w:rPr>
+                <w:rFonts w:ascii="Times New Roman" w:hAnsi="Times New Roman"/>
+                <w:color w:val="000000"/>
+                <w:sz w:val="22"/>
+              </w:rPr>
+              <w:t>[  ]</w:t>
+            </w:r>
+          </w:p>
+        </w:tc>
+        <w:tc>
+          <w:tcPr>
+            <w:tcW w:type="dxa" w:w="1417"/>
+            <w:tcMar>
+              <w:top w:w="114" w:type="dxa"/>
+              <w:bottom w:w="114" w:type="dxa"/>
+              <w:left w:w="170" w:type="dxa"/>
+              <w:right w:w="170" w:type="dxa"/>
+            </w:tcMar>
+            <w:tcBorders>
+              <w:top w:val="single" w:sz="4" w:space="0" w:color="BFBFBF"/>
+              <w:left w:val="single" w:sz="4" w:space="0" w:color="BFBFBF"/>
+              <w:bottom w:val="single" w:sz="4" w:space="0" w:color="BFBFBF"/>
+              <w:right w:val="single" w:sz="4" w:space="0" w:color="BFBFBF"/>
+            </w:tcBorders>
+          </w:tcPr>
+          <w:p>
+            <w:pPr>
+              <w:spacing w:before="40" w:after="40" w:line="276" w:lineRule="auto"/>
+              <w:jc w:val="left"/>
+            </w:pPr>
+            <w:r/>
+            <w:r>
+              <w:rPr>
+                <w:rFonts w:ascii="Times New Roman" w:hAnsi="Times New Roman"/>
+                <w:color w:val="000000"/>
+                <w:sz w:val="22"/>
+              </w:rPr>
+              <w:t>[  ]</w:t>
+            </w:r>
+          </w:p>
+        </w:tc>
+      </w:tr>
+      <w:tr>
+        <w:trPr>
+          <w:cantSplit/>
+        </w:trPr>
+        <w:tc>
+          <w:tcPr>
+            <w:tcW w:type="dxa" w:w="6803"/>
+            <w:tcMar>
+              <w:top w:w="114" w:type="dxa"/>
+              <w:bottom w:w="114" w:type="dxa"/>
+              <w:left w:w="170" w:type="dxa"/>
+              <w:right w:w="170" w:type="dxa"/>
+            </w:tcMar>
+            <w:tcBorders>
+              <w:top w:val="single" w:sz="4" w:space="0" w:color="BFBFBF"/>
+              <w:left w:val="single" w:sz="4" w:space="0" w:color="BFBFBF"/>
+              <w:bottom w:val="single" w:sz="4" w:space="0" w:color="BFBFBF"/>
+              <w:right w:val="single" w:sz="4" w:space="0" w:color="BFBFBF"/>
+            </w:tcBorders>
+          </w:tcPr>
+          <w:p>
+            <w:pPr>
+              <w:spacing w:before="40" w:after="40" w:line="276" w:lineRule="auto"/>
+              <w:jc w:val="left"/>
+            </w:pPr>
+            <w:r/>
+            <w:r>
+              <w:rPr>
+                <w:rFonts w:ascii="Times New Roman" w:hAnsi="Times New Roman"/>
+                <w:color w:val="000000"/>
+                <w:sz w:val="22"/>
+              </w:rPr>
+              <w:t>2. Áp dụng đúng công thức tính toán và giải quyết bài tập vận dụng thực tế.</w:t>
+            </w:r>
+          </w:p>
+        </w:tc>
+        <w:tc>
+          <w:tcPr>
+            <w:tcW w:type="dxa" w:w="1417"/>
+            <w:tcMar>
+              <w:top w:w="114" w:type="dxa"/>
+              <w:bottom w:w="114" w:type="dxa"/>
+              <w:left w:w="170" w:type="dxa"/>
+              <w:right w:w="170" w:type="dxa"/>
+            </w:tcMar>
+            <w:tcBorders>
+              <w:top w:val="single" w:sz="4" w:space="0" w:color="BFBFBF"/>
+              <w:left w:val="single" w:sz="4" w:space="0" w:color="BFBFBF"/>
+              <w:bottom w:val="single" w:sz="4" w:space="0" w:color="BFBFBF"/>
+              <w:right w:val="single" w:sz="4" w:space="0" w:color="BFBFBF"/>
+            </w:tcBorders>
+          </w:tcPr>
+          <w:p>
+            <w:pPr>
+              <w:spacing w:before="40" w:after="40" w:line="276" w:lineRule="auto"/>
+              <w:jc w:val="left"/>
+            </w:pPr>
+            <w:r/>
+            <w:r>
+              <w:rPr>
+                <w:rFonts w:ascii="Times New Roman" w:hAnsi="Times New Roman"/>
+                <w:color w:val="000000"/>
+                <w:sz w:val="22"/>
+              </w:rPr>
+              <w:t>[  ]</w:t>
+            </w:r>
+          </w:p>
+        </w:tc>
+        <w:tc>
+          <w:tcPr>
+            <w:tcW w:type="dxa" w:w="1417"/>
+            <w:tcMar>
+              <w:top w:w="114" w:type="dxa"/>
+              <w:bottom w:w="114" w:type="dxa"/>
+              <w:left w:w="170" w:type="dxa"/>
+              <w:right w:w="170" w:type="dxa"/>
+            </w:tcMar>
+            <w:tcBorders>
+              <w:top w:val="single" w:sz="4" w:space="0" w:color="BFBFBF"/>
+              <w:left w:val="single" w:sz="4" w:space="0" w:color="BFBFBF"/>
+              <w:bottom w:val="single" w:sz="4" w:space="0" w:color="BFBFBF"/>
+              <w:right w:val="single" w:sz="4" w:space="0" w:color="BFBFBF"/>
+            </w:tcBorders>
+          </w:tcPr>
+          <w:p>
+            <w:pPr>
+              <w:spacing w:before="40" w:after="40" w:line="276" w:lineRule="auto"/>
+              <w:jc w:val="left"/>
+            </w:pPr>
+            <w:r/>
+            <w:r>
+              <w:rPr>
+                <w:rFonts w:ascii="Times New Roman" w:hAnsi="Times New Roman"/>
+                <w:color w:val="000000"/>
+                <w:sz w:val="22"/>
+              </w:rPr>
+              <w:t>[  ]</w:t>
+            </w:r>
+          </w:p>
+        </w:tc>
+      </w:tr>
+      <w:tr>
+        <w:trPr>
+          <w:cantSplit/>
+        </w:trPr>
+        <w:tc>
+          <w:tcPr>
+            <w:tcW w:type="dxa" w:w="6803"/>
+            <w:tcMar>
+              <w:top w:w="114" w:type="dxa"/>
+              <w:bottom w:w="114" w:type="dxa"/>
+              <w:left w:w="170" w:type="dxa"/>
+              <w:right w:w="170" w:type="dxa"/>
+            </w:tcMar>
+            <w:tcBorders>
+              <w:top w:val="single" w:sz="4" w:space="0" w:color="BFBFBF"/>
+              <w:left w:val="single" w:sz="4" w:space="0" w:color="BFBFBF"/>
+              <w:bottom w:val="single" w:sz="4" w:space="0" w:color="BFBFBF"/>
+              <w:right w:val="single" w:sz="4" w:space="0" w:color="BFBFBF"/>
+            </w:tcBorders>
+          </w:tcPr>
+          <w:p>
+            <w:pPr>
+              <w:spacing w:before="40" w:after="40" w:line="276" w:lineRule="auto"/>
+              <w:jc w:val="left"/>
+            </w:pPr>
+            <w:r/>
+            <w:r>
+              <w:rPr>
+                <w:rFonts w:ascii="Times New Roman" w:hAnsi="Times New Roman"/>
+                <w:color w:val="000000"/>
+                <w:sz w:val="22"/>
+              </w:rPr>
+              <w:t>3. Tích cực thảo luận, hoàn thành đầy đủ nhiệm vụ học tập nhóm/cá nhân.</w:t>
+            </w:r>
+          </w:p>
+        </w:tc>
+        <w:tc>
+          <w:tcPr>
+            <w:tcW w:type="dxa" w:w="1417"/>
+            <w:tcMar>
+              <w:top w:w="114" w:type="dxa"/>
+              <w:bottom w:w="114" w:type="dxa"/>
+              <w:left w:w="170" w:type="dxa"/>
+              <w:right w:w="170" w:type="dxa"/>
+            </w:tcMar>
+            <w:tcBorders>
+              <w:top w:val="single" w:sz="4" w:space="0" w:color="BFBFBF"/>
+              <w:left w:val="single" w:sz="4" w:space="0" w:color="BFBFBF"/>
+              <w:bottom w:val="single" w:sz="4" w:space="0" w:color="BFBFBF"/>
+              <w:right w:val="single" w:sz="4" w:space="0" w:color="BFBFBF"/>
+            </w:tcBorders>
+          </w:tcPr>
+          <w:p>
+            <w:pPr>
+              <w:spacing w:before="40" w:after="40" w:line="276" w:lineRule="auto"/>
+              <w:jc w:val="left"/>
+            </w:pPr>
+            <w:r/>
+            <w:r>
+              <w:rPr>
+                <w:rFonts w:ascii="Times New Roman" w:hAnsi="Times New Roman"/>
+                <w:color w:val="000000"/>
+                <w:sz w:val="22"/>
+              </w:rPr>
+              <w:t>[  ]</w:t>
+            </w:r>
+          </w:p>
+        </w:tc>
+        <w:tc>
+          <w:tcPr>
+            <w:tcW w:type="dxa" w:w="1417"/>
+            <w:tcMar>
+              <w:top w:w="114" w:type="dxa"/>
+              <w:bottom w:w="114" w:type="dxa"/>
+              <w:left w:w="170" w:type="dxa"/>
+              <w:right w:w="170" w:type="dxa"/>
+            </w:tcMar>
+            <w:tcBorders>
+              <w:top w:val="single" w:sz="4" w:space="0" w:color="BFBFBF"/>
+              <w:left w:val="single" w:sz="4" w:space="0" w:color="BFBFBF"/>
+              <w:bottom w:val="single" w:sz="4" w:space="0" w:color="BFBFBF"/>
+              <w:right w:val="single" w:sz="4" w:space="0" w:color="BFBFBF"/>
+            </w:tcBorders>
+          </w:tcPr>
+          <w:p>
+            <w:pPr>
+              <w:spacing w:before="40" w:after="40" w:line="276" w:lineRule="auto"/>
+              <w:jc w:val="left"/>
+            </w:pPr>
+            <w:r/>
+            <w:r>
+              <w:rPr>
+                <w:rFonts w:ascii="Times New Roman" w:hAnsi="Times New Roman"/>
+                <w:color w:val="000000"/>
+                <w:sz w:val="22"/>
+              </w:rPr>
+              <w:t>[  ]</w:t>
+            </w:r>
+          </w:p>
+        </w:tc>
+      </w:tr>
+    </w:tbl>
+    <w:p/>
+    <w:p>
+      <w:pPr>
+        <w:spacing w:before="240"/>
+        <w:ind w:right="567"/>
+        <w:jc w:val="right"/>
+      </w:pPr>
+      <w:r>
+        <w:rPr>
+          <w:rFonts w:ascii="Times New Roman" w:hAnsi="Times New Roman"/>
+          <w:i/>
+          <w:color w:val="000000"/>
           <w:sz w:val="22"/>
         </w:rPr>
-        <w:t>— Chúc em học tốt! —</w:t>
+        <w:t>Ngày ........ tháng ........ năm 202...</w:t>
+        <w:br/>
+      </w:r>
+      <w:r>
+        <w:rPr>
+          <w:rFonts w:ascii="Times New Roman" w:hAnsi="Times New Roman"/>
+          <w:b/>
+          <w:color w:val="000000"/>
+          <w:sz w:val="22"/>
+        </w:rPr>
+        <w:t>Học sinh ký tên</w:t>
+        <w:br/>
+        <w:br/>
+        <w:br/>
+        <w:t>..........................................</w:t>
       </w:r>
     </w:p>
     <w:sectPr>
+      <w:footerReference w:type="default" r:id="rId9"/>
       <w:pgSz w:w="11906" w:h="16838"/>
-      <w:pgMar w:top="1134" w:right="850" w:bottom="1134" w:left="1701" w:header="720" w:footer="720" w:gutter="0"/>
+      <w:pgMar w:top="1134" w:right="1134" w:bottom="1134" w:left="1134" w:header="720" w:footer="720" w:gutter="0"/>
       <w:cols w:space="720"/>
       <w:docGrid w:linePitch="360"/>
     </w:sectPr>
   </w:body>
 </w:document>
+</file>
+
+<file path=word/footer1.xml><?xml version="1.0" encoding="utf-8"?>
+<w:ftr xmlns:m="http://schemas.openxmlformats.org/officeDocument/2006/math" xmlns:mc="http://schemas.openxmlformats.org/markup-compatibility/2006" xmlns:mo="http://schemas.microsoft.com/office/mac/office/2008/main" xmlns:mv="urn:schemas-microsoft-com:mac:vml" xmlns:o="urn:schemas-microsoft-com:office:office" xmlns:r="http://schemas.openxmlformats.org/officeDocument/2006/relationships" xmlns:v="urn:schemas-microsoft-com:vml" xmlns:w10="urn:schemas-microsoft-com:office:word" xmlns:w14="http://schemas.microsoft.com/office/word/2010/wordml" xmlns:w="http://schemas.openxmlformats.org/wordprocessingml/2006/main" xmlns:wne="http://schemas.microsoft.com/office/word/2006/wordml" xmlns:wp14="http://schemas.microsoft.com/office/word/2010/wordprocessingDrawing" xmlns:wp="http://schemas.openxmlformats.org/drawingml/2006/wordprocessingDrawing" xmlns:wpc="http://schemas.microsoft.com/office/word/2010/wordprocessingCanvas" xmlns:wpg="http://schemas.microsoft.com/office/word/2010/wordprocessingGroup" xmlns:wpi="http://schemas.microsoft.com/office/word/2010/wordprocessingInk" xmlns:wps="http://schemas.microsoft.com/office/word/2010/wordprocessingShape" mc:Ignorable="w14 wp14">
+  <w:p>
+    <w:pPr>
+      <w:pStyle w:val="Footer"/>
+      <w:spacing w:before="80" w:after="80"/>
+      <w:jc w:val="center"/>
+    </w:pPr>
+    <w:r/>
+    <w:r>
+      <w:rPr>
+        <w:rFonts w:ascii="Times New Roman" w:hAnsi="Times New Roman"/>
+        <w:color w:val="666666"/>
+        <w:sz w:val="18"/>
+      </w:rPr>
+      <w:t xml:space="preserve">Trang </w:t>
+    </w:r>
+    <w:fldSimple w:instr="PAGE"/>
+    <w:r>
+      <w:rPr>
+        <w:rFonts w:ascii="Times New Roman" w:hAnsi="Times New Roman"/>
+        <w:color w:val="666666"/>
+        <w:sz w:val="18"/>
+      </w:rPr>
+      <w:t>/</w:t>
+    </w:r>
+    <w:fldSimple w:instr="NUMPAGES"/>
+  </w:p>
+</w:ftr>
 </file>
 
 <file path=word/numbering.xml><?xml version="1.0" encoding="utf-8"?>
@@ -2947,12 +2706,12 @@
     <w:qFormat/>
     <w:rsid w:val="00FC693F"/>
     <w:pPr>
-      <w:spacing w:before="0" w:after="80" w:line="276" w:lineRule="auto"/>
+      <w:spacing w:before="120" w:after="120" w:line="312" w:lineRule="auto"/>
       <w:jc w:val="both"/>
     </w:pPr>
     <w:rPr>
       <w:rFonts w:ascii="Times New Roman" w:hAnsi="Times New Roman"/>
-      <w:color w:val="212121"/>
+      <w:color w:val="000000"/>
       <w:sz w:val="26"/>
     </w:rPr>
   </w:style>

</xml_diff>

<commit_message>
Synchronize worksheet (PHT) and lesson plan (KHBD) into 5 corresponding knowledge units
</commit_message>
<xml_diff>
--- a/agent soạn tài liệu/output/bai3_noi_nang_nhiet_luong/ready/bai3_noi_nang_nhiet_luong_phieu_hoc_tap.docx
+++ b/agent soạn tài liệu/output/bai3_noi_nang_nhiet_luong/ready/bai3_noi_nang_nhiet_luong_phieu_hoc_tap.docx
@@ -283,7 +283,7 @@
           <w:color w:val="1F4E79"/>
           <w:sz w:val="28"/>
         </w:rPr>
-        <w:t>📍 ĐVKT 1: NỘI NĂNG VÀ NGUYÊN LÍ I NHIỆT ĐỘNG LỰC HỌC</w:t>
+        <w:t>📍 ĐVKT 1: KHÁI NIỆM NỘI NĂNG CỦA VẬT</w:t>
       </w:r>
     </w:p>
     <w:p>
@@ -301,124 +301,7 @@
           <w:color w:val="000000"/>
           <w:sz w:val="26"/>
         </w:rPr>
-        <w:t>1. Khám phá (Nhiệm vụ 1: Biến đổi nội năng)</w:t>
-      </w:r>
-    </w:p>
-    <w:p>
-      <w:pPr>
-        <w:spacing w:before="120" w:after="120" w:line="312" w:lineRule="auto"/>
-        <w:ind w:left="0" w:firstLine="567"/>
-        <w:jc w:val="both"/>
-      </w:pPr>
-      <w:r>
-        <w:rPr>
-          <w:rFonts w:ascii="Times New Roman" w:hAnsi="Times New Roman"/>
-          <w:b/>
-          <w:i w:val="0"/>
-          <w:color w:val="000000"/>
-          <w:sz w:val="26"/>
-        </w:rPr>
-        <w:t>Tình huống:</w:t>
-      </w:r>
-      <w:r>
-        <w:rPr>
-          <w:rFonts w:ascii="Times New Roman" w:hAnsi="Times New Roman"/>
-          <w:b w:val="0"/>
-          <w:i w:val="0"/>
-          <w:color w:val="000000"/>
-          <w:sz w:val="26"/>
-        </w:rPr>
-        <w:t xml:space="preserve"> Một ống nghiệm chứa một ít ete được đậy kín bằng nút cao su. GV tiến hành cọ xát mạnh miếng kim loại vào thành ống nghiệm hoặc đun nóng nhẹ đáy ống nghiệm. Sau một thời gian, nút cao su bị đẩy bật ra kèm theo một làn sương mù nhẹ xuất hiện trong ống.</w:t>
-      </w:r>
-    </w:p>
-    <w:p>
-      <w:pPr>
-        <w:spacing w:before="60" w:after="60" w:line="312" w:lineRule="auto"/>
-        <w:ind w:left="283" w:hanging="170"/>
-        <w:jc w:val="both"/>
-      </w:pPr>
-      <w:r>
-        <w:rPr>
-          <w:rFonts w:ascii="Times New Roman" w:hAnsi="Times New Roman"/>
-          <w:color w:val="000000"/>
-          <w:sz w:val="26"/>
-        </w:rPr>
-        <w:t xml:space="preserve">- </w:t>
-      </w:r>
-      <w:r>
-        <w:rPr>
-          <w:rFonts w:ascii="Times New Roman" w:hAnsi="Times New Roman"/>
-          <w:b w:val="0"/>
-          <w:i w:val="0"/>
-          <w:color w:val="000000"/>
-          <w:sz w:val="26"/>
-        </w:rPr>
-        <w:t xml:space="preserve">  </w:t>
-      </w:r>
-      <w:r>
-        <w:rPr>
-          <w:rFonts w:ascii="Times New Roman" w:hAnsi="Times New Roman"/>
-          <w:b/>
-          <w:i w:val="0"/>
-          <w:color w:val="000000"/>
-          <w:sz w:val="26"/>
-        </w:rPr>
-        <w:t>Mệnh đề (Assertion):</w:t>
-      </w:r>
-      <w:r>
-        <w:rPr>
-          <w:rFonts w:ascii="Times New Roman" w:hAnsi="Times New Roman"/>
-          <w:b w:val="0"/>
-          <w:i w:val="0"/>
-          <w:color w:val="000000"/>
-          <w:sz w:val="26"/>
-        </w:rPr>
-        <w:t xml:space="preserve"> Việc cọ xát hoặc đun nóng đều làm tăng nội năng của hơi ete trong ống nghiệm, dẫn đến áp suất tăng và đẩy nút bật ra.</w:t>
-      </w:r>
-    </w:p>
-    <w:p>
-      <w:pPr>
-        <w:spacing w:before="60" w:after="60" w:line="312" w:lineRule="auto"/>
-        <w:ind w:left="283" w:hanging="170"/>
-        <w:jc w:val="both"/>
-      </w:pPr>
-      <w:r>
-        <w:rPr>
-          <w:rFonts w:ascii="Times New Roman" w:hAnsi="Times New Roman"/>
-          <w:color w:val="000000"/>
-          <w:sz w:val="26"/>
-        </w:rPr>
-        <w:t xml:space="preserve">- </w:t>
-      </w:r>
-      <w:r>
-        <w:rPr>
-          <w:rFonts w:ascii="Times New Roman" w:hAnsi="Times New Roman"/>
-          <w:b w:val="0"/>
-          <w:i w:val="0"/>
-          <w:color w:val="000000"/>
-          <w:sz w:val="26"/>
-        </w:rPr>
-        <w:t xml:space="preserve">  </w:t>
-      </w:r>
-      <w:r>
-        <w:rPr>
-          <w:rFonts w:ascii="Times New Roman" w:hAnsi="Times New Roman"/>
-          <w:b/>
-          <w:i w:val="0"/>
-          <w:color w:val="000000"/>
-          <w:sz w:val="26"/>
-        </w:rPr>
-        <w:t>Lý do (Reasoning):</w:t>
-      </w:r>
-      <w:r>
-        <w:rPr>
-          <w:rFonts w:ascii="Times New Roman" w:hAnsi="Times New Roman"/>
-          <w:b w:val="0"/>
-          <w:i w:val="0"/>
-          <w:color w:val="000000"/>
-          <w:sz w:val="26"/>
-        </w:rPr>
-        <w:t xml:space="preserve"> Sự xuất hiện của làn sương mù chứng tỏ nhiệt độ của hơi ete tăng lên đột ngột ngay khi nút bật ra.</w:t>
+        <w:t>1. Khám phá (Nhiệm vụ 1: Năng lượng vi mô phân tử)</w:t>
       </w:r>
     </w:p>
     <w:p>
@@ -463,22 +346,7 @@
           <w:color w:val="000000"/>
           <w:sz w:val="26"/>
         </w:rPr>
-        <w:t xml:space="preserve"> Em hãy nhận xét tính đúng/sai của mệnh đề và lý do trên, đồng thời giải thích quá trình chuyển hóa năng lượng trong hai trường hợp trên dựa vào Nguyên lí I.</w:t>
-      </w:r>
-    </w:p>
-    <w:p>
-      <w:pPr>
-        <w:spacing w:before="40" w:after="40"/>
-        <w:ind w:left="567"/>
-        <w:jc w:val="left"/>
-      </w:pPr>
-      <w:r>
-        <w:rPr>
-          <w:rFonts w:ascii="Times New Roman" w:hAnsi="Times New Roman"/>
-          <w:color w:val="666666"/>
-          <w:sz w:val="22"/>
-        </w:rPr>
-        <w:t>..........................................................................................</w:t>
+        <w:t xml:space="preserve"> Các phân tử cấu tạo nên vật chuyển động không ngừng và có lực liên kết phân tử. Vậy chúng sở hữu những dạng năng lượng nào ở cấp độ vi mô? Tổng các năng lượng này được gọi là gì?</w:t>
       </w:r>
     </w:p>
     <w:p>
@@ -526,7 +394,7 @@
           <w:color w:val="000000"/>
           <w:sz w:val="26"/>
         </w:rPr>
-        <w:t>2. Trọng tâm (Nội dung nội năng &amp; Nguyên lí I)</w:t>
+        <w:t>2. Trọng tâm (Khái niệm nội năng)</w:t>
       </w:r>
     </w:p>
     <w:p>
@@ -570,7 +438,26 @@
           <w:color w:val="000000"/>
           <w:sz w:val="26"/>
         </w:rPr>
-        <w:t>) của một vật là tổng (1) .................... của chuyển động nhiệt phân tử và (2) .................... phân tử cấu tạo nên vật.</w:t>
+        <w:t>) của một vật là tổng (1) .................... của chuyển động nhiệt phân tử và (2) .................... phân tử cấu tạo nên vật: ==</w:t>
+      </w:r>
+      <w:r>
+        <w:rPr>
+          <w:rFonts w:ascii="Times New Roman" w:hAnsi="Times New Roman"/>
+          <w:i/>
+          <w:color w:val="000000"/>
+          <w:sz w:val="26"/>
+        </w:rPr>
+        <w:t>U = E_đ + E_t</w:t>
+      </w:r>
+      <w:r>
+        <w:rPr>
+          <w:rFonts w:ascii="Times New Roman" w:hAnsi="Times New Roman"/>
+          <w:b w:val="0"/>
+          <w:i w:val="0"/>
+          <w:color w:val="000000"/>
+          <w:sz w:val="26"/>
+        </w:rPr>
+        <w:t>==.</w:t>
       </w:r>
     </w:p>
     <w:p>
@@ -620,76 +507,7 @@
           <w:color w:val="000000"/>
           <w:sz w:val="26"/>
         </w:rPr>
-        <w:t xml:space="preserve">  Có hai cách làm thay đổi nội năng là (5) .................... và (6) ....................</w:t>
-      </w:r>
-    </w:p>
-    <w:p>
-      <w:pPr>
-        <w:spacing w:before="60" w:after="60" w:line="312" w:lineRule="auto"/>
-        <w:ind w:left="283" w:hanging="170"/>
-        <w:jc w:val="both"/>
-      </w:pPr>
-      <w:r>
-        <w:rPr>
-          <w:rFonts w:ascii="Times New Roman" w:hAnsi="Times New Roman"/>
-          <w:color w:val="000000"/>
-          <w:sz w:val="26"/>
-        </w:rPr>
-        <w:t xml:space="preserve">- </w:t>
-      </w:r>
-      <w:r>
-        <w:rPr>
-          <w:rFonts w:ascii="Times New Roman" w:hAnsi="Times New Roman"/>
-          <w:b w:val="0"/>
-          <w:i w:val="0"/>
-          <w:color w:val="000000"/>
-          <w:sz w:val="26"/>
-        </w:rPr>
-        <w:t xml:space="preserve">  Nguyên lí I Nhiệt động lực học: Độ biến thiên nội năng của vật bằng tổng công và nhiệt lượng mà vật nhận được: ==</w:t>
-      </w:r>
-      <w:r>
-        <w:rPr>
-          <w:rFonts w:ascii="Times New Roman" w:hAnsi="Times New Roman"/>
-          <w:i/>
-          <w:color w:val="000000"/>
-          <w:sz w:val="26"/>
-        </w:rPr>
-        <w:t>Δ U = A + Q</w:t>
-      </w:r>
-      <w:r>
-        <w:rPr>
-          <w:rFonts w:ascii="Times New Roman" w:hAnsi="Times New Roman"/>
-          <w:b w:val="0"/>
-          <w:i w:val="0"/>
-          <w:color w:val="000000"/>
-          <w:sz w:val="26"/>
-        </w:rPr>
-        <w:t>==.</w:t>
-      </w:r>
-    </w:p>
-    <w:p>
-      <w:pPr>
-        <w:spacing w:before="60" w:after="60" w:line="312" w:lineRule="auto"/>
-        <w:ind w:left="283" w:hanging="170"/>
-        <w:jc w:val="both"/>
-      </w:pPr>
-      <w:r>
-        <w:rPr>
-          <w:rFonts w:ascii="Times New Roman" w:hAnsi="Times New Roman"/>
-          <w:color w:val="000000"/>
-          <w:sz w:val="26"/>
-        </w:rPr>
-        <w:t xml:space="preserve">- </w:t>
-      </w:r>
-      <w:r>
-        <w:rPr>
-          <w:rFonts w:ascii="Times New Roman" w:hAnsi="Times New Roman"/>
-          <w:b w:val="0"/>
-          <w:i w:val="0"/>
-          <w:color w:val="000000"/>
-          <w:sz w:val="26"/>
-        </w:rPr>
-        <w:t xml:space="preserve">  *Gợi ý từ khóa:* thực hiện công, thế năng tương tác, thể tích, nhiệt độ, truyền nhiệt, động năng.</w:t>
+        <w:t xml:space="preserve">  *Gợi ý từ khóa:* động năng, thế năng tương tác, nhiệt độ, thể tích.</w:t>
       </w:r>
     </w:p>
     <w:p>
@@ -707,72 +525,7 @@
           <w:color w:val="000000"/>
           <w:sz w:val="26"/>
         </w:rPr>
-        <w:t>3. Vận dụng (Nhiệm vụ 2: Chu trình khí trong xilanh)</w:t>
-      </w:r>
-    </w:p>
-    <w:p>
-      <w:pPr>
-        <w:spacing w:before="120" w:after="120" w:line="312" w:lineRule="auto"/>
-        <w:ind w:left="0" w:firstLine="567"/>
-        <w:jc w:val="both"/>
-      </w:pPr>
-      <w:r>
-        <w:rPr>
-          <w:rFonts w:ascii="Times New Roman" w:hAnsi="Times New Roman"/>
-          <w:b/>
-          <w:i w:val="0"/>
-          <w:color w:val="000000"/>
-          <w:sz w:val="26"/>
-        </w:rPr>
-        <w:t>Tình huống:</w:t>
-      </w:r>
-      <w:r>
-        <w:rPr>
-          <w:rFonts w:ascii="Times New Roman" w:hAnsi="Times New Roman"/>
-          <w:b w:val="0"/>
-          <w:i w:val="0"/>
-          <w:color w:val="000000"/>
-          <w:sz w:val="26"/>
-        </w:rPr>
-        <w:t xml:space="preserve"> Một lượng khí lí tưởng trong xilanh nhận một nhiệt lượng </w:t>
-      </w:r>
-      <w:r>
-        <w:rPr>
-          <w:rFonts w:ascii="Times New Roman" w:hAnsi="Times New Roman"/>
-          <w:i/>
-          <w:color w:val="000000"/>
-          <w:sz w:val="26"/>
-        </w:rPr>
-        <w:t>Q = 200 J</w:t>
-      </w:r>
-      <w:r>
-        <w:rPr>
-          <w:rFonts w:ascii="Times New Roman" w:hAnsi="Times New Roman"/>
-          <w:b w:val="0"/>
-          <w:i w:val="0"/>
-          <w:color w:val="000000"/>
-          <w:sz w:val="26"/>
-        </w:rPr>
-        <w:t xml:space="preserve"> từ nguồn nhiệt bên ngoài, đồng thời khí giãn nở đẩy pit-tông thực hiện một công </w:t>
-      </w:r>
-      <w:r>
-        <w:rPr>
-          <w:rFonts w:ascii="Times New Roman" w:hAnsi="Times New Roman"/>
-          <w:i/>
-          <w:color w:val="000000"/>
-          <w:sz w:val="26"/>
-        </w:rPr>
-        <w:t>A' = 120 J</w:t>
-      </w:r>
-      <w:r>
-        <w:rPr>
-          <w:rFonts w:ascii="Times New Roman" w:hAnsi="Times New Roman"/>
-          <w:b w:val="0"/>
-          <w:i w:val="0"/>
-          <w:color w:val="000000"/>
-          <w:sz w:val="26"/>
-        </w:rPr>
-        <w:t xml:space="preserve"> đẩy ra môi trường.</w:t>
+        <w:t>3. Vận dụng (Nhiệt độ và nội năng)</w:t>
       </w:r>
     </w:p>
     <w:p>
@@ -817,7 +570,996 @@
           <w:color w:val="000000"/>
           <w:sz w:val="26"/>
         </w:rPr>
-        <w:t xml:space="preserve"> Hãy tính độ biến thiên nội năng (</w:t>
+        <w:t xml:space="preserve"> Khi ta tăng nhiệt độ của một lượng khí lí tưởng đựng trong một bình kín (thể tích không đổi), nội năng của khí thay đổi như thế nào? Giải thích dựa trên động lực học phân tử.</w:t>
+      </w:r>
+    </w:p>
+    <w:p>
+      <w:pPr>
+        <w:spacing w:before="40" w:after="40"/>
+        <w:ind w:left="567"/>
+        <w:jc w:val="left"/>
+      </w:pPr>
+      <w:r>
+        <w:rPr>
+          <w:rFonts w:ascii="Times New Roman" w:hAnsi="Times New Roman"/>
+          <w:color w:val="666666"/>
+          <w:sz w:val="22"/>
+        </w:rPr>
+        <w:t>..........................................................................................</w:t>
+      </w:r>
+    </w:p>
+    <w:p>
+      <w:pPr>
+        <w:spacing w:before="40" w:after="40"/>
+        <w:ind w:left="567"/>
+        <w:jc w:val="left"/>
+      </w:pPr>
+      <w:r>
+        <w:rPr>
+          <w:rFonts w:ascii="Times New Roman" w:hAnsi="Times New Roman"/>
+          <w:color w:val="666666"/>
+          <w:sz w:val="22"/>
+        </w:rPr>
+        <w:t>..........................................................................................</w:t>
+      </w:r>
+    </w:p>
+    <w:p>
+      <w:pPr>
+        <w:spacing w:before="120" w:after="120" w:line="312" w:lineRule="auto"/>
+        <w:ind w:left="0" w:firstLine="567"/>
+        <w:jc w:val="both"/>
+      </w:pPr>
+      <w:r>
+        <w:rPr>
+          <w:rFonts w:ascii="Times New Roman" w:hAnsi="Times New Roman"/>
+          <w:b w:val="0"/>
+          <w:i w:val="0"/>
+          <w:color w:val="000000"/>
+          <w:sz w:val="26"/>
+        </w:rPr>
+        <w:t>---</w:t>
+      </w:r>
+    </w:p>
+    <w:p>
+      <w:pPr>
+        <w:pStyle w:val="Heading1"/>
+        <w:keepNext/>
+        <w:spacing w:before="240" w:after="120"/>
+        <w:ind w:left="0" w:firstLine="0"/>
+      </w:pPr>
+      <w:r>
+        <w:rPr>
+          <w:rFonts w:ascii="Times New Roman" w:hAnsi="Times New Roman"/>
+          <w:b/>
+          <w:i w:val="0"/>
+          <w:color w:val="1F4E79"/>
+          <w:sz w:val="28"/>
+        </w:rPr>
+        <w:t>📍 ĐVKT 2: CÁC CÁCH LÀM BIẾN ĐỔI NỘI NĂNG</w:t>
+      </w:r>
+    </w:p>
+    <w:p>
+      <w:pPr>
+        <w:pStyle w:val="Heading2"/>
+        <w:keepNext/>
+        <w:spacing w:before="160" w:after="80"/>
+        <w:ind w:left="0" w:firstLine="0"/>
+      </w:pPr>
+      <w:r>
+        <w:rPr>
+          <w:rFonts w:ascii="Times New Roman" w:hAnsi="Times New Roman"/>
+          <w:b/>
+          <w:i w:val="0"/>
+          <w:color w:val="000000"/>
+          <w:sz w:val="26"/>
+        </w:rPr>
+        <w:t>1. Khám phá (Nhiệm vụ 2: Thí nghiệm ống ete bật nút)</w:t>
+      </w:r>
+    </w:p>
+    <w:p>
+      <w:pPr>
+        <w:spacing w:before="120" w:after="120" w:line="312" w:lineRule="auto"/>
+        <w:ind w:left="0" w:firstLine="567"/>
+        <w:jc w:val="both"/>
+      </w:pPr>
+      <w:r>
+        <w:rPr>
+          <w:rFonts w:ascii="Times New Roman" w:hAnsi="Times New Roman"/>
+          <w:b/>
+          <w:i w:val="0"/>
+          <w:color w:val="000000"/>
+          <w:sz w:val="26"/>
+        </w:rPr>
+        <w:t>Tình huống:</w:t>
+      </w:r>
+      <w:r>
+        <w:rPr>
+          <w:rFonts w:ascii="Times New Roman" w:hAnsi="Times New Roman"/>
+          <w:b w:val="0"/>
+          <w:i w:val="0"/>
+          <w:color w:val="000000"/>
+          <w:sz w:val="26"/>
+        </w:rPr>
+        <w:t xml:space="preserve"> Một ống nghiệm chứa ete được đậy nút cao su kín. Nếu ta tiến hành cọ xát mạnh thành ống nghiệm hoặc đun nóng nhẹ đáy ống, nút cao su sẽ bật ra.</w:t>
+      </w:r>
+    </w:p>
+    <w:p>
+      <w:pPr>
+        <w:spacing w:before="60" w:after="60" w:line="312" w:lineRule="auto"/>
+        <w:ind w:left="283" w:hanging="170"/>
+        <w:jc w:val="both"/>
+      </w:pPr>
+      <w:r>
+        <w:rPr>
+          <w:rFonts w:ascii="Times New Roman" w:hAnsi="Times New Roman"/>
+          <w:color w:val="000000"/>
+          <w:sz w:val="26"/>
+        </w:rPr>
+        <w:t xml:space="preserve">- </w:t>
+      </w:r>
+      <w:r>
+        <w:rPr>
+          <w:rFonts w:ascii="Times New Roman" w:hAnsi="Times New Roman"/>
+          <w:b w:val="0"/>
+          <w:i w:val="0"/>
+          <w:color w:val="000000"/>
+          <w:sz w:val="26"/>
+        </w:rPr>
+        <w:t xml:space="preserve">  </w:t>
+      </w:r>
+      <w:r>
+        <w:rPr>
+          <w:rFonts w:ascii="Times New Roman" w:hAnsi="Times New Roman"/>
+          <w:b/>
+          <w:i w:val="0"/>
+          <w:color w:val="000000"/>
+          <w:sz w:val="26"/>
+        </w:rPr>
+        <w:t>Câu hỏi:</w:t>
+      </w:r>
+      <w:r>
+        <w:rPr>
+          <w:rFonts w:ascii="Times New Roman" w:hAnsi="Times New Roman"/>
+          <w:b w:val="0"/>
+          <w:i w:val="0"/>
+          <w:color w:val="000000"/>
+          <w:sz w:val="26"/>
+        </w:rPr>
+        <w:t xml:space="preserve"> Nội năng của hơi ete trong ống nghiệm đã thay đổi bằng những cách nào trong hai trường hợp trên? Hãy mô tả quá trình biến đổi năng lượng tương ứng.</w:t>
+      </w:r>
+    </w:p>
+    <w:p>
+      <w:pPr>
+        <w:spacing w:before="40" w:after="40"/>
+        <w:ind w:left="567"/>
+        <w:jc w:val="left"/>
+      </w:pPr>
+      <w:r>
+        <w:rPr>
+          <w:rFonts w:ascii="Times New Roman" w:hAnsi="Times New Roman"/>
+          <w:color w:val="666666"/>
+          <w:sz w:val="22"/>
+        </w:rPr>
+        <w:t>..........................................................................................</w:t>
+      </w:r>
+    </w:p>
+    <w:p>
+      <w:pPr>
+        <w:spacing w:before="40" w:after="40"/>
+        <w:ind w:left="567"/>
+        <w:jc w:val="left"/>
+      </w:pPr>
+      <w:r>
+        <w:rPr>
+          <w:rFonts w:ascii="Times New Roman" w:hAnsi="Times New Roman"/>
+          <w:color w:val="666666"/>
+          <w:sz w:val="22"/>
+        </w:rPr>
+        <w:t>..........................................................................................</w:t>
+      </w:r>
+    </w:p>
+    <w:p>
+      <w:pPr>
+        <w:pStyle w:val="Heading2"/>
+        <w:keepNext/>
+        <w:spacing w:before="160" w:after="80"/>
+        <w:ind w:left="0" w:firstLine="0"/>
+      </w:pPr>
+      <w:r>
+        <w:rPr>
+          <w:rFonts w:ascii="Times New Roman" w:hAnsi="Times New Roman"/>
+          <w:b/>
+          <w:i w:val="0"/>
+          <w:color w:val="000000"/>
+          <w:sz w:val="26"/>
+        </w:rPr>
+        <w:t>2. Trọng tâm (Thực hiện công và Truyền nhiệt)</w:t>
+      </w:r>
+    </w:p>
+    <w:p>
+      <w:pPr>
+        <w:spacing w:before="60" w:after="60" w:line="312" w:lineRule="auto"/>
+        <w:ind w:left="283" w:hanging="170"/>
+        <w:jc w:val="both"/>
+      </w:pPr>
+      <w:r>
+        <w:rPr>
+          <w:rFonts w:ascii="Times New Roman" w:hAnsi="Times New Roman"/>
+          <w:color w:val="000000"/>
+          <w:sz w:val="26"/>
+        </w:rPr>
+        <w:t xml:space="preserve">- </w:t>
+      </w:r>
+      <w:r>
+        <w:rPr>
+          <w:rFonts w:ascii="Times New Roman" w:hAnsi="Times New Roman"/>
+          <w:b w:val="0"/>
+          <w:i w:val="0"/>
+          <w:color w:val="000000"/>
+          <w:sz w:val="26"/>
+        </w:rPr>
+        <w:t xml:space="preserve">  Có hai cách làm thay đổi nội năng là (1) .................... và (2) ....................</w:t>
+      </w:r>
+    </w:p>
+    <w:p>
+      <w:pPr>
+        <w:spacing w:before="60" w:after="60" w:line="312" w:lineRule="auto"/>
+        <w:ind w:left="283" w:hanging="170"/>
+        <w:jc w:val="both"/>
+      </w:pPr>
+      <w:r>
+        <w:rPr>
+          <w:rFonts w:ascii="Times New Roman" w:hAnsi="Times New Roman"/>
+          <w:color w:val="000000"/>
+          <w:sz w:val="26"/>
+        </w:rPr>
+        <w:t xml:space="preserve">- </w:t>
+      </w:r>
+      <w:r>
+        <w:rPr>
+          <w:rFonts w:ascii="Times New Roman" w:hAnsi="Times New Roman"/>
+          <w:b w:val="0"/>
+          <w:i w:val="0"/>
+          <w:color w:val="000000"/>
+          <w:sz w:val="26"/>
+        </w:rPr>
+        <w:t xml:space="preserve">  Trong quá trình thực hiện công, có sự (3) .................... năng lượng từ dạng này sang dạng khác.</w:t>
+      </w:r>
+    </w:p>
+    <w:p>
+      <w:pPr>
+        <w:spacing w:before="60" w:after="60" w:line="312" w:lineRule="auto"/>
+        <w:ind w:left="283" w:hanging="170"/>
+        <w:jc w:val="both"/>
+      </w:pPr>
+      <w:r>
+        <w:rPr>
+          <w:rFonts w:ascii="Times New Roman" w:hAnsi="Times New Roman"/>
+          <w:color w:val="000000"/>
+          <w:sz w:val="26"/>
+        </w:rPr>
+        <w:t xml:space="preserve">- </w:t>
+      </w:r>
+      <w:r>
+        <w:rPr>
+          <w:rFonts w:ascii="Times New Roman" w:hAnsi="Times New Roman"/>
+          <w:b w:val="0"/>
+          <w:i w:val="0"/>
+          <w:color w:val="000000"/>
+          <w:sz w:val="26"/>
+        </w:rPr>
+        <w:t xml:space="preserve">  Trong quá trình truyền nhiệt, không có sự chuyển hóa năng lượng, chỉ có sự (4) .................... nội năng từ vật này sang vật khác.</w:t>
+      </w:r>
+    </w:p>
+    <w:p>
+      <w:pPr>
+        <w:spacing w:before="60" w:after="60" w:line="312" w:lineRule="auto"/>
+        <w:ind w:left="283" w:hanging="170"/>
+        <w:jc w:val="both"/>
+      </w:pPr>
+      <w:r>
+        <w:rPr>
+          <w:rFonts w:ascii="Times New Roman" w:hAnsi="Times New Roman"/>
+          <w:color w:val="000000"/>
+          <w:sz w:val="26"/>
+        </w:rPr>
+        <w:t xml:space="preserve">- </w:t>
+      </w:r>
+      <w:r>
+        <w:rPr>
+          <w:rFonts w:ascii="Times New Roman" w:hAnsi="Times New Roman"/>
+          <w:b w:val="0"/>
+          <w:i w:val="0"/>
+          <w:color w:val="000000"/>
+          <w:sz w:val="26"/>
+        </w:rPr>
+        <w:t xml:space="preserve">  *Gợi ý từ khóa:* truyền nhiệt, thực hiện công, chuyển hóa, truyền/dịch chuyển.</w:t>
+      </w:r>
+    </w:p>
+    <w:p>
+      <w:pPr>
+        <w:pStyle w:val="Heading2"/>
+        <w:keepNext/>
+        <w:spacing w:before="160" w:after="80"/>
+        <w:ind w:left="0" w:firstLine="0"/>
+      </w:pPr>
+      <w:r>
+        <w:rPr>
+          <w:rFonts w:ascii="Times New Roman" w:hAnsi="Times New Roman"/>
+          <w:b/>
+          <w:i w:val="0"/>
+          <w:color w:val="000000"/>
+          <w:sz w:val="26"/>
+        </w:rPr>
+        <w:t>3. Vận dụng (Tình huống thực tế)</w:t>
+      </w:r>
+    </w:p>
+    <w:p>
+      <w:pPr>
+        <w:spacing w:before="60" w:after="60" w:line="312" w:lineRule="auto"/>
+        <w:ind w:left="283" w:hanging="170"/>
+        <w:jc w:val="both"/>
+      </w:pPr>
+      <w:r>
+        <w:rPr>
+          <w:rFonts w:ascii="Times New Roman" w:hAnsi="Times New Roman"/>
+          <w:color w:val="000000"/>
+          <w:sz w:val="26"/>
+        </w:rPr>
+        <w:t xml:space="preserve">- </w:t>
+      </w:r>
+      <w:r>
+        <w:rPr>
+          <w:rFonts w:ascii="Times New Roman" w:hAnsi="Times New Roman"/>
+          <w:b w:val="0"/>
+          <w:i w:val="0"/>
+          <w:color w:val="000000"/>
+          <w:sz w:val="26"/>
+        </w:rPr>
+        <w:t xml:space="preserve">  </w:t>
+      </w:r>
+      <w:r>
+        <w:rPr>
+          <w:rFonts w:ascii="Times New Roman" w:hAnsi="Times New Roman"/>
+          <w:b/>
+          <w:i w:val="0"/>
+          <w:color w:val="000000"/>
+          <w:sz w:val="26"/>
+        </w:rPr>
+        <w:t>Câu hỏi:</w:t>
+      </w:r>
+      <w:r>
+        <w:rPr>
+          <w:rFonts w:ascii="Times New Roman" w:hAnsi="Times New Roman"/>
+          <w:b w:val="0"/>
+          <w:i w:val="0"/>
+          <w:color w:val="000000"/>
+          <w:sz w:val="26"/>
+        </w:rPr>
+        <w:t xml:space="preserve"> Việc “bơm xe đạp bằng tay làm ống bơm nóng lên” và “thả chiếc thìa nhôm nóng vào cốc nước lạnh làm thìa nguội đi” thuộc cách biến đổi nội năng nào? Giải thích ngắn gọn.</w:t>
+      </w:r>
+    </w:p>
+    <w:p>
+      <w:pPr>
+        <w:spacing w:before="40" w:after="40"/>
+        <w:ind w:left="567"/>
+        <w:jc w:val="left"/>
+      </w:pPr>
+      <w:r>
+        <w:rPr>
+          <w:rFonts w:ascii="Times New Roman" w:hAnsi="Times New Roman"/>
+          <w:color w:val="666666"/>
+          <w:sz w:val="22"/>
+        </w:rPr>
+        <w:t>..........................................................................................</w:t>
+      </w:r>
+    </w:p>
+    <w:p>
+      <w:pPr>
+        <w:spacing w:before="40" w:after="40"/>
+        <w:ind w:left="567"/>
+        <w:jc w:val="left"/>
+      </w:pPr>
+      <w:r>
+        <w:rPr>
+          <w:rFonts w:ascii="Times New Roman" w:hAnsi="Times New Roman"/>
+          <w:color w:val="666666"/>
+          <w:sz w:val="22"/>
+        </w:rPr>
+        <w:t>..........................................................................................</w:t>
+      </w:r>
+    </w:p>
+    <w:p>
+      <w:pPr>
+        <w:spacing w:before="120" w:after="120" w:line="312" w:lineRule="auto"/>
+        <w:ind w:left="0" w:firstLine="567"/>
+        <w:jc w:val="both"/>
+      </w:pPr>
+      <w:r>
+        <w:rPr>
+          <w:rFonts w:ascii="Times New Roman" w:hAnsi="Times New Roman"/>
+          <w:b w:val="0"/>
+          <w:i w:val="0"/>
+          <w:color w:val="000000"/>
+          <w:sz w:val="26"/>
+        </w:rPr>
+        <w:t>---</w:t>
+      </w:r>
+    </w:p>
+    <w:p>
+      <w:pPr>
+        <w:pStyle w:val="Heading1"/>
+        <w:keepNext/>
+        <w:spacing w:before="240" w:after="120"/>
+        <w:ind w:left="0" w:firstLine="0"/>
+      </w:pPr>
+      <w:r>
+        <w:rPr>
+          <w:rFonts w:ascii="Times New Roman" w:hAnsi="Times New Roman"/>
+          <w:b/>
+          <w:i w:val="0"/>
+          <w:color w:val="1F4E79"/>
+          <w:sz w:val="28"/>
+        </w:rPr>
+        <w:t>📍 ĐVKT 3: NGUYÊN LÍ I NHIỆT ĐỘNG LỰC HỌC</w:t>
+      </w:r>
+    </w:p>
+    <w:p>
+      <w:pPr>
+        <w:pStyle w:val="Heading2"/>
+        <w:keepNext/>
+        <w:spacing w:before="160" w:after="80"/>
+        <w:ind w:left="0" w:firstLine="0"/>
+      </w:pPr>
+      <w:r>
+        <w:rPr>
+          <w:rFonts w:ascii="Times New Roman" w:hAnsi="Times New Roman"/>
+          <w:b/>
+          <w:i w:val="0"/>
+          <w:color w:val="000000"/>
+          <w:sz w:val="26"/>
+        </w:rPr>
+        <w:t>1. Khám phá (Nhiệm vụ 3: Hệ thức Nguyên lí I)</w:t>
+      </w:r>
+    </w:p>
+    <w:p>
+      <w:pPr>
+        <w:spacing w:before="60" w:after="60" w:line="312" w:lineRule="auto"/>
+        <w:ind w:left="283" w:hanging="170"/>
+        <w:jc w:val="both"/>
+      </w:pPr>
+      <w:r>
+        <w:rPr>
+          <w:rFonts w:ascii="Times New Roman" w:hAnsi="Times New Roman"/>
+          <w:color w:val="000000"/>
+          <w:sz w:val="26"/>
+        </w:rPr>
+        <w:t xml:space="preserve">- </w:t>
+      </w:r>
+      <w:r>
+        <w:rPr>
+          <w:rFonts w:ascii="Times New Roman" w:hAnsi="Times New Roman"/>
+          <w:b w:val="0"/>
+          <w:i w:val="0"/>
+          <w:color w:val="000000"/>
+          <w:sz w:val="26"/>
+        </w:rPr>
+        <w:t xml:space="preserve">  </w:t>
+      </w:r>
+      <w:r>
+        <w:rPr>
+          <w:rFonts w:ascii="Times New Roman" w:hAnsi="Times New Roman"/>
+          <w:b/>
+          <w:i w:val="0"/>
+          <w:color w:val="000000"/>
+          <w:sz w:val="26"/>
+        </w:rPr>
+        <w:t>Câu hỏi:</w:t>
+      </w:r>
+      <w:r>
+        <w:rPr>
+          <w:rFonts w:ascii="Times New Roman" w:hAnsi="Times New Roman"/>
+          <w:b w:val="0"/>
+          <w:i w:val="0"/>
+          <w:color w:val="000000"/>
+          <w:sz w:val="26"/>
+        </w:rPr>
+        <w:t xml:space="preserve"> Nguyên lí I phát biểu dưới dạng hệ thức toán học </w:t>
+      </w:r>
+      <w:r>
+        <w:rPr>
+          <w:rFonts w:ascii="Times New Roman" w:hAnsi="Times New Roman"/>
+          <w:i/>
+          <w:color w:val="000000"/>
+          <w:sz w:val="26"/>
+        </w:rPr>
+        <w:t>Δ U = A + Q</w:t>
+      </w:r>
+      <w:r>
+        <w:rPr>
+          <w:rFonts w:ascii="Times New Roman" w:hAnsi="Times New Roman"/>
+          <w:b w:val="0"/>
+          <w:i w:val="0"/>
+          <w:color w:val="000000"/>
+          <w:sz w:val="26"/>
+        </w:rPr>
+        <w:t xml:space="preserve">. Hãy cho biết khi nào hệ nhận nhiệt, nhận công, tỏa nhiệt, hay thực hiện công thì dấu của các đại lượng </w:t>
+      </w:r>
+      <w:r>
+        <w:rPr>
+          <w:rFonts w:ascii="Times New Roman" w:hAnsi="Times New Roman"/>
+          <w:i/>
+          <w:color w:val="000000"/>
+          <w:sz w:val="26"/>
+        </w:rPr>
+        <w:t>Q</w:t>
+      </w:r>
+      <w:r>
+        <w:rPr>
+          <w:rFonts w:ascii="Times New Roman" w:hAnsi="Times New Roman"/>
+          <w:b w:val="0"/>
+          <w:i w:val="0"/>
+          <w:color w:val="000000"/>
+          <w:sz w:val="26"/>
+        </w:rPr>
+        <w:t xml:space="preserve"> và </w:t>
+      </w:r>
+      <w:r>
+        <w:rPr>
+          <w:rFonts w:ascii="Times New Roman" w:hAnsi="Times New Roman"/>
+          <w:i/>
+          <w:color w:val="000000"/>
+          <w:sz w:val="26"/>
+        </w:rPr>
+        <w:t>A</w:t>
+      </w:r>
+      <w:r>
+        <w:rPr>
+          <w:rFonts w:ascii="Times New Roman" w:hAnsi="Times New Roman"/>
+          <w:b w:val="0"/>
+          <w:i w:val="0"/>
+          <w:color w:val="000000"/>
+          <w:sz w:val="26"/>
+        </w:rPr>
+        <w:t xml:space="preserve"> sẽ như thế nào?</w:t>
+      </w:r>
+    </w:p>
+    <w:p>
+      <w:pPr>
+        <w:spacing w:before="40" w:after="40"/>
+        <w:ind w:left="567"/>
+        <w:jc w:val="left"/>
+      </w:pPr>
+      <w:r>
+        <w:rPr>
+          <w:rFonts w:ascii="Times New Roman" w:hAnsi="Times New Roman"/>
+          <w:color w:val="666666"/>
+          <w:sz w:val="22"/>
+        </w:rPr>
+        <w:t>..........................................................................................</w:t>
+      </w:r>
+    </w:p>
+    <w:p>
+      <w:pPr>
+        <w:spacing w:before="40" w:after="40"/>
+        <w:ind w:left="567"/>
+        <w:jc w:val="left"/>
+      </w:pPr>
+      <w:r>
+        <w:rPr>
+          <w:rFonts w:ascii="Times New Roman" w:hAnsi="Times New Roman"/>
+          <w:color w:val="666666"/>
+          <w:sz w:val="22"/>
+        </w:rPr>
+        <w:t>..........................................................................................</w:t>
+      </w:r>
+    </w:p>
+    <w:p>
+      <w:pPr>
+        <w:pStyle w:val="Heading2"/>
+        <w:keepNext/>
+        <w:spacing w:before="160" w:after="80"/>
+        <w:ind w:left="0" w:firstLine="0"/>
+      </w:pPr>
+      <w:r>
+        <w:rPr>
+          <w:rFonts w:ascii="Times New Roman" w:hAnsi="Times New Roman"/>
+          <w:b/>
+          <w:i w:val="0"/>
+          <w:color w:val="000000"/>
+          <w:sz w:val="26"/>
+        </w:rPr>
+        <w:t>2. Trọng tâm (Biểu thức và Quy ước dấu)</w:t>
+      </w:r>
+    </w:p>
+    <w:p>
+      <w:pPr>
+        <w:spacing w:before="60" w:after="60" w:line="312" w:lineRule="auto"/>
+        <w:ind w:left="283" w:hanging="170"/>
+        <w:jc w:val="both"/>
+      </w:pPr>
+      <w:r>
+        <w:rPr>
+          <w:rFonts w:ascii="Times New Roman" w:hAnsi="Times New Roman"/>
+          <w:color w:val="000000"/>
+          <w:sz w:val="26"/>
+        </w:rPr>
+        <w:t xml:space="preserve">- </w:t>
+      </w:r>
+      <w:r>
+        <w:rPr>
+          <w:rFonts w:ascii="Times New Roman" w:hAnsi="Times New Roman"/>
+          <w:b w:val="0"/>
+          <w:i w:val="0"/>
+          <w:color w:val="000000"/>
+          <w:sz w:val="26"/>
+        </w:rPr>
+        <w:t xml:space="preserve">  Nguyên lí I Nhiệt động lực học: ==</w:t>
+      </w:r>
+      <w:r>
+        <w:rPr>
+          <w:rFonts w:ascii="Times New Roman" w:hAnsi="Times New Roman"/>
+          <w:i/>
+          <w:color w:val="000000"/>
+          <w:sz w:val="26"/>
+        </w:rPr>
+        <w:t>Δ U = A + Q</w:t>
+      </w:r>
+      <w:r>
+        <w:rPr>
+          <w:rFonts w:ascii="Times New Roman" w:hAnsi="Times New Roman"/>
+          <w:b w:val="0"/>
+          <w:i w:val="0"/>
+          <w:color w:val="000000"/>
+          <w:sz w:val="26"/>
+        </w:rPr>
+        <w:t>==.</w:t>
+      </w:r>
+    </w:p>
+    <w:p>
+      <w:pPr>
+        <w:spacing w:before="60" w:after="60" w:line="312" w:lineRule="auto"/>
+        <w:ind w:left="283" w:hanging="170"/>
+        <w:jc w:val="both"/>
+      </w:pPr>
+      <w:r>
+        <w:rPr>
+          <w:rFonts w:ascii="Times New Roman" w:hAnsi="Times New Roman"/>
+          <w:color w:val="000000"/>
+          <w:sz w:val="26"/>
+        </w:rPr>
+        <w:t xml:space="preserve">- </w:t>
+      </w:r>
+      <w:r>
+        <w:rPr>
+          <w:rFonts w:ascii="Times New Roman" w:hAnsi="Times New Roman"/>
+          <w:b w:val="0"/>
+          <w:i w:val="0"/>
+          <w:color w:val="000000"/>
+          <w:sz w:val="26"/>
+        </w:rPr>
+        <w:t xml:space="preserve">  Quy ước dấu:</w:t>
+      </w:r>
+    </w:p>
+    <w:p>
+      <w:pPr>
+        <w:spacing w:before="60" w:after="60" w:line="312" w:lineRule="auto"/>
+        <w:ind w:left="283" w:hanging="170"/>
+        <w:jc w:val="both"/>
+      </w:pPr>
+      <w:r>
+        <w:rPr>
+          <w:rFonts w:ascii="Times New Roman" w:hAnsi="Times New Roman"/>
+          <w:color w:val="000000"/>
+          <w:sz w:val="26"/>
+        </w:rPr>
+        <w:t xml:space="preserve">- </w:t>
+      </w:r>
+      <w:r>
+        <w:rPr>
+          <w:rFonts w:ascii="Times New Roman" w:hAnsi="Times New Roman"/>
+          <w:b w:val="0"/>
+          <w:i w:val="0"/>
+          <w:color w:val="000000"/>
+          <w:sz w:val="26"/>
+        </w:rPr>
+        <w:t xml:space="preserve">  </w:t>
+      </w:r>
+      <w:r>
+        <w:rPr>
+          <w:rFonts w:ascii="Times New Roman" w:hAnsi="Times New Roman"/>
+          <w:i/>
+          <w:color w:val="000000"/>
+          <w:sz w:val="26"/>
+        </w:rPr>
+        <w:t>Q &gt; 0</w:t>
+      </w:r>
+      <w:r>
+        <w:rPr>
+          <w:rFonts w:ascii="Times New Roman" w:hAnsi="Times New Roman"/>
+          <w:b w:val="0"/>
+          <w:i w:val="0"/>
+          <w:color w:val="000000"/>
+          <w:sz w:val="26"/>
+        </w:rPr>
+        <w:t xml:space="preserve">: Hệ (1) .................... nhiệt lượng; </w:t>
+      </w:r>
+      <w:r>
+        <w:rPr>
+          <w:rFonts w:ascii="Times New Roman" w:hAnsi="Times New Roman"/>
+          <w:i/>
+          <w:color w:val="000000"/>
+          <w:sz w:val="26"/>
+        </w:rPr>
+        <w:t>Q &lt; 0</w:t>
+      </w:r>
+      <w:r>
+        <w:rPr>
+          <w:rFonts w:ascii="Times New Roman" w:hAnsi="Times New Roman"/>
+          <w:b w:val="0"/>
+          <w:i w:val="0"/>
+          <w:color w:val="000000"/>
+          <w:sz w:val="26"/>
+        </w:rPr>
+        <w:t>: Hệ (2) .................... nhiệt lượng.</w:t>
+      </w:r>
+    </w:p>
+    <w:p>
+      <w:pPr>
+        <w:spacing w:before="60" w:after="60" w:line="312" w:lineRule="auto"/>
+        <w:ind w:left="283" w:hanging="170"/>
+        <w:jc w:val="both"/>
+      </w:pPr>
+      <w:r>
+        <w:rPr>
+          <w:rFonts w:ascii="Times New Roman" w:hAnsi="Times New Roman"/>
+          <w:color w:val="000000"/>
+          <w:sz w:val="26"/>
+        </w:rPr>
+        <w:t xml:space="preserve">- </w:t>
+      </w:r>
+      <w:r>
+        <w:rPr>
+          <w:rFonts w:ascii="Times New Roman" w:hAnsi="Times New Roman"/>
+          <w:b w:val="0"/>
+          <w:i w:val="0"/>
+          <w:color w:val="000000"/>
+          <w:sz w:val="26"/>
+        </w:rPr>
+        <w:t xml:space="preserve">  </w:t>
+      </w:r>
+      <w:r>
+        <w:rPr>
+          <w:rFonts w:ascii="Times New Roman" w:hAnsi="Times New Roman"/>
+          <w:i/>
+          <w:color w:val="000000"/>
+          <w:sz w:val="26"/>
+        </w:rPr>
+        <w:t>A &gt; 0</w:t>
+      </w:r>
+      <w:r>
+        <w:rPr>
+          <w:rFonts w:ascii="Times New Roman" w:hAnsi="Times New Roman"/>
+          <w:b w:val="0"/>
+          <w:i w:val="0"/>
+          <w:color w:val="000000"/>
+          <w:sz w:val="26"/>
+        </w:rPr>
+        <w:t xml:space="preserve">: Hệ (3) .................... công; </w:t>
+      </w:r>
+      <w:r>
+        <w:rPr>
+          <w:rFonts w:ascii="Times New Roman" w:hAnsi="Times New Roman"/>
+          <w:i/>
+          <w:color w:val="000000"/>
+          <w:sz w:val="26"/>
+        </w:rPr>
+        <w:t>A &lt; 0</w:t>
+      </w:r>
+      <w:r>
+        <w:rPr>
+          <w:rFonts w:ascii="Times New Roman" w:hAnsi="Times New Roman"/>
+          <w:b w:val="0"/>
+          <w:i w:val="0"/>
+          <w:color w:val="000000"/>
+          <w:sz w:val="26"/>
+        </w:rPr>
+        <w:t>: Hệ (4) .................... công.</w:t>
+      </w:r>
+    </w:p>
+    <w:p>
+      <w:pPr>
+        <w:spacing w:before="60" w:after="60" w:line="312" w:lineRule="auto"/>
+        <w:ind w:left="283" w:hanging="170"/>
+        <w:jc w:val="both"/>
+      </w:pPr>
+      <w:r>
+        <w:rPr>
+          <w:rFonts w:ascii="Times New Roman" w:hAnsi="Times New Roman"/>
+          <w:color w:val="000000"/>
+          <w:sz w:val="26"/>
+        </w:rPr>
+        <w:t xml:space="preserve">- </w:t>
+      </w:r>
+      <w:r>
+        <w:rPr>
+          <w:rFonts w:ascii="Times New Roman" w:hAnsi="Times New Roman"/>
+          <w:b w:val="0"/>
+          <w:i w:val="0"/>
+          <w:color w:val="000000"/>
+          <w:sz w:val="26"/>
+        </w:rPr>
+        <w:t xml:space="preserve">  *Gợi ý từ khóa:* nhận, tỏa, nhận, thực hiện (hoặc sinh).</w:t>
+      </w:r>
+    </w:p>
+    <w:p>
+      <w:pPr>
+        <w:pStyle w:val="Heading2"/>
+        <w:keepNext/>
+        <w:spacing w:before="160" w:after="80"/>
+        <w:ind w:left="0" w:firstLine="0"/>
+      </w:pPr>
+      <w:r>
+        <w:rPr>
+          <w:rFonts w:ascii="Times New Roman" w:hAnsi="Times New Roman"/>
+          <w:b/>
+          <w:i w:val="0"/>
+          <w:color w:val="000000"/>
+          <w:sz w:val="26"/>
+        </w:rPr>
+        <w:t>3. Vận dụng (Chu trình khí trong xilanh)</w:t>
+      </w:r>
+    </w:p>
+    <w:p>
+      <w:pPr>
+        <w:spacing w:before="120" w:after="120" w:line="312" w:lineRule="auto"/>
+        <w:ind w:left="0" w:firstLine="567"/>
+        <w:jc w:val="both"/>
+      </w:pPr>
+      <w:r>
+        <w:rPr>
+          <w:rFonts w:ascii="Times New Roman" w:hAnsi="Times New Roman"/>
+          <w:b/>
+          <w:i w:val="0"/>
+          <w:color w:val="000000"/>
+          <w:sz w:val="26"/>
+        </w:rPr>
+        <w:t>Tình huống:</w:t>
+      </w:r>
+      <w:r>
+        <w:rPr>
+          <w:rFonts w:ascii="Times New Roman" w:hAnsi="Times New Roman"/>
+          <w:b w:val="0"/>
+          <w:i w:val="0"/>
+          <w:color w:val="000000"/>
+          <w:sz w:val="26"/>
+        </w:rPr>
+        <w:t xml:space="preserve"> Một lượng khí trong xilanh nhận một nhiệt lượng </w:t>
+      </w:r>
+      <w:r>
+        <w:rPr>
+          <w:rFonts w:ascii="Times New Roman" w:hAnsi="Times New Roman"/>
+          <w:i/>
+          <w:color w:val="000000"/>
+          <w:sz w:val="26"/>
+        </w:rPr>
+        <w:t>Q = 200</w:t>
+        <w:tab/>
+        <w:t>ext{ J}</w:t>
+      </w:r>
+      <w:r>
+        <w:rPr>
+          <w:rFonts w:ascii="Times New Roman" w:hAnsi="Times New Roman"/>
+          <w:b w:val="0"/>
+          <w:i w:val="0"/>
+          <w:color w:val="000000"/>
+          <w:sz w:val="26"/>
+        </w:rPr>
+        <w:t xml:space="preserve"> từ nguồn ngoài, đồng thời khí giãn nở đẩy pit-tông thực hiện một công </w:t>
+      </w:r>
+      <w:r>
+        <w:rPr>
+          <w:rFonts w:ascii="Times New Roman" w:hAnsi="Times New Roman"/>
+          <w:i/>
+          <w:color w:val="000000"/>
+          <w:sz w:val="26"/>
+        </w:rPr>
+        <w:t>A' = 120</w:t>
+        <w:tab/>
+        <w:t>ext{ J}</w:t>
+      </w:r>
+      <w:r>
+        <w:rPr>
+          <w:rFonts w:ascii="Times New Roman" w:hAnsi="Times New Roman"/>
+          <w:b w:val="0"/>
+          <w:i w:val="0"/>
+          <w:color w:val="000000"/>
+          <w:sz w:val="26"/>
+        </w:rPr>
+        <w:t>.</w:t>
+      </w:r>
+    </w:p>
+    <w:p>
+      <w:pPr>
+        <w:spacing w:before="60" w:after="60" w:line="312" w:lineRule="auto"/>
+        <w:ind w:left="283" w:hanging="170"/>
+        <w:jc w:val="both"/>
+      </w:pPr>
+      <w:r>
+        <w:rPr>
+          <w:rFonts w:ascii="Times New Roman" w:hAnsi="Times New Roman"/>
+          <w:color w:val="000000"/>
+          <w:sz w:val="26"/>
+        </w:rPr>
+        <w:t xml:space="preserve">- </w:t>
+      </w:r>
+      <w:r>
+        <w:rPr>
+          <w:rFonts w:ascii="Times New Roman" w:hAnsi="Times New Roman"/>
+          <w:b w:val="0"/>
+          <w:i w:val="0"/>
+          <w:color w:val="000000"/>
+          <w:sz w:val="26"/>
+        </w:rPr>
+        <w:t xml:space="preserve">  </w:t>
+      </w:r>
+      <w:r>
+        <w:rPr>
+          <w:rFonts w:ascii="Times New Roman" w:hAnsi="Times New Roman"/>
+          <w:b/>
+          <w:i w:val="0"/>
+          <w:color w:val="000000"/>
+          <w:sz w:val="26"/>
+        </w:rPr>
+        <w:t>Câu hỏi:</w:t>
+      </w:r>
+      <w:r>
+        <w:rPr>
+          <w:rFonts w:ascii="Times New Roman" w:hAnsi="Times New Roman"/>
+          <w:b w:val="0"/>
+          <w:i w:val="0"/>
+          <w:color w:val="000000"/>
+          <w:sz w:val="26"/>
+        </w:rPr>
+        <w:t xml:space="preserve"> Xác định dấu của các đại lượng </w:t>
+      </w:r>
+      <w:r>
+        <w:rPr>
+          <w:rFonts w:ascii="Times New Roman" w:hAnsi="Times New Roman"/>
+          <w:i/>
+          <w:color w:val="000000"/>
+          <w:sz w:val="26"/>
+        </w:rPr>
+        <w:t>Q</w:t>
+      </w:r>
+      <w:r>
+        <w:rPr>
+          <w:rFonts w:ascii="Times New Roman" w:hAnsi="Times New Roman"/>
+          <w:b w:val="0"/>
+          <w:i w:val="0"/>
+          <w:color w:val="000000"/>
+          <w:sz w:val="26"/>
+        </w:rPr>
+        <w:t xml:space="preserve"> và </w:t>
+      </w:r>
+      <w:r>
+        <w:rPr>
+          <w:rFonts w:ascii="Times New Roman" w:hAnsi="Times New Roman"/>
+          <w:i/>
+          <w:color w:val="000000"/>
+          <w:sz w:val="26"/>
+        </w:rPr>
+        <w:t>A</w:t>
+      </w:r>
+      <w:r>
+        <w:rPr>
+          <w:rFonts w:ascii="Times New Roman" w:hAnsi="Times New Roman"/>
+          <w:b w:val="0"/>
+          <w:i w:val="0"/>
+          <w:color w:val="000000"/>
+          <w:sz w:val="26"/>
+        </w:rPr>
+        <w:t xml:space="preserve">, từ đó tính độ biến thiên nội năng </w:t>
       </w:r>
       <w:r>
         <w:rPr>
@@ -836,22 +1578,7 @@
           <w:color w:val="000000"/>
           <w:sz w:val="26"/>
         </w:rPr>
-        <w:t>) của lượng khí trên. Xác định rõ dấu của các đại lượng theo quy ước.</w:t>
-      </w:r>
-    </w:p>
-    <w:p>
-      <w:pPr>
-        <w:spacing w:before="40" w:after="40"/>
-        <w:ind w:left="567"/>
-        <w:jc w:val="left"/>
-      </w:pPr>
-      <w:r>
-        <w:rPr>
-          <w:rFonts w:ascii="Times New Roman" w:hAnsi="Times New Roman"/>
-          <w:color w:val="666666"/>
-          <w:sz w:val="22"/>
-        </w:rPr>
-        <w:t>..........................................................................................</w:t>
+        <w:t xml:space="preserve"> của lượng khí trên.</w:t>
       </w:r>
     </w:p>
     <w:p>
@@ -934,24 +1661,7 @@
           <w:color w:val="000000"/>
           <w:sz w:val="26"/>
         </w:rPr>
-        <w:t>Năm 1765, James Watt đã cải tiến động cơ hơi nước của Newcomen bằng cách thêm một bình ngưng tụ hơi nước độc lập. Phát minh này giúp giảm thiểu lượng nhiệt hao phí dùng để làm nóng xilanh liên tục, nâng cao hiệu suất động cơ lên gấp 4 lần. Đây là một ứng dụng thực tiễn vĩ đại của Nguyên lí I Nhiệt động lực học, trực tiếp châm ngòi cho cuộc Cách mạng Công nghiệp lần thứ nhất trên toàn cầu.</w:t>
-      </w:r>
-    </w:p>
-    <w:p>
-      <w:pPr>
-        <w:spacing w:before="120" w:after="120" w:line="312" w:lineRule="auto"/>
-        <w:ind w:left="567" w:firstLine="0"/>
-        <w:jc w:val="both"/>
-      </w:pPr>
-      <w:r>
-        <w:rPr>
-          <w:rFonts w:ascii="Times New Roman" w:hAnsi="Times New Roman"/>
-          <w:b w:val="0"/>
-          <w:i/>
-          <w:color w:val="000000"/>
-          <w:sz w:val="26"/>
-        </w:rPr>
-        <w:t>*(Nguồn: Lịch sử Khoa học kỹ thuật - NXB Khoa học)*</w:t>
+        <w:t>Năm 1765, James Watt đã cải tiến động cơ hơi nước bằng cách thêm một bình ngưng độc lập. Phát minh này giúp giảm thiểu nhiệt lượng hao phí dùng để làm nóng xilanh liên tục, nâng hiệu suất lên gấp 4 lần. Đây là một ứng dụng vĩ đại của Nguyên lí I Nhiệt động lực học, trực tiếp châm ngòi cho cuộc Cách mạng Công nghiệp lần thứ nhất.</w:t>
       </w:r>
     </w:p>
     <w:p>
@@ -986,7 +1696,7 @@
           <w:color w:val="1F4E79"/>
           <w:sz w:val="28"/>
         </w:rPr>
-        <w:t>📍 ĐVKT 2: NHIỆT LƯỢNG VÀ CÔNG THỨC TÍNH NHIỆT LƯỢNG</w:t>
+        <w:t>📍 ĐVKT 4: NHIỆT LƯỢNG VÀ CÔNG THỨC TÍNH NHIỆT LƯỢNG</w:t>
       </w:r>
     </w:p>
     <w:p>
@@ -1004,72 +1714,7 @@
           <w:color w:val="000000"/>
           <w:sz w:val="26"/>
         </w:rPr>
-        <w:t>1. Khám phá (Nhiệm vụ 3: Đun nóng nước và rượu)</w:t>
-      </w:r>
-    </w:p>
-    <w:p>
-      <w:pPr>
-        <w:spacing w:before="120" w:after="120" w:line="312" w:lineRule="auto"/>
-        <w:ind w:left="0" w:firstLine="567"/>
-        <w:jc w:val="both"/>
-      </w:pPr>
-      <w:r>
-        <w:rPr>
-          <w:rFonts w:ascii="Times New Roman" w:hAnsi="Times New Roman"/>
-          <w:b/>
-          <w:i w:val="0"/>
-          <w:color w:val="000000"/>
-          <w:sz w:val="26"/>
-        </w:rPr>
-        <w:t>Thực nghiệm:</w:t>
-      </w:r>
-      <w:r>
-        <w:rPr>
-          <w:rFonts w:ascii="Times New Roman" w:hAnsi="Times New Roman"/>
-          <w:b w:val="0"/>
-          <w:i w:val="0"/>
-          <w:color w:val="000000"/>
-          <w:sz w:val="26"/>
-        </w:rPr>
-        <w:t xml:space="preserve"> GV dùng hai đèn cồn giống hệt nhau để đun nóng </w:t>
-      </w:r>
-      <w:r>
-        <w:rPr>
-          <w:rFonts w:ascii="Times New Roman" w:hAnsi="Times New Roman"/>
-          <w:i/>
-          <w:color w:val="000000"/>
-          <w:sz w:val="26"/>
-        </w:rPr>
-        <w:t>100 g</w:t>
-      </w:r>
-      <w:r>
-        <w:rPr>
-          <w:rFonts w:ascii="Times New Roman" w:hAnsi="Times New Roman"/>
-          <w:b w:val="0"/>
-          <w:i w:val="0"/>
-          <w:color w:val="000000"/>
-          <w:sz w:val="26"/>
-        </w:rPr>
-        <w:t xml:space="preserve"> nước và </w:t>
-      </w:r>
-      <w:r>
-        <w:rPr>
-          <w:rFonts w:ascii="Times New Roman" w:hAnsi="Times New Roman"/>
-          <w:i/>
-          <w:color w:val="000000"/>
-          <w:sz w:val="26"/>
-        </w:rPr>
-        <w:t>100 g</w:t>
-      </w:r>
-      <w:r>
-        <w:rPr>
-          <w:rFonts w:ascii="Times New Roman" w:hAnsi="Times New Roman"/>
-          <w:b w:val="0"/>
-          <w:i w:val="0"/>
-          <w:color w:val="000000"/>
-          <w:sz w:val="26"/>
-        </w:rPr>
-        <w:t xml:space="preserve"> rượu trong cùng một khoảng thời gian. Kết quả cho thấy nhiệt độ của rượu tăng nhanh hơn nhiều so với nước.</w:t>
+        <w:t>1. Khám phá (Nhiệm vụ 4: Các yếu tố ảnh hưởng)</w:t>
       </w:r>
     </w:p>
     <w:p>
@@ -1114,22 +1759,7 @@
           <w:color w:val="000000"/>
           <w:sz w:val="26"/>
         </w:rPr>
-        <w:t xml:space="preserve"> Tại sao cùng nhận một lượng nhiệt như nhau và có cùng khối lượng, nhưng độ tăng nhiệt độ của rượu lại lớn hơn nước? Yếu tố nào đặc trưng cho tính chất này của chất?</w:t>
-      </w:r>
-    </w:p>
-    <w:p>
-      <w:pPr>
-        <w:spacing w:before="40" w:after="40"/>
-        <w:ind w:left="567"/>
-        <w:jc w:val="left"/>
-      </w:pPr>
-      <w:r>
-        <w:rPr>
-          <w:rFonts w:ascii="Times New Roman" w:hAnsi="Times New Roman"/>
-          <w:color w:val="666666"/>
-          <w:sz w:val="22"/>
-        </w:rPr>
-        <w:t>..........................................................................................</w:t>
+        <w:t xml:space="preserve"> Để đun sôi một ấm nước, nhiệt lượng cần cung cấp cho nước phụ thuộc vào khối lượng của nước, độ tăng nhiệt độ và yếu tố nào khác của chất làm ấm và chất lỏng?</w:t>
       </w:r>
     </w:p>
     <w:p>
@@ -1246,45 +1876,7 @@
           <w:color w:val="000000"/>
           <w:sz w:val="26"/>
         </w:rPr>
-        <w:t xml:space="preserve">  Công thức tính nhiệt lượng thu vào để tăng nhiệt độ từ </w:t>
-      </w:r>
-      <w:r>
-        <w:rPr>
-          <w:rFonts w:ascii="Times New Roman" w:hAnsi="Times New Roman"/>
-          <w:i/>
-          <w:color w:val="000000"/>
-          <w:sz w:val="26"/>
-        </w:rPr>
-        <w:t>t_1</w:t>
-      </w:r>
-      <w:r>
-        <w:rPr>
-          <w:rFonts w:ascii="Times New Roman" w:hAnsi="Times New Roman"/>
-          <w:b w:val="0"/>
-          <w:i w:val="0"/>
-          <w:color w:val="000000"/>
-          <w:sz w:val="26"/>
-        </w:rPr>
-        <w:t xml:space="preserve"> lên </w:t>
-      </w:r>
-      <w:r>
-        <w:rPr>
-          <w:rFonts w:ascii="Times New Roman" w:hAnsi="Times New Roman"/>
-          <w:i/>
-          <w:color w:val="000000"/>
-          <w:sz w:val="26"/>
-        </w:rPr>
-        <w:t>t_2</w:t>
-      </w:r>
-      <w:r>
-        <w:rPr>
-          <w:rFonts w:ascii="Times New Roman" w:hAnsi="Times New Roman"/>
-          <w:b w:val="0"/>
-          <w:i w:val="0"/>
-          <w:color w:val="000000"/>
-          <w:sz w:val="26"/>
-        </w:rPr>
-        <w:t>: ==</w:t>
+        <w:t xml:space="preserve">  Công thức tính nhiệt lượng thu vào/tỏa ra khi thay đổi nhiệt độ: ==</w:t>
       </w:r>
       <w:r>
         <w:rPr>
@@ -1504,7 +2096,7 @@
           <w:color w:val="000000"/>
           <w:sz w:val="26"/>
         </w:rPr>
-        <w:t>3. Vận dụng (Nhiệm vụ 4: Thực tế đun nước)</w:t>
+        <w:t>3. Vận dụng (Nhiệm vụ đun ấm nước nhôm)</w:t>
       </w:r>
     </w:p>
     <w:p>
@@ -1531,7 +2123,7 @@
           <w:color w:val="000000"/>
           <w:sz w:val="26"/>
         </w:rPr>
-        <w:t xml:space="preserve"> Một ấm đun nước bằng nhôm có khối lượng </w:t>
+        <w:t xml:space="preserve"> Một ấm đun nước bằng nhôm khối lượng </w:t>
       </w:r>
       <w:r>
         <w:rPr>
@@ -1540,7 +2132,9 @@
           <w:color w:val="000000"/>
           <w:sz w:val="26"/>
         </w:rPr>
-        <w:t>m_1 = 0,5 kg</w:t>
+        <w:t>m_1 = 0,5</w:t>
+        <w:tab/>
+        <w:t>ext{ kg}</w:t>
       </w:r>
       <w:r>
         <w:rPr>
@@ -1559,7 +2153,9 @@
           <w:color w:val="000000"/>
           <w:sz w:val="26"/>
         </w:rPr>
-        <w:t>m_2 = 2 kg</w:t>
+        <w:t>m_2 = 2</w:t>
+        <w:tab/>
+        <w:t>ext{ kg}</w:t>
       </w:r>
       <w:r>
         <w:rPr>
@@ -1588,7 +2184,7 @@
           <w:color w:val="000000"/>
           <w:sz w:val="26"/>
         </w:rPr>
-        <w:t>. Cần cung cấp một nhiệt lượng bao nhiêu để đun sôi lượng nước này (</w:t>
+        <w:t>. Đun sôi lượng nước này (</w:t>
       </w:r>
       <w:r>
         <w:rPr>
@@ -1616,7 +2212,9 @@
           <w:color w:val="000000"/>
           <w:sz w:val="26"/>
         </w:rPr>
-        <w:t>c_1 = 880 J/kg.K</w:t>
+        <w:t>c_1 = 880</w:t>
+        <w:tab/>
+        <w:t>ext{ J/kg.K}</w:t>
       </w:r>
       <w:r>
         <w:rPr>
@@ -1626,7 +2224,7 @@
           <w:color w:val="000000"/>
           <w:sz w:val="26"/>
         </w:rPr>
-        <w:t xml:space="preserve"> và của nước </w:t>
+        <w:t xml:space="preserve">, của nước </w:t>
       </w:r>
       <w:r>
         <w:rPr>
@@ -1635,7 +2233,9 @@
           <w:color w:val="000000"/>
           <w:sz w:val="26"/>
         </w:rPr>
-        <w:t>c_2 = 4200 J/kg.K</w:t>
+        <w:t>c_2 = 4200</w:t>
+        <w:tab/>
+        <w:t>ext{ J/kg.K}</w:t>
       </w:r>
       <w:r>
         <w:rPr>
@@ -1645,7 +2245,7 @@
           <w:color w:val="000000"/>
           <w:sz w:val="26"/>
         </w:rPr>
-        <w:t>. Bỏ qua hao phí nhiệt ra môi trường.</w:t>
+        <w:t>. Bỏ qua hao phí nhiệt.</w:t>
       </w:r>
     </w:p>
     <w:p>
@@ -1690,7 +2290,7 @@
           <w:color w:val="000000"/>
           <w:sz w:val="26"/>
         </w:rPr>
-        <w:t xml:space="preserve"> Tính tổng nhiệt lượng cần cung cấp cho ấm và nước.</w:t>
+        <w:t xml:space="preserve"> Tính tổng nhiệt lượng cần cung cấp cho cả ấm nhôm và nước.</w:t>
       </w:r>
     </w:p>
     <w:p>
@@ -1706,6 +2306,389 @@
           <w:sz w:val="22"/>
         </w:rPr>
         <w:t>..........................................................................................</w:t>
+      </w:r>
+    </w:p>
+    <w:p>
+      <w:pPr>
+        <w:spacing w:before="40" w:after="40"/>
+        <w:ind w:left="567"/>
+        <w:jc w:val="left"/>
+      </w:pPr>
+      <w:r>
+        <w:rPr>
+          <w:rFonts w:ascii="Times New Roman" w:hAnsi="Times New Roman"/>
+          <w:color w:val="666666"/>
+          <w:sz w:val="22"/>
+        </w:rPr>
+        <w:t>..........................................................................................</w:t>
+      </w:r>
+    </w:p>
+    <w:p>
+      <w:pPr>
+        <w:spacing w:before="40" w:after="40"/>
+        <w:ind w:left="567"/>
+        <w:jc w:val="left"/>
+      </w:pPr>
+      <w:r>
+        <w:rPr>
+          <w:rFonts w:ascii="Times New Roman" w:hAnsi="Times New Roman"/>
+          <w:color w:val="666666"/>
+          <w:sz w:val="22"/>
+        </w:rPr>
+        <w:t>..........................................................................................</w:t>
+      </w:r>
+    </w:p>
+    <w:p>
+      <w:pPr>
+        <w:spacing w:before="120" w:after="120" w:line="312" w:lineRule="auto"/>
+        <w:ind w:left="0" w:firstLine="567"/>
+        <w:jc w:val="both"/>
+      </w:pPr>
+      <w:r>
+        <w:rPr>
+          <w:rFonts w:ascii="Times New Roman" w:hAnsi="Times New Roman"/>
+          <w:b w:val="0"/>
+          <w:i w:val="0"/>
+          <w:color w:val="000000"/>
+          <w:sz w:val="26"/>
+        </w:rPr>
+        <w:t>---</w:t>
+      </w:r>
+    </w:p>
+    <w:p>
+      <w:pPr>
+        <w:pStyle w:val="Heading1"/>
+        <w:keepNext/>
+        <w:spacing w:before="240" w:after="120"/>
+        <w:ind w:left="0" w:firstLine="0"/>
+      </w:pPr>
+      <w:r>
+        <w:rPr>
+          <w:rFonts w:ascii="Times New Roman" w:hAnsi="Times New Roman"/>
+          <w:b/>
+          <w:i w:val="0"/>
+          <w:color w:val="1F4E79"/>
+          <w:sz w:val="28"/>
+        </w:rPr>
+        <w:t>📍 ĐVKT 5: KHÁI NIỆM NHIỆT DUNG RIÊNG CỦA CHẤT</w:t>
+      </w:r>
+    </w:p>
+    <w:p>
+      <w:pPr>
+        <w:pStyle w:val="Heading2"/>
+        <w:keepNext/>
+        <w:spacing w:before="160" w:after="80"/>
+        <w:ind w:left="0" w:firstLine="0"/>
+      </w:pPr>
+      <w:r>
+        <w:rPr>
+          <w:rFonts w:ascii="Times New Roman" w:hAnsi="Times New Roman"/>
+          <w:b/>
+          <w:i w:val="0"/>
+          <w:color w:val="000000"/>
+          <w:sz w:val="26"/>
+        </w:rPr>
+        <w:t>1. Khám phá (Nhiệm vụ 5: Đun nóng nước và rượu)</w:t>
+      </w:r>
+    </w:p>
+    <w:p>
+      <w:pPr>
+        <w:spacing w:before="120" w:after="120" w:line="312" w:lineRule="auto"/>
+        <w:ind w:left="0" w:firstLine="567"/>
+        <w:jc w:val="both"/>
+      </w:pPr>
+      <w:r>
+        <w:rPr>
+          <w:rFonts w:ascii="Times New Roman" w:hAnsi="Times New Roman"/>
+          <w:b/>
+          <w:i w:val="0"/>
+          <w:color w:val="000000"/>
+          <w:sz w:val="26"/>
+        </w:rPr>
+        <w:t>Thực nghiệm:</w:t>
+      </w:r>
+      <w:r>
+        <w:rPr>
+          <w:rFonts w:ascii="Times New Roman" w:hAnsi="Times New Roman"/>
+          <w:b w:val="0"/>
+          <w:i w:val="0"/>
+          <w:color w:val="000000"/>
+          <w:sz w:val="26"/>
+        </w:rPr>
+        <w:t xml:space="preserve"> Đun nóng </w:t>
+      </w:r>
+      <w:r>
+        <w:rPr>
+          <w:rFonts w:ascii="Times New Roman" w:hAnsi="Times New Roman"/>
+          <w:i/>
+          <w:color w:val="000000"/>
+          <w:sz w:val="26"/>
+        </w:rPr>
+        <w:t>100</w:t>
+        <w:tab/>
+        <w:t>ext{ g}</w:t>
+      </w:r>
+      <w:r>
+        <w:rPr>
+          <w:rFonts w:ascii="Times New Roman" w:hAnsi="Times New Roman"/>
+          <w:b w:val="0"/>
+          <w:i w:val="0"/>
+          <w:color w:val="000000"/>
+          <w:sz w:val="26"/>
+        </w:rPr>
+        <w:t xml:space="preserve"> nước và </w:t>
+      </w:r>
+      <w:r>
+        <w:rPr>
+          <w:rFonts w:ascii="Times New Roman" w:hAnsi="Times New Roman"/>
+          <w:i/>
+          <w:color w:val="000000"/>
+          <w:sz w:val="26"/>
+        </w:rPr>
+        <w:t>100</w:t>
+        <w:tab/>
+        <w:t>ext{ g}</w:t>
+      </w:r>
+      <w:r>
+        <w:rPr>
+          <w:rFonts w:ascii="Times New Roman" w:hAnsi="Times New Roman"/>
+          <w:b w:val="0"/>
+          <w:i w:val="0"/>
+          <w:color w:val="000000"/>
+          <w:sz w:val="26"/>
+        </w:rPr>
+        <w:t xml:space="preserve"> rượu bằng hai nguồn nhiệt giống nhau trong cùng thời gian. Kết quả cho thấy rượu tăng nhiệt độ nhanh hơn nhiều so với nước.</w:t>
+      </w:r>
+    </w:p>
+    <w:p>
+      <w:pPr>
+        <w:spacing w:before="60" w:after="60" w:line="312" w:lineRule="auto"/>
+        <w:ind w:left="283" w:hanging="170"/>
+        <w:jc w:val="both"/>
+      </w:pPr>
+      <w:r>
+        <w:rPr>
+          <w:rFonts w:ascii="Times New Roman" w:hAnsi="Times New Roman"/>
+          <w:color w:val="000000"/>
+          <w:sz w:val="26"/>
+        </w:rPr>
+        <w:t xml:space="preserve">- </w:t>
+      </w:r>
+      <w:r>
+        <w:rPr>
+          <w:rFonts w:ascii="Times New Roman" w:hAnsi="Times New Roman"/>
+          <w:b w:val="0"/>
+          <w:i w:val="0"/>
+          <w:color w:val="000000"/>
+          <w:sz w:val="26"/>
+        </w:rPr>
+        <w:t xml:space="preserve">  </w:t>
+      </w:r>
+      <w:r>
+        <w:rPr>
+          <w:rFonts w:ascii="Times New Roman" w:hAnsi="Times New Roman"/>
+          <w:b/>
+          <w:i w:val="0"/>
+          <w:color w:val="000000"/>
+          <w:sz w:val="26"/>
+        </w:rPr>
+        <w:t>Câu hỏi:</w:t>
+      </w:r>
+      <w:r>
+        <w:rPr>
+          <w:rFonts w:ascii="Times New Roman" w:hAnsi="Times New Roman"/>
+          <w:b w:val="0"/>
+          <w:i w:val="0"/>
+          <w:color w:val="000000"/>
+          <w:sz w:val="26"/>
+        </w:rPr>
+        <w:t xml:space="preserve"> Tại sao cùng nhận một lượng nhiệt và cùng khối lượng, nhưng độ tăng nhiệt độ của rượu lại lớn hơn nước? Đại lượng nào đặc trưng cho tính chất này?</w:t>
+      </w:r>
+    </w:p>
+    <w:p>
+      <w:pPr>
+        <w:spacing w:before="40" w:after="40"/>
+        <w:ind w:left="567"/>
+        <w:jc w:val="left"/>
+      </w:pPr>
+      <w:r>
+        <w:rPr>
+          <w:rFonts w:ascii="Times New Roman" w:hAnsi="Times New Roman"/>
+          <w:color w:val="666666"/>
+          <w:sz w:val="22"/>
+        </w:rPr>
+        <w:t>..........................................................................................</w:t>
+      </w:r>
+    </w:p>
+    <w:p>
+      <w:pPr>
+        <w:spacing w:before="40" w:after="40"/>
+        <w:ind w:left="567"/>
+        <w:jc w:val="left"/>
+      </w:pPr>
+      <w:r>
+        <w:rPr>
+          <w:rFonts w:ascii="Times New Roman" w:hAnsi="Times New Roman"/>
+          <w:color w:val="666666"/>
+          <w:sz w:val="22"/>
+        </w:rPr>
+        <w:t>..........................................................................................</w:t>
+      </w:r>
+    </w:p>
+    <w:p>
+      <w:pPr>
+        <w:pStyle w:val="Heading2"/>
+        <w:keepNext/>
+        <w:spacing w:before="160" w:after="80"/>
+        <w:ind w:left="0" w:firstLine="0"/>
+      </w:pPr>
+      <w:r>
+        <w:rPr>
+          <w:rFonts w:ascii="Times New Roman" w:hAnsi="Times New Roman"/>
+          <w:b/>
+          <w:i w:val="0"/>
+          <w:color w:val="000000"/>
+          <w:sz w:val="26"/>
+        </w:rPr>
+        <w:t>2. Trọng tâm (Ý nghĩa nhiệt dung riêng)</w:t>
+      </w:r>
+    </w:p>
+    <w:p>
+      <w:pPr>
+        <w:spacing w:before="60" w:after="60" w:line="312" w:lineRule="auto"/>
+        <w:ind w:left="283" w:hanging="170"/>
+        <w:jc w:val="both"/>
+      </w:pPr>
+      <w:r>
+        <w:rPr>
+          <w:rFonts w:ascii="Times New Roman" w:hAnsi="Times New Roman"/>
+          <w:color w:val="000000"/>
+          <w:sz w:val="26"/>
+        </w:rPr>
+        <w:t xml:space="preserve">- </w:t>
+      </w:r>
+      <w:r>
+        <w:rPr>
+          <w:rFonts w:ascii="Times New Roman" w:hAnsi="Times New Roman"/>
+          <w:b w:val="0"/>
+          <w:i w:val="0"/>
+          <w:color w:val="000000"/>
+          <w:sz w:val="26"/>
+        </w:rPr>
+        <w:t xml:space="preserve">  Nhiệt dung riêng của một chất là lượng nhiệt cần truyền cho (1) .................... chất đó để tăng thêm (2) ....................</w:t>
+      </w:r>
+    </w:p>
+    <w:p>
+      <w:pPr>
+        <w:spacing w:before="60" w:after="60" w:line="312" w:lineRule="auto"/>
+        <w:ind w:left="283" w:hanging="170"/>
+        <w:jc w:val="both"/>
+      </w:pPr>
+      <w:r>
+        <w:rPr>
+          <w:rFonts w:ascii="Times New Roman" w:hAnsi="Times New Roman"/>
+          <w:color w:val="000000"/>
+          <w:sz w:val="26"/>
+        </w:rPr>
+        <w:t xml:space="preserve">- </w:t>
+      </w:r>
+      <w:r>
+        <w:rPr>
+          <w:rFonts w:ascii="Times New Roman" w:hAnsi="Times New Roman"/>
+          <w:b w:val="0"/>
+          <w:i w:val="0"/>
+          <w:color w:val="000000"/>
+          <w:sz w:val="26"/>
+        </w:rPr>
+        <w:t xml:space="preserve">  Đơn vị của nhiệt dung riêng là (3) ....................</w:t>
+      </w:r>
+    </w:p>
+    <w:p>
+      <w:pPr>
+        <w:spacing w:before="60" w:after="60" w:line="312" w:lineRule="auto"/>
+        <w:ind w:left="283" w:hanging="170"/>
+        <w:jc w:val="both"/>
+      </w:pPr>
+      <w:r>
+        <w:rPr>
+          <w:rFonts w:ascii="Times New Roman" w:hAnsi="Times New Roman"/>
+          <w:color w:val="000000"/>
+          <w:sz w:val="26"/>
+        </w:rPr>
+        <w:t xml:space="preserve">- </w:t>
+      </w:r>
+      <w:r>
+        <w:rPr>
+          <w:rFonts w:ascii="Times New Roman" w:hAnsi="Times New Roman"/>
+          <w:b w:val="0"/>
+          <w:i w:val="0"/>
+          <w:color w:val="000000"/>
+          <w:sz w:val="26"/>
+        </w:rPr>
+        <w:t xml:space="preserve">  *Gợi ý từ khóa:* 1 kg, 1 K (hoặc 1 độ C), J/kg.K.</w:t>
+      </w:r>
+    </w:p>
+    <w:p>
+      <w:pPr>
+        <w:pStyle w:val="Heading2"/>
+        <w:keepNext/>
+        <w:spacing w:before="160" w:after="80"/>
+        <w:ind w:left="0" w:firstLine="0"/>
+      </w:pPr>
+      <w:r>
+        <w:rPr>
+          <w:rFonts w:ascii="Times New Roman" w:hAnsi="Times New Roman"/>
+          <w:b/>
+          <w:i w:val="0"/>
+          <w:color w:val="000000"/>
+          <w:sz w:val="26"/>
+        </w:rPr>
+        <w:t>3. Vận dụng (Thời tiết và Địa lý)</w:t>
+      </w:r>
+    </w:p>
+    <w:p>
+      <w:pPr>
+        <w:spacing w:before="60" w:after="60" w:line="312" w:lineRule="auto"/>
+        <w:ind w:left="283" w:hanging="170"/>
+        <w:jc w:val="both"/>
+      </w:pPr>
+      <w:r>
+        <w:rPr>
+          <w:rFonts w:ascii="Times New Roman" w:hAnsi="Times New Roman"/>
+          <w:color w:val="000000"/>
+          <w:sz w:val="26"/>
+        </w:rPr>
+        <w:t xml:space="preserve">- </w:t>
+      </w:r>
+      <w:r>
+        <w:rPr>
+          <w:rFonts w:ascii="Times New Roman" w:hAnsi="Times New Roman"/>
+          <w:b w:val="0"/>
+          <w:i w:val="0"/>
+          <w:color w:val="000000"/>
+          <w:sz w:val="26"/>
+        </w:rPr>
+        <w:t xml:space="preserve">  </w:t>
+      </w:r>
+      <w:r>
+        <w:rPr>
+          <w:rFonts w:ascii="Times New Roman" w:hAnsi="Times New Roman"/>
+          <w:b/>
+          <w:i w:val="0"/>
+          <w:color w:val="000000"/>
+          <w:sz w:val="26"/>
+        </w:rPr>
+        <w:t>Câu hỏi:</w:t>
+      </w:r>
+      <w:r>
+        <w:rPr>
+          <w:rFonts w:ascii="Times New Roman" w:hAnsi="Times New Roman"/>
+          <w:b w:val="0"/>
+          <w:i w:val="0"/>
+          <w:color w:val="000000"/>
+          <w:sz w:val="26"/>
+        </w:rPr>
+        <w:t xml:space="preserve"> Ban ngày trời nắng, cát ở bãi biển rất nóng nhưng nước biển vẫn mát. Ban đêm thì ngược lại. Hãy giải thích hiện tượng này dựa vào nhiệt dung riêng của cát và nước.</w:t>
       </w:r>
     </w:p>
     <w:p>
@@ -1797,7 +2780,9 @@
           <w:color w:val="000000"/>
           <w:sz w:val="26"/>
         </w:rPr>
-        <w:t>4200 J/kg.K</w:t>
+        <w:t>4200</w:t>
+        <w:tab/>
+        <w:t>ext{ J/kg.K}</w:t>
       </w:r>
       <w:r>
         <w:rPr>
@@ -1807,24 +2792,7 @@
           <w:color w:val="000000"/>
           <w:sz w:val="26"/>
         </w:rPr>
-        <w:t>) so với đất đá hay không khí. Điều này giải thích tại sao vùng ven biển có khí hậu điều hòa ôn hòa hơn sâu trong lục địa. Ban ngày dưới nắng gắt, nước biển hấp thụ nhiệt tăng nhiệt độ chậm; ban đêm khi trời lạnh, nước tỏa nhiệt giảm nhiệt độ từ từ. Sự chênh lệch nhiệt dung riêng này cũng tạo ra các luồng gió biển thổi luân phiên ngày và đêm.</w:t>
-      </w:r>
-    </w:p>
-    <w:p>
-      <w:pPr>
-        <w:spacing w:before="120" w:after="120" w:line="312" w:lineRule="auto"/>
-        <w:ind w:left="567" w:firstLine="0"/>
-        <w:jc w:val="both"/>
-      </w:pPr>
-      <w:r>
-        <w:rPr>
-          <w:rFonts w:ascii="Times New Roman" w:hAnsi="Times New Roman"/>
-          <w:b w:val="0"/>
-          <w:i/>
-          <w:color w:val="000000"/>
-          <w:sz w:val="26"/>
-        </w:rPr>
-        <w:t>*(Nguồn: Khí tượng thủy văn đại cương - NXB Địa chất)*</w:t>
+        <w:t>) làm ôn hòa khí hậu vùng biển. Ban ngày nước biển hấp thụ nhiệt tăng nhiệt độ chậm; ban đêm nước tỏa nhiệt giảm nhiệt độ từ từ. Sự chênh lệch nhiệt độ này tạo ra gió biển thổi luân phiên ngày và đêm.</w:t>
       </w:r>
     </w:p>
     <w:p>

</xml_diff>

<commit_message>
Restructure PHT to match lesson plan (KHBD) flow of activities
</commit_message>
<xml_diff>
--- a/agent soạn tài liệu/output/bai3_noi_nang_nhiet_luong/ready/bai3_noi_nang_nhiet_luong_phieu_hoc_tap.docx
+++ b/agent soạn tài liệu/output/bai3_noi_nang_nhiet_luong/ready/bai3_noi_nang_nhiet_luong_phieu_hoc_tap.docx
@@ -283,7 +283,7 @@
           <w:color w:val="1F4E79"/>
           <w:sz w:val="28"/>
         </w:rPr>
-        <w:t>📍 ĐVKT 1: KHÁI NIỆM NỘI NĂNG CỦA VẬT</w:t>
+        <w:t>I. PHẦN HÌNH THÀNH KIẾN THỨC MỚI (TƯƠNG ỨNG HOẠT ĐỘNG 2)</w:t>
       </w:r>
     </w:p>
     <w:p>
@@ -301,7 +301,7 @@
           <w:color w:val="000000"/>
           <w:sz w:val="26"/>
         </w:rPr>
-        <w:t>1. Khám phá (Nhiệm vụ 1: Năng lượng vi mô phân tử)</w:t>
+        <w:t>📍 ĐVKT 1: KHÁI NIỆM NỘI NĂNG CỦA VẬT</w:t>
       </w:r>
     </w:p>
     <w:p>
@@ -336,7 +336,7 @@
           <w:color w:val="000000"/>
           <w:sz w:val="26"/>
         </w:rPr>
-        <w:t>Câu hỏi:</w:t>
+        <w:t>Nhiệm vụ 1 (Khám phá):</w:t>
       </w:r>
       <w:r>
         <w:rPr>
@@ -381,11 +381,28 @@
     </w:p>
     <w:p>
       <w:pPr>
-        <w:pStyle w:val="Heading2"/>
-        <w:keepNext/>
-        <w:spacing w:before="160" w:after="80"/>
-        <w:ind w:left="0" w:firstLine="0"/>
+        <w:spacing w:before="60" w:after="60" w:line="312" w:lineRule="auto"/>
+        <w:ind w:left="283" w:hanging="170"/>
+        <w:jc w:val="both"/>
       </w:pPr>
+      <w:r>
+        <w:rPr>
+          <w:rFonts w:ascii="Times New Roman" w:hAnsi="Times New Roman"/>
+          <w:color w:val="000000"/>
+          <w:sz w:val="26"/>
+        </w:rPr>
+        <w:t xml:space="preserve">- </w:t>
+      </w:r>
+      <w:r>
+        <w:rPr>
+          <w:rFonts w:ascii="Times New Roman" w:hAnsi="Times New Roman"/>
+          <w:b w:val="0"/>
+          <w:i w:val="0"/>
+          <w:color w:val="000000"/>
+          <w:sz w:val="26"/>
+        </w:rPr>
+        <w:t xml:space="preserve">  </w:t>
+      </w:r>
       <w:r>
         <w:rPr>
           <w:rFonts w:ascii="Times New Roman" w:hAnsi="Times New Roman"/>
@@ -394,7 +411,7 @@
           <w:color w:val="000000"/>
           <w:sz w:val="26"/>
         </w:rPr>
-        <w:t>2. Trọng tâm (Khái niệm nội năng)</w:t>
+        <w:t>Trọng tâm (Khái niệm nội năng):</w:t>
       </w:r>
     </w:p>
     <w:p>
@@ -525,7 +542,7 @@
           <w:color w:val="000000"/>
           <w:sz w:val="26"/>
         </w:rPr>
-        <w:t>3. Vận dụng (Nhiệt độ và nội năng)</w:t>
+        <w:t>📍 ĐVKT 2: CÁC CÁCH LÀM BIẾN ĐỔI NỘI NĂNG</w:t>
       </w:r>
     </w:p>
     <w:p>
@@ -560,7 +577,7 @@
           <w:color w:val="000000"/>
           <w:sz w:val="26"/>
         </w:rPr>
-        <w:t>Câu hỏi:</w:t>
+        <w:t>Nhiệm vụ 2 (Khám phá):</w:t>
       </w:r>
       <w:r>
         <w:rPr>
@@ -570,7 +587,7 @@
           <w:color w:val="000000"/>
           <w:sz w:val="26"/>
         </w:rPr>
-        <w:t xml:space="preserve"> Khi ta tăng nhiệt độ của một lượng khí lí tưởng đựng trong một bình kín (thể tích không đổi), nội năng của khí thay đổi như thế nào? Giải thích dựa trên động lực học phân tử.</w:t>
+        <w:t xml:space="preserve"> Một ống nghiệm chứa ete được đậy nút cao su kín. Nếu ta cọ xát mạnh thành ống hoặc đun nóng nhẹ đáy ống, nút cao su sẽ bật ra. Nội năng của ete đã thay đổi bằng những cách nào? Mô tả quá trình biến đổi năng lượng tương ứng.</w:t>
       </w:r>
     </w:p>
     <w:p>
@@ -605,86 +622,6 @@
     </w:p>
     <w:p>
       <w:pPr>
-        <w:spacing w:before="120" w:after="120" w:line="312" w:lineRule="auto"/>
-        <w:ind w:left="0" w:firstLine="567"/>
-        <w:jc w:val="both"/>
-      </w:pPr>
-      <w:r>
-        <w:rPr>
-          <w:rFonts w:ascii="Times New Roman" w:hAnsi="Times New Roman"/>
-          <w:b w:val="0"/>
-          <w:i w:val="0"/>
-          <w:color w:val="000000"/>
-          <w:sz w:val="26"/>
-        </w:rPr>
-        <w:t>---</w:t>
-      </w:r>
-    </w:p>
-    <w:p>
-      <w:pPr>
-        <w:pStyle w:val="Heading1"/>
-        <w:keepNext/>
-        <w:spacing w:before="240" w:after="120"/>
-        <w:ind w:left="0" w:firstLine="0"/>
-      </w:pPr>
-      <w:r>
-        <w:rPr>
-          <w:rFonts w:ascii="Times New Roman" w:hAnsi="Times New Roman"/>
-          <w:b/>
-          <w:i w:val="0"/>
-          <w:color w:val="1F4E79"/>
-          <w:sz w:val="28"/>
-        </w:rPr>
-        <w:t>📍 ĐVKT 2: CÁC CÁCH LÀM BIẾN ĐỔI NỘI NĂNG</w:t>
-      </w:r>
-    </w:p>
-    <w:p>
-      <w:pPr>
-        <w:pStyle w:val="Heading2"/>
-        <w:keepNext/>
-        <w:spacing w:before="160" w:after="80"/>
-        <w:ind w:left="0" w:firstLine="0"/>
-      </w:pPr>
-      <w:r>
-        <w:rPr>
-          <w:rFonts w:ascii="Times New Roman" w:hAnsi="Times New Roman"/>
-          <w:b/>
-          <w:i w:val="0"/>
-          <w:color w:val="000000"/>
-          <w:sz w:val="26"/>
-        </w:rPr>
-        <w:t>1. Khám phá (Nhiệm vụ 2: Thí nghiệm ống ete bật nút)</w:t>
-      </w:r>
-    </w:p>
-    <w:p>
-      <w:pPr>
-        <w:spacing w:before="120" w:after="120" w:line="312" w:lineRule="auto"/>
-        <w:ind w:left="0" w:firstLine="567"/>
-        <w:jc w:val="both"/>
-      </w:pPr>
-      <w:r>
-        <w:rPr>
-          <w:rFonts w:ascii="Times New Roman" w:hAnsi="Times New Roman"/>
-          <w:b/>
-          <w:i w:val="0"/>
-          <w:color w:val="000000"/>
-          <w:sz w:val="26"/>
-        </w:rPr>
-        <w:t>Tình huống:</w:t>
-      </w:r>
-      <w:r>
-        <w:rPr>
-          <w:rFonts w:ascii="Times New Roman" w:hAnsi="Times New Roman"/>
-          <w:b w:val="0"/>
-          <w:i w:val="0"/>
-          <w:color w:val="000000"/>
-          <w:sz w:val="26"/>
-        </w:rPr>
-        <w:t xml:space="preserve"> Một ống nghiệm chứa ete được đậy nút cao su kín. Nếu ta tiến hành cọ xát mạnh thành ống nghiệm hoặc đun nóng nhẹ đáy ống, nút cao su sẽ bật ra.</w:t>
-      </w:r>
-    </w:p>
-    <w:p>
-      <w:pPr>
         <w:spacing w:before="60" w:after="60" w:line="312" w:lineRule="auto"/>
         <w:ind w:left="283" w:hanging="170"/>
         <w:jc w:val="both"/>
@@ -715,65 +652,7 @@
           <w:color w:val="000000"/>
           <w:sz w:val="26"/>
         </w:rPr>
-        <w:t>Câu hỏi:</w:t>
-      </w:r>
-      <w:r>
-        <w:rPr>
-          <w:rFonts w:ascii="Times New Roman" w:hAnsi="Times New Roman"/>
-          <w:b w:val="0"/>
-          <w:i w:val="0"/>
-          <w:color w:val="000000"/>
-          <w:sz w:val="26"/>
-        </w:rPr>
-        <w:t xml:space="preserve"> Nội năng của hơi ete trong ống nghiệm đã thay đổi bằng những cách nào trong hai trường hợp trên? Hãy mô tả quá trình biến đổi năng lượng tương ứng.</w:t>
-      </w:r>
-    </w:p>
-    <w:p>
-      <w:pPr>
-        <w:spacing w:before="40" w:after="40"/>
-        <w:ind w:left="567"/>
-        <w:jc w:val="left"/>
-      </w:pPr>
-      <w:r>
-        <w:rPr>
-          <w:rFonts w:ascii="Times New Roman" w:hAnsi="Times New Roman"/>
-          <w:color w:val="666666"/>
-          <w:sz w:val="22"/>
-        </w:rPr>
-        <w:t>..........................................................................................</w:t>
-      </w:r>
-    </w:p>
-    <w:p>
-      <w:pPr>
-        <w:spacing w:before="40" w:after="40"/>
-        <w:ind w:left="567"/>
-        <w:jc w:val="left"/>
-      </w:pPr>
-      <w:r>
-        <w:rPr>
-          <w:rFonts w:ascii="Times New Roman" w:hAnsi="Times New Roman"/>
-          <w:color w:val="666666"/>
-          <w:sz w:val="22"/>
-        </w:rPr>
-        <w:t>..........................................................................................</w:t>
-      </w:r>
-    </w:p>
-    <w:p>
-      <w:pPr>
-        <w:pStyle w:val="Heading2"/>
-        <w:keepNext/>
-        <w:spacing w:before="160" w:after="80"/>
-        <w:ind w:left="0" w:firstLine="0"/>
-      </w:pPr>
-      <w:r>
-        <w:rPr>
-          <w:rFonts w:ascii="Times New Roman" w:hAnsi="Times New Roman"/>
-          <w:b/>
-          <w:i w:val="0"/>
-          <w:color w:val="000000"/>
-          <w:sz w:val="26"/>
-        </w:rPr>
-        <w:t>2. Trọng tâm (Thực hiện công và Truyền nhiệt)</w:t>
+        <w:t>Trọng tâm (Thực hiện công và Truyền nhiệt):</w:t>
       </w:r>
     </w:p>
     <w:p>
@@ -891,7 +770,7 @@
           <w:color w:val="000000"/>
           <w:sz w:val="26"/>
         </w:rPr>
-        <w:t>3. Vận dụng (Tình huống thực tế)</w:t>
+        <w:t>📍 ĐVKT 3: NGUYÊN LÍ I NHIỆT ĐỘNG LỰC HỌC</w:t>
       </w:r>
     </w:p>
     <w:p>
@@ -926,7 +805,7 @@
           <w:color w:val="000000"/>
           <w:sz w:val="26"/>
         </w:rPr>
-        <w:t>Câu hỏi:</w:t>
+        <w:t>Nhiệm vụ 3 (Khám phá):</w:t>
       </w:r>
       <w:r>
         <w:rPr>
@@ -936,135 +815,7 @@
           <w:color w:val="000000"/>
           <w:sz w:val="26"/>
         </w:rPr>
-        <w:t xml:space="preserve"> Việc “bơm xe đạp bằng tay làm ống bơm nóng lên” và “thả chiếc thìa nhôm nóng vào cốc nước lạnh làm thìa nguội đi” thuộc cách biến đổi nội năng nào? Giải thích ngắn gọn.</w:t>
-      </w:r>
-    </w:p>
-    <w:p>
-      <w:pPr>
-        <w:spacing w:before="40" w:after="40"/>
-        <w:ind w:left="567"/>
-        <w:jc w:val="left"/>
-      </w:pPr>
-      <w:r>
-        <w:rPr>
-          <w:rFonts w:ascii="Times New Roman" w:hAnsi="Times New Roman"/>
-          <w:color w:val="666666"/>
-          <w:sz w:val="22"/>
-        </w:rPr>
-        <w:t>..........................................................................................</w:t>
-      </w:r>
-    </w:p>
-    <w:p>
-      <w:pPr>
-        <w:spacing w:before="40" w:after="40"/>
-        <w:ind w:left="567"/>
-        <w:jc w:val="left"/>
-      </w:pPr>
-      <w:r>
-        <w:rPr>
-          <w:rFonts w:ascii="Times New Roman" w:hAnsi="Times New Roman"/>
-          <w:color w:val="666666"/>
-          <w:sz w:val="22"/>
-        </w:rPr>
-        <w:t>..........................................................................................</w:t>
-      </w:r>
-    </w:p>
-    <w:p>
-      <w:pPr>
-        <w:spacing w:before="120" w:after="120" w:line="312" w:lineRule="auto"/>
-        <w:ind w:left="0" w:firstLine="567"/>
-        <w:jc w:val="both"/>
-      </w:pPr>
-      <w:r>
-        <w:rPr>
-          <w:rFonts w:ascii="Times New Roman" w:hAnsi="Times New Roman"/>
-          <w:b w:val="0"/>
-          <w:i w:val="0"/>
-          <w:color w:val="000000"/>
-          <w:sz w:val="26"/>
-        </w:rPr>
-        <w:t>---</w:t>
-      </w:r>
-    </w:p>
-    <w:p>
-      <w:pPr>
-        <w:pStyle w:val="Heading1"/>
-        <w:keepNext/>
-        <w:spacing w:before="240" w:after="120"/>
-        <w:ind w:left="0" w:firstLine="0"/>
-      </w:pPr>
-      <w:r>
-        <w:rPr>
-          <w:rFonts w:ascii="Times New Roman" w:hAnsi="Times New Roman"/>
-          <w:b/>
-          <w:i w:val="0"/>
-          <w:color w:val="1F4E79"/>
-          <w:sz w:val="28"/>
-        </w:rPr>
-        <w:t>📍 ĐVKT 3: NGUYÊN LÍ I NHIỆT ĐỘNG LỰC HỌC</w:t>
-      </w:r>
-    </w:p>
-    <w:p>
-      <w:pPr>
-        <w:pStyle w:val="Heading2"/>
-        <w:keepNext/>
-        <w:spacing w:before="160" w:after="80"/>
-        <w:ind w:left="0" w:firstLine="0"/>
-      </w:pPr>
-      <w:r>
-        <w:rPr>
-          <w:rFonts w:ascii="Times New Roman" w:hAnsi="Times New Roman"/>
-          <w:b/>
-          <w:i w:val="0"/>
-          <w:color w:val="000000"/>
-          <w:sz w:val="26"/>
-        </w:rPr>
-        <w:t>1. Khám phá (Nhiệm vụ 3: Hệ thức Nguyên lí I)</w:t>
-      </w:r>
-    </w:p>
-    <w:p>
-      <w:pPr>
-        <w:spacing w:before="60" w:after="60" w:line="312" w:lineRule="auto"/>
-        <w:ind w:left="283" w:hanging="170"/>
-        <w:jc w:val="both"/>
-      </w:pPr>
-      <w:r>
-        <w:rPr>
-          <w:rFonts w:ascii="Times New Roman" w:hAnsi="Times New Roman"/>
-          <w:color w:val="000000"/>
-          <w:sz w:val="26"/>
-        </w:rPr>
-        <w:t xml:space="preserve">- </w:t>
-      </w:r>
-      <w:r>
-        <w:rPr>
-          <w:rFonts w:ascii="Times New Roman" w:hAnsi="Times New Roman"/>
-          <w:b w:val="0"/>
-          <w:i w:val="0"/>
-          <w:color w:val="000000"/>
-          <w:sz w:val="26"/>
-        </w:rPr>
-        <w:t xml:space="preserve">  </w:t>
-      </w:r>
-      <w:r>
-        <w:rPr>
-          <w:rFonts w:ascii="Times New Roman" w:hAnsi="Times New Roman"/>
-          <w:b/>
-          <w:i w:val="0"/>
-          <w:color w:val="000000"/>
-          <w:sz w:val="26"/>
-        </w:rPr>
-        <w:t>Câu hỏi:</w:t>
-      </w:r>
-      <w:r>
-        <w:rPr>
-          <w:rFonts w:ascii="Times New Roman" w:hAnsi="Times New Roman"/>
-          <w:b w:val="0"/>
-          <w:i w:val="0"/>
-          <w:color w:val="000000"/>
-          <w:sz w:val="26"/>
-        </w:rPr>
-        <w:t xml:space="preserve"> Nguyên lí I phát biểu dưới dạng hệ thức toán học </w:t>
+        <w:t xml:space="preserve"> Từ biểu thức Nguyên lí I </w:t>
       </w:r>
       <w:r>
         <w:rPr>
@@ -1083,7 +834,7 @@
           <w:color w:val="000000"/>
           <w:sz w:val="26"/>
         </w:rPr>
-        <w:t xml:space="preserve">. Hãy cho biết khi nào hệ nhận nhiệt, nhận công, tỏa nhiệt, hay thực hiện công thì dấu của các đại lượng </w:t>
+        <w:t xml:space="preserve">, hãy cho biết khi nào hệ nhận nhiệt, nhận công, tỏa nhiệt, hay thực hiện công thì dấu của </w:t>
       </w:r>
       <w:r>
         <w:rPr>
@@ -1156,11 +907,28 @@
     </w:p>
     <w:p>
       <w:pPr>
-        <w:pStyle w:val="Heading2"/>
-        <w:keepNext/>
-        <w:spacing w:before="160" w:after="80"/>
-        <w:ind w:left="0" w:firstLine="0"/>
+        <w:spacing w:before="60" w:after="60" w:line="312" w:lineRule="auto"/>
+        <w:ind w:left="283" w:hanging="170"/>
+        <w:jc w:val="both"/>
       </w:pPr>
+      <w:r>
+        <w:rPr>
+          <w:rFonts w:ascii="Times New Roman" w:hAnsi="Times New Roman"/>
+          <w:color w:val="000000"/>
+          <w:sz w:val="26"/>
+        </w:rPr>
+        <w:t xml:space="preserve">- </w:t>
+      </w:r>
+      <w:r>
+        <w:rPr>
+          <w:rFonts w:ascii="Times New Roman" w:hAnsi="Times New Roman"/>
+          <w:b w:val="0"/>
+          <w:i w:val="0"/>
+          <w:color w:val="000000"/>
+          <w:sz w:val="26"/>
+        </w:rPr>
+        <w:t xml:space="preserve">  </w:t>
+      </w:r>
       <w:r>
         <w:rPr>
           <w:rFonts w:ascii="Times New Roman" w:hAnsi="Times New Roman"/>
@@ -1169,7 +937,7 @@
           <w:color w:val="000000"/>
           <w:sz w:val="26"/>
         </w:rPr>
-        <w:t>2. Trọng tâm (Biểu thức và Quy ước dấu)</w:t>
+        <w:t>Trọng tâm (Hệ thức và Quy ước dấu):</w:t>
       </w:r>
     </w:p>
     <w:p>
@@ -1194,7 +962,7 @@
           <w:color w:val="000000"/>
           <w:sz w:val="26"/>
         </w:rPr>
-        <w:t xml:space="preserve">  Nguyên lí I Nhiệt động lực học: ==</w:t>
+        <w:t xml:space="preserve">  Hệ thức Nguyên lí I Nhiệt động lực học: ==</w:t>
       </w:r>
       <w:r>
         <w:rPr>
@@ -1407,76 +1175,7 @@
           <w:color w:val="000000"/>
           <w:sz w:val="26"/>
         </w:rPr>
-        <w:t>3. Vận dụng (Chu trình khí trong xilanh)</w:t>
-      </w:r>
-    </w:p>
-    <w:p>
-      <w:pPr>
-        <w:spacing w:before="120" w:after="120" w:line="312" w:lineRule="auto"/>
-        <w:ind w:left="0" w:firstLine="567"/>
-        <w:jc w:val="both"/>
-      </w:pPr>
-      <w:r>
-        <w:rPr>
-          <w:rFonts w:ascii="Times New Roman" w:hAnsi="Times New Roman"/>
-          <w:b/>
-          <w:i w:val="0"/>
-          <w:color w:val="000000"/>
-          <w:sz w:val="26"/>
-        </w:rPr>
-        <w:t>Tình huống:</w:t>
-      </w:r>
-      <w:r>
-        <w:rPr>
-          <w:rFonts w:ascii="Times New Roman" w:hAnsi="Times New Roman"/>
-          <w:b w:val="0"/>
-          <w:i w:val="0"/>
-          <w:color w:val="000000"/>
-          <w:sz w:val="26"/>
-        </w:rPr>
-        <w:t xml:space="preserve"> Một lượng khí trong xilanh nhận một nhiệt lượng </w:t>
-      </w:r>
-      <w:r>
-        <w:rPr>
-          <w:rFonts w:ascii="Times New Roman" w:hAnsi="Times New Roman"/>
-          <w:i/>
-          <w:color w:val="000000"/>
-          <w:sz w:val="26"/>
-        </w:rPr>
-        <w:t>Q = 200</w:t>
-        <w:tab/>
-        <w:t>ext{ J}</w:t>
-      </w:r>
-      <w:r>
-        <w:rPr>
-          <w:rFonts w:ascii="Times New Roman" w:hAnsi="Times New Roman"/>
-          <w:b w:val="0"/>
-          <w:i w:val="0"/>
-          <w:color w:val="000000"/>
-          <w:sz w:val="26"/>
-        </w:rPr>
-        <w:t xml:space="preserve"> từ nguồn ngoài, đồng thời khí giãn nở đẩy pit-tông thực hiện một công </w:t>
-      </w:r>
-      <w:r>
-        <w:rPr>
-          <w:rFonts w:ascii="Times New Roman" w:hAnsi="Times New Roman"/>
-          <w:i/>
-          <w:color w:val="000000"/>
-          <w:sz w:val="26"/>
-        </w:rPr>
-        <w:t>A' = 120</w:t>
-        <w:tab/>
-        <w:t>ext{ J}</w:t>
-      </w:r>
-      <w:r>
-        <w:rPr>
-          <w:rFonts w:ascii="Times New Roman" w:hAnsi="Times New Roman"/>
-          <w:b w:val="0"/>
-          <w:i w:val="0"/>
-          <w:color w:val="000000"/>
-          <w:sz w:val="26"/>
-        </w:rPr>
-        <w:t>.</w:t>
+        <w:t>📍 ĐVKT 4: NHIỆT LƯỢNG VÀ CÔNG THỨC TÍNH NHIỆT LƯỢNG</w:t>
       </w:r>
     </w:p>
     <w:p>
@@ -1511,7 +1210,7 @@
           <w:color w:val="000000"/>
           <w:sz w:val="26"/>
         </w:rPr>
-        <w:t>Câu hỏi:</w:t>
+        <w:t>Nhiệm vụ 4 (Khám phá):</w:t>
       </w:r>
       <w:r>
         <w:rPr>
@@ -1521,64 +1220,7 @@
           <w:color w:val="000000"/>
           <w:sz w:val="26"/>
         </w:rPr>
-        <w:t xml:space="preserve"> Xác định dấu của các đại lượng </w:t>
-      </w:r>
-      <w:r>
-        <w:rPr>
-          <w:rFonts w:ascii="Times New Roman" w:hAnsi="Times New Roman"/>
-          <w:i/>
-          <w:color w:val="000000"/>
-          <w:sz w:val="26"/>
-        </w:rPr>
-        <w:t>Q</w:t>
-      </w:r>
-      <w:r>
-        <w:rPr>
-          <w:rFonts w:ascii="Times New Roman" w:hAnsi="Times New Roman"/>
-          <w:b w:val="0"/>
-          <w:i w:val="0"/>
-          <w:color w:val="000000"/>
-          <w:sz w:val="26"/>
-        </w:rPr>
-        <w:t xml:space="preserve"> và </w:t>
-      </w:r>
-      <w:r>
-        <w:rPr>
-          <w:rFonts w:ascii="Times New Roman" w:hAnsi="Times New Roman"/>
-          <w:i/>
-          <w:color w:val="000000"/>
-          <w:sz w:val="26"/>
-        </w:rPr>
-        <w:t>A</w:t>
-      </w:r>
-      <w:r>
-        <w:rPr>
-          <w:rFonts w:ascii="Times New Roman" w:hAnsi="Times New Roman"/>
-          <w:b w:val="0"/>
-          <w:i w:val="0"/>
-          <w:color w:val="000000"/>
-          <w:sz w:val="26"/>
-        </w:rPr>
-        <w:t xml:space="preserve">, từ đó tính độ biến thiên nội năng </w:t>
-      </w:r>
-      <w:r>
-        <w:rPr>
-          <w:rFonts w:ascii="Times New Roman" w:hAnsi="Times New Roman"/>
-          <w:i/>
-          <w:color w:val="000000"/>
-          <w:sz w:val="26"/>
-        </w:rPr>
-        <w:t>Δ U</w:t>
-      </w:r>
-      <w:r>
-        <w:rPr>
-          <w:rFonts w:ascii="Times New Roman" w:hAnsi="Times New Roman"/>
-          <w:b w:val="0"/>
-          <w:i w:val="0"/>
-          <w:color w:val="000000"/>
-          <w:sz w:val="26"/>
-        </w:rPr>
-        <w:t xml:space="preserve"> của lượng khí trên.</w:t>
+        <w:t xml:space="preserve"> Khi ta truyền nhiệt để làm tăng nhiệt độ của một vật, nhiệt lượng vật thu vào phụ thuộc vào những yếu tố đặc trưng nào của vật?</w:t>
       </w:r>
     </w:p>
     <w:p>
@@ -1613,112 +1255,6 @@
     </w:p>
     <w:p>
       <w:pPr>
-        <w:pStyle w:val="Heading2"/>
-        <w:keepNext/>
-        <w:spacing w:before="160" w:after="80"/>
-        <w:ind w:left="0" w:firstLine="0"/>
-      </w:pPr>
-      <w:r>
-        <w:rPr>
-          <w:rFonts w:ascii="Times New Roman" w:hAnsi="Times New Roman"/>
-          <w:b/>
-          <w:i w:val="0"/>
-          <w:color w:val="000000"/>
-          <w:sz w:val="26"/>
-        </w:rPr>
-        <w:t>4. Mở rộng (STEM Connection)</w:t>
-      </w:r>
-    </w:p>
-    <w:p>
-      <w:pPr>
-        <w:pStyle w:val="Heading3"/>
-        <w:keepNext/>
-        <w:spacing w:before="120" w:after="60"/>
-        <w:ind w:left="0" w:firstLine="0"/>
-      </w:pPr>
-      <w:r>
-        <w:rPr>
-          <w:rFonts w:ascii="Times New Roman" w:hAnsi="Times New Roman"/>
-          <w:b w:val="0"/>
-          <w:i/>
-          <w:color w:val="000000"/>
-          <w:sz w:val="26"/>
-        </w:rPr>
-        <w:t>Động cơ hơi nước của James Watt:</w:t>
-      </w:r>
-    </w:p>
-    <w:p>
-      <w:pPr>
-        <w:spacing w:before="120" w:after="120" w:line="312" w:lineRule="auto"/>
-        <w:ind w:left="567" w:firstLine="0"/>
-        <w:jc w:val="both"/>
-      </w:pPr>
-      <w:r>
-        <w:rPr>
-          <w:rFonts w:ascii="Times New Roman" w:hAnsi="Times New Roman"/>
-          <w:b w:val="0"/>
-          <w:i/>
-          <w:color w:val="000000"/>
-          <w:sz w:val="26"/>
-        </w:rPr>
-        <w:t>Năm 1765, James Watt đã cải tiến động cơ hơi nước bằng cách thêm một bình ngưng độc lập. Phát minh này giúp giảm thiểu nhiệt lượng hao phí dùng để làm nóng xilanh liên tục, nâng hiệu suất lên gấp 4 lần. Đây là một ứng dụng vĩ đại của Nguyên lí I Nhiệt động lực học, trực tiếp châm ngòi cho cuộc Cách mạng Công nghiệp lần thứ nhất.</w:t>
-      </w:r>
-    </w:p>
-    <w:p>
-      <w:pPr>
-        <w:spacing w:before="120" w:after="120" w:line="312" w:lineRule="auto"/>
-        <w:ind w:left="0" w:firstLine="567"/>
-        <w:jc w:val="both"/>
-      </w:pPr>
-      <w:r>
-        <w:rPr>
-          <w:rFonts w:ascii="Times New Roman" w:hAnsi="Times New Roman"/>
-          <w:b w:val="0"/>
-          <w:i w:val="0"/>
-          <w:color w:val="000000"/>
-          <w:sz w:val="26"/>
-        </w:rPr>
-        <w:t>---</w:t>
-      </w:r>
-    </w:p>
-    <w:p>
-      <w:pPr>
-        <w:pStyle w:val="Heading1"/>
-        <w:keepNext/>
-        <w:spacing w:before="240" w:after="120"/>
-        <w:ind w:left="0" w:firstLine="0"/>
-      </w:pPr>
-      <w:r>
-        <w:rPr>
-          <w:rFonts w:ascii="Times New Roman" w:hAnsi="Times New Roman"/>
-          <w:b/>
-          <w:i w:val="0"/>
-          <w:color w:val="1F4E79"/>
-          <w:sz w:val="28"/>
-        </w:rPr>
-        <w:t>📍 ĐVKT 4: NHIỆT LƯỢNG VÀ CÔNG THỨC TÍNH NHIỆT LƯỢNG</w:t>
-      </w:r>
-    </w:p>
-    <w:p>
-      <w:pPr>
-        <w:pStyle w:val="Heading2"/>
-        <w:keepNext/>
-        <w:spacing w:before="160" w:after="80"/>
-        <w:ind w:left="0" w:firstLine="0"/>
-      </w:pPr>
-      <w:r>
-        <w:rPr>
-          <w:rFonts w:ascii="Times New Roman" w:hAnsi="Times New Roman"/>
-          <w:b/>
-          <w:i w:val="0"/>
-          <w:color w:val="000000"/>
-          <w:sz w:val="26"/>
-        </w:rPr>
-        <w:t>1. Khám phá (Nhiệm vụ 4: Các yếu tố ảnh hưởng)</w:t>
-      </w:r>
-    </w:p>
-    <w:p>
-      <w:pPr>
         <w:spacing w:before="60" w:after="60" w:line="312" w:lineRule="auto"/>
         <w:ind w:left="283" w:hanging="170"/>
         <w:jc w:val="both"/>
@@ -1749,65 +1285,7 @@
           <w:color w:val="000000"/>
           <w:sz w:val="26"/>
         </w:rPr>
-        <w:t>Câu hỏi:</w:t>
-      </w:r>
-      <w:r>
-        <w:rPr>
-          <w:rFonts w:ascii="Times New Roman" w:hAnsi="Times New Roman"/>
-          <w:b w:val="0"/>
-          <w:i w:val="0"/>
-          <w:color w:val="000000"/>
-          <w:sz w:val="26"/>
-        </w:rPr>
-        <w:t xml:space="preserve"> Để đun sôi một ấm nước, nhiệt lượng cần cung cấp cho nước phụ thuộc vào khối lượng của nước, độ tăng nhiệt độ và yếu tố nào khác của chất làm ấm và chất lỏng?</w:t>
-      </w:r>
-    </w:p>
-    <w:p>
-      <w:pPr>
-        <w:spacing w:before="40" w:after="40"/>
-        <w:ind w:left="567"/>
-        <w:jc w:val="left"/>
-      </w:pPr>
-      <w:r>
-        <w:rPr>
-          <w:rFonts w:ascii="Times New Roman" w:hAnsi="Times New Roman"/>
-          <w:color w:val="666666"/>
-          <w:sz w:val="22"/>
-        </w:rPr>
-        <w:t>..........................................................................................</w:t>
-      </w:r>
-    </w:p>
-    <w:p>
-      <w:pPr>
-        <w:spacing w:before="40" w:after="40"/>
-        <w:ind w:left="567"/>
-        <w:jc w:val="left"/>
-      </w:pPr>
-      <w:r>
-        <w:rPr>
-          <w:rFonts w:ascii="Times New Roman" w:hAnsi="Times New Roman"/>
-          <w:color w:val="666666"/>
-          <w:sz w:val="22"/>
-        </w:rPr>
-        <w:t>..........................................................................................</w:t>
-      </w:r>
-    </w:p>
-    <w:p>
-      <w:pPr>
-        <w:pStyle w:val="Heading2"/>
-        <w:keepNext/>
-        <w:spacing w:before="160" w:after="80"/>
-        <w:ind w:left="0" w:firstLine="0"/>
-      </w:pPr>
-      <w:r>
-        <w:rPr>
-          <w:rFonts w:ascii="Times New Roman" w:hAnsi="Times New Roman"/>
-          <w:b/>
-          <w:i w:val="0"/>
-          <w:color w:val="000000"/>
-          <w:sz w:val="26"/>
-        </w:rPr>
-        <w:t>2. Trọng tâm (Công thức tính nhiệt lượng)</w:t>
+        <w:t>Trọng tâm (Công thức tính nhiệt lượng):</w:t>
       </w:r>
     </w:p>
     <w:p>
@@ -2096,7 +1574,234 @@
           <w:color w:val="000000"/>
           <w:sz w:val="26"/>
         </w:rPr>
-        <w:t>3. Vận dụng (Nhiệm vụ đun ấm nước nhôm)</w:t>
+        <w:t>📍 ĐVKT 5: KHÁI NIỆM NHIỆT DUNG RIÊNG CỦA CHẤT</w:t>
+      </w:r>
+    </w:p>
+    <w:p>
+      <w:pPr>
+        <w:spacing w:before="60" w:after="60" w:line="312" w:lineRule="auto"/>
+        <w:ind w:left="283" w:hanging="170"/>
+        <w:jc w:val="both"/>
+      </w:pPr>
+      <w:r>
+        <w:rPr>
+          <w:rFonts w:ascii="Times New Roman" w:hAnsi="Times New Roman"/>
+          <w:color w:val="000000"/>
+          <w:sz w:val="26"/>
+        </w:rPr>
+        <w:t xml:space="preserve">- </w:t>
+      </w:r>
+      <w:r>
+        <w:rPr>
+          <w:rFonts w:ascii="Times New Roman" w:hAnsi="Times New Roman"/>
+          <w:b w:val="0"/>
+          <w:i w:val="0"/>
+          <w:color w:val="000000"/>
+          <w:sz w:val="26"/>
+        </w:rPr>
+        <w:t xml:space="preserve">  </w:t>
+      </w:r>
+      <w:r>
+        <w:rPr>
+          <w:rFonts w:ascii="Times New Roman" w:hAnsi="Times New Roman"/>
+          <w:b/>
+          <w:i w:val="0"/>
+          <w:color w:val="000000"/>
+          <w:sz w:val="26"/>
+        </w:rPr>
+        <w:t>Nhiệm vụ 5 (Khám phá):</w:t>
+      </w:r>
+      <w:r>
+        <w:rPr>
+          <w:rFonts w:ascii="Times New Roman" w:hAnsi="Times New Roman"/>
+          <w:b w:val="0"/>
+          <w:i w:val="0"/>
+          <w:color w:val="000000"/>
+          <w:sz w:val="26"/>
+        </w:rPr>
+        <w:t xml:space="preserve"> Đun nóng </w:t>
+      </w:r>
+      <w:r>
+        <w:rPr>
+          <w:rFonts w:ascii="Times New Roman" w:hAnsi="Times New Roman"/>
+          <w:i/>
+          <w:color w:val="000000"/>
+          <w:sz w:val="26"/>
+        </w:rPr>
+        <w:t>100</w:t>
+        <w:tab/>
+        <w:t>ext{ g}</w:t>
+      </w:r>
+      <w:r>
+        <w:rPr>
+          <w:rFonts w:ascii="Times New Roman" w:hAnsi="Times New Roman"/>
+          <w:b w:val="0"/>
+          <w:i w:val="0"/>
+          <w:color w:val="000000"/>
+          <w:sz w:val="26"/>
+        </w:rPr>
+        <w:t xml:space="preserve"> nước và </w:t>
+      </w:r>
+      <w:r>
+        <w:rPr>
+          <w:rFonts w:ascii="Times New Roman" w:hAnsi="Times New Roman"/>
+          <w:i/>
+          <w:color w:val="000000"/>
+          <w:sz w:val="26"/>
+        </w:rPr>
+        <w:t>100</w:t>
+        <w:tab/>
+        <w:t>ext{ g}</w:t>
+      </w:r>
+      <w:r>
+        <w:rPr>
+          <w:rFonts w:ascii="Times New Roman" w:hAnsi="Times New Roman"/>
+          <w:b w:val="0"/>
+          <w:i w:val="0"/>
+          <w:color w:val="000000"/>
+          <w:sz w:val="26"/>
+        </w:rPr>
+        <w:t xml:space="preserve"> rượu bằng hai nguồn nhiệt giống nhau trong cùng thời gian. Kết quả rượu tăng nhiệt độ nhanh hơn nhiều so với nước. Tại sao? Yếu tố nào quyết định sự chênh lệch này?</w:t>
+      </w:r>
+    </w:p>
+    <w:p>
+      <w:pPr>
+        <w:spacing w:before="40" w:after="40"/>
+        <w:ind w:left="567"/>
+        <w:jc w:val="left"/>
+      </w:pPr>
+      <w:r>
+        <w:rPr>
+          <w:rFonts w:ascii="Times New Roman" w:hAnsi="Times New Roman"/>
+          <w:color w:val="666666"/>
+          <w:sz w:val="22"/>
+        </w:rPr>
+        <w:t>..........................................................................................</w:t>
+      </w:r>
+    </w:p>
+    <w:p>
+      <w:pPr>
+        <w:spacing w:before="40" w:after="40"/>
+        <w:ind w:left="567"/>
+        <w:jc w:val="left"/>
+      </w:pPr>
+      <w:r>
+        <w:rPr>
+          <w:rFonts w:ascii="Times New Roman" w:hAnsi="Times New Roman"/>
+          <w:color w:val="666666"/>
+          <w:sz w:val="22"/>
+        </w:rPr>
+        <w:t>..........................................................................................</w:t>
+      </w:r>
+    </w:p>
+    <w:p>
+      <w:pPr>
+        <w:spacing w:before="60" w:after="60" w:line="312" w:lineRule="auto"/>
+        <w:ind w:left="283" w:hanging="170"/>
+        <w:jc w:val="both"/>
+      </w:pPr>
+      <w:r>
+        <w:rPr>
+          <w:rFonts w:ascii="Times New Roman" w:hAnsi="Times New Roman"/>
+          <w:color w:val="000000"/>
+          <w:sz w:val="26"/>
+        </w:rPr>
+        <w:t xml:space="preserve">- </w:t>
+      </w:r>
+      <w:r>
+        <w:rPr>
+          <w:rFonts w:ascii="Times New Roman" w:hAnsi="Times New Roman"/>
+          <w:b w:val="0"/>
+          <w:i w:val="0"/>
+          <w:color w:val="000000"/>
+          <w:sz w:val="26"/>
+        </w:rPr>
+        <w:t xml:space="preserve">  </w:t>
+      </w:r>
+      <w:r>
+        <w:rPr>
+          <w:rFonts w:ascii="Times New Roman" w:hAnsi="Times New Roman"/>
+          <w:b/>
+          <w:i w:val="0"/>
+          <w:color w:val="000000"/>
+          <w:sz w:val="26"/>
+        </w:rPr>
+        <w:t>Trọng tâm (Ý nghĩa nhiệt dung riêng):</w:t>
+      </w:r>
+    </w:p>
+    <w:p>
+      <w:pPr>
+        <w:spacing w:before="60" w:after="60" w:line="312" w:lineRule="auto"/>
+        <w:ind w:left="283" w:hanging="170"/>
+        <w:jc w:val="both"/>
+      </w:pPr>
+      <w:r>
+        <w:rPr>
+          <w:rFonts w:ascii="Times New Roman" w:hAnsi="Times New Roman"/>
+          <w:color w:val="000000"/>
+          <w:sz w:val="26"/>
+        </w:rPr>
+        <w:t xml:space="preserve">- </w:t>
+      </w:r>
+      <w:r>
+        <w:rPr>
+          <w:rFonts w:ascii="Times New Roman" w:hAnsi="Times New Roman"/>
+          <w:b w:val="0"/>
+          <w:i w:val="0"/>
+          <w:color w:val="000000"/>
+          <w:sz w:val="26"/>
+        </w:rPr>
+        <w:t xml:space="preserve">  Nhiệt dung riêng của một chất là lượng nhiệt cần truyền cho (1) .................... chất đó để tăng thêm (2) ....................</w:t>
+      </w:r>
+    </w:p>
+    <w:p>
+      <w:pPr>
+        <w:spacing w:before="60" w:after="60" w:line="312" w:lineRule="auto"/>
+        <w:ind w:left="283" w:hanging="170"/>
+        <w:jc w:val="both"/>
+      </w:pPr>
+      <w:r>
+        <w:rPr>
+          <w:rFonts w:ascii="Times New Roman" w:hAnsi="Times New Roman"/>
+          <w:color w:val="000000"/>
+          <w:sz w:val="26"/>
+        </w:rPr>
+        <w:t xml:space="preserve">- </w:t>
+      </w:r>
+      <w:r>
+        <w:rPr>
+          <w:rFonts w:ascii="Times New Roman" w:hAnsi="Times New Roman"/>
+          <w:b w:val="0"/>
+          <w:i w:val="0"/>
+          <w:color w:val="000000"/>
+          <w:sz w:val="26"/>
+        </w:rPr>
+        <w:t xml:space="preserve">  Đơn vị của nhiệt dung riêng trong hệ SI là (3) ....................</w:t>
+      </w:r>
+    </w:p>
+    <w:p>
+      <w:pPr>
+        <w:spacing w:before="60" w:after="60" w:line="312" w:lineRule="auto"/>
+        <w:ind w:left="283" w:hanging="170"/>
+        <w:jc w:val="both"/>
+      </w:pPr>
+      <w:r>
+        <w:rPr>
+          <w:rFonts w:ascii="Times New Roman" w:hAnsi="Times New Roman"/>
+          <w:color w:val="000000"/>
+          <w:sz w:val="26"/>
+        </w:rPr>
+        <w:t xml:space="preserve">- </w:t>
+      </w:r>
+      <w:r>
+        <w:rPr>
+          <w:rFonts w:ascii="Times New Roman" w:hAnsi="Times New Roman"/>
+          <w:b w:val="0"/>
+          <w:i w:val="0"/>
+          <w:color w:val="000000"/>
+          <w:sz w:val="26"/>
+        </w:rPr>
+        <w:t xml:space="preserve">  *Gợi ý từ khóa:* 1 kg, 1 K (hoặc 1 độ C), J/kg.K.</w:t>
       </w:r>
     </w:p>
     <w:p>
@@ -2108,12 +1813,334 @@
       <w:r>
         <w:rPr>
           <w:rFonts w:ascii="Times New Roman" w:hAnsi="Times New Roman"/>
+          <w:b w:val="0"/>
+          <w:i w:val="0"/>
+          <w:color w:val="000000"/>
+          <w:sz w:val="26"/>
+        </w:rPr>
+        <w:t>---</w:t>
+      </w:r>
+    </w:p>
+    <w:p>
+      <w:pPr>
+        <w:pStyle w:val="Heading1"/>
+        <w:keepNext/>
+        <w:spacing w:before="240" w:after="120"/>
+        <w:ind w:left="0" w:firstLine="0"/>
+      </w:pPr>
+      <w:r>
+        <w:rPr>
+          <w:rFonts w:ascii="Times New Roman" w:hAnsi="Times New Roman"/>
+          <w:b/>
+          <w:i w:val="0"/>
+          <w:color w:val="1F4E79"/>
+          <w:sz w:val="28"/>
+        </w:rPr>
+        <w:t>II. PHẦN LUYỆN TẬP (TƯƠNG ỨNG HOẠT ĐỘNG 3)</w:t>
+      </w:r>
+    </w:p>
+    <w:p>
+      <w:pPr>
+        <w:spacing w:before="60" w:after="60" w:line="312" w:lineRule="auto"/>
+        <w:ind w:left="283" w:hanging="170"/>
+        <w:jc w:val="both"/>
+      </w:pPr>
+      <w:r>
+        <w:rPr>
+          <w:rFonts w:ascii="Times New Roman" w:hAnsi="Times New Roman"/>
+          <w:color w:val="000000"/>
+          <w:sz w:val="26"/>
+        </w:rPr>
+        <w:t xml:space="preserve">- </w:t>
+      </w:r>
+      <w:r>
+        <w:rPr>
+          <w:rFonts w:ascii="Times New Roman" w:hAnsi="Times New Roman"/>
+          <w:b w:val="0"/>
+          <w:i w:val="0"/>
+          <w:color w:val="000000"/>
+          <w:sz w:val="26"/>
+        </w:rPr>
+        <w:t xml:space="preserve">  </w:t>
+      </w:r>
+      <w:r>
+        <w:rPr>
+          <w:rFonts w:ascii="Times New Roman" w:hAnsi="Times New Roman"/>
           <w:b/>
           <w:i w:val="0"/>
           <w:color w:val="000000"/>
           <w:sz w:val="26"/>
         </w:rPr>
-        <w:t>Tình huống:</w:t>
+        <w:t>Nhiệm vụ 6 (Bài tập tính toán):</w:t>
+      </w:r>
+      <w:r>
+        <w:rPr>
+          <w:rFonts w:ascii="Times New Roman" w:hAnsi="Times New Roman"/>
+          <w:b w:val="0"/>
+          <w:i w:val="0"/>
+          <w:color w:val="000000"/>
+          <w:sz w:val="26"/>
+        </w:rPr>
+        <w:t xml:space="preserve"> Một lượng khí lý tưởng trong xilanh nhận một nhiệt lượng </w:t>
+      </w:r>
+      <w:r>
+        <w:rPr>
+          <w:rFonts w:ascii="Times New Roman" w:hAnsi="Times New Roman"/>
+          <w:i/>
+          <w:color w:val="000000"/>
+          <w:sz w:val="26"/>
+        </w:rPr>
+        <w:t>Q = 200</w:t>
+        <w:tab/>
+        <w:t>ext{ J}</w:t>
+      </w:r>
+      <w:r>
+        <w:rPr>
+          <w:rFonts w:ascii="Times New Roman" w:hAnsi="Times New Roman"/>
+          <w:b w:val="0"/>
+          <w:i w:val="0"/>
+          <w:color w:val="000000"/>
+          <w:sz w:val="26"/>
+        </w:rPr>
+        <w:t xml:space="preserve"> từ nguồn nhiệt bên ngoài, đồng thời khí giãn nở đẩy pit-tông thực hiện một công </w:t>
+      </w:r>
+      <w:r>
+        <w:rPr>
+          <w:rFonts w:ascii="Times New Roman" w:hAnsi="Times New Roman"/>
+          <w:i/>
+          <w:color w:val="000000"/>
+          <w:sz w:val="26"/>
+        </w:rPr>
+        <w:t>A' = 120</w:t>
+        <w:tab/>
+        <w:t>ext{ J}</w:t>
+      </w:r>
+      <w:r>
+        <w:rPr>
+          <w:rFonts w:ascii="Times New Roman" w:hAnsi="Times New Roman"/>
+          <w:b w:val="0"/>
+          <w:i w:val="0"/>
+          <w:color w:val="000000"/>
+          <w:sz w:val="26"/>
+        </w:rPr>
+        <w:t xml:space="preserve"> ra môi trường.</w:t>
+      </w:r>
+    </w:p>
+    <w:p>
+      <w:pPr>
+        <w:spacing w:before="60" w:after="60" w:line="312" w:lineRule="auto"/>
+        <w:ind w:left="283" w:hanging="170"/>
+        <w:jc w:val="both"/>
+      </w:pPr>
+      <w:r>
+        <w:rPr>
+          <w:rFonts w:ascii="Times New Roman" w:hAnsi="Times New Roman"/>
+          <w:color w:val="000000"/>
+          <w:sz w:val="26"/>
+        </w:rPr>
+        <w:t xml:space="preserve">- </w:t>
+      </w:r>
+      <w:r>
+        <w:rPr>
+          <w:rFonts w:ascii="Times New Roman" w:hAnsi="Times New Roman"/>
+          <w:b w:val="0"/>
+          <w:i w:val="0"/>
+          <w:color w:val="000000"/>
+          <w:sz w:val="26"/>
+        </w:rPr>
+        <w:t xml:space="preserve">  </w:t>
+      </w:r>
+      <w:r>
+        <w:rPr>
+          <w:rFonts w:ascii="Times New Roman" w:hAnsi="Times New Roman"/>
+          <w:b/>
+          <w:i w:val="0"/>
+          <w:color w:val="000000"/>
+          <w:sz w:val="26"/>
+        </w:rPr>
+        <w:t>Câu hỏi:</w:t>
+      </w:r>
+      <w:r>
+        <w:rPr>
+          <w:rFonts w:ascii="Times New Roman" w:hAnsi="Times New Roman"/>
+          <w:b w:val="0"/>
+          <w:i w:val="0"/>
+          <w:color w:val="000000"/>
+          <w:sz w:val="26"/>
+        </w:rPr>
+        <w:t xml:space="preserve"> Xác định dấu của các đại lượng </w:t>
+      </w:r>
+      <w:r>
+        <w:rPr>
+          <w:rFonts w:ascii="Times New Roman" w:hAnsi="Times New Roman"/>
+          <w:i/>
+          <w:color w:val="000000"/>
+          <w:sz w:val="26"/>
+        </w:rPr>
+        <w:t>Q</w:t>
+      </w:r>
+      <w:r>
+        <w:rPr>
+          <w:rFonts w:ascii="Times New Roman" w:hAnsi="Times New Roman"/>
+          <w:b w:val="0"/>
+          <w:i w:val="0"/>
+          <w:color w:val="000000"/>
+          <w:sz w:val="26"/>
+        </w:rPr>
+        <w:t xml:space="preserve"> và </w:t>
+      </w:r>
+      <w:r>
+        <w:rPr>
+          <w:rFonts w:ascii="Times New Roman" w:hAnsi="Times New Roman"/>
+          <w:i/>
+          <w:color w:val="000000"/>
+          <w:sz w:val="26"/>
+        </w:rPr>
+        <w:t>A</w:t>
+      </w:r>
+      <w:r>
+        <w:rPr>
+          <w:rFonts w:ascii="Times New Roman" w:hAnsi="Times New Roman"/>
+          <w:b w:val="0"/>
+          <w:i w:val="0"/>
+          <w:color w:val="000000"/>
+          <w:sz w:val="26"/>
+        </w:rPr>
+        <w:t xml:space="preserve"> theo quy ước, từ đó tính độ biến thiên nội năng </w:t>
+      </w:r>
+      <w:r>
+        <w:rPr>
+          <w:rFonts w:ascii="Times New Roman" w:hAnsi="Times New Roman"/>
+          <w:i/>
+          <w:color w:val="000000"/>
+          <w:sz w:val="26"/>
+        </w:rPr>
+        <w:t>Δ U</w:t>
+      </w:r>
+      <w:r>
+        <w:rPr>
+          <w:rFonts w:ascii="Times New Roman" w:hAnsi="Times New Roman"/>
+          <w:b w:val="0"/>
+          <w:i w:val="0"/>
+          <w:color w:val="000000"/>
+          <w:sz w:val="26"/>
+        </w:rPr>
+        <w:t xml:space="preserve"> của lượng khí trên.</w:t>
+      </w:r>
+    </w:p>
+    <w:p>
+      <w:pPr>
+        <w:spacing w:before="40" w:after="40"/>
+        <w:ind w:left="567"/>
+        <w:jc w:val="left"/>
+      </w:pPr>
+      <w:r>
+        <w:rPr>
+          <w:rFonts w:ascii="Times New Roman" w:hAnsi="Times New Roman"/>
+          <w:color w:val="666666"/>
+          <w:sz w:val="22"/>
+        </w:rPr>
+        <w:t>..........................................................................................</w:t>
+      </w:r>
+    </w:p>
+    <w:p>
+      <w:pPr>
+        <w:spacing w:before="40" w:after="40"/>
+        <w:ind w:left="567"/>
+        <w:jc w:val="left"/>
+      </w:pPr>
+      <w:r>
+        <w:rPr>
+          <w:rFonts w:ascii="Times New Roman" w:hAnsi="Times New Roman"/>
+          <w:color w:val="666666"/>
+          <w:sz w:val="22"/>
+        </w:rPr>
+        <w:t>..........................................................................................</w:t>
+      </w:r>
+    </w:p>
+    <w:p>
+      <w:pPr>
+        <w:spacing w:before="40" w:after="40"/>
+        <w:ind w:left="567"/>
+        <w:jc w:val="left"/>
+      </w:pPr>
+      <w:r>
+        <w:rPr>
+          <w:rFonts w:ascii="Times New Roman" w:hAnsi="Times New Roman"/>
+          <w:color w:val="666666"/>
+          <w:sz w:val="22"/>
+        </w:rPr>
+        <w:t>..........................................................................................</w:t>
+      </w:r>
+    </w:p>
+    <w:p>
+      <w:pPr>
+        <w:spacing w:before="120" w:after="120" w:line="312" w:lineRule="auto"/>
+        <w:ind w:left="0" w:firstLine="567"/>
+        <w:jc w:val="both"/>
+      </w:pPr>
+      <w:r>
+        <w:rPr>
+          <w:rFonts w:ascii="Times New Roman" w:hAnsi="Times New Roman"/>
+          <w:b w:val="0"/>
+          <w:i w:val="0"/>
+          <w:color w:val="000000"/>
+          <w:sz w:val="26"/>
+        </w:rPr>
+        <w:t>---</w:t>
+      </w:r>
+    </w:p>
+    <w:p>
+      <w:pPr>
+        <w:pStyle w:val="Heading1"/>
+        <w:keepNext/>
+        <w:spacing w:before="240" w:after="120"/>
+        <w:ind w:left="0" w:firstLine="0"/>
+      </w:pPr>
+      <w:r>
+        <w:rPr>
+          <w:rFonts w:ascii="Times New Roman" w:hAnsi="Times New Roman"/>
+          <w:b/>
+          <w:i w:val="0"/>
+          <w:color w:val="1F4E79"/>
+          <w:sz w:val="28"/>
+        </w:rPr>
+        <w:t>III. PHẦN VẬN DỤNG &amp; MỞ RỘNG (TƯƠNG ỨNG HOẠT ĐỘNG 4)</w:t>
+      </w:r>
+    </w:p>
+    <w:p>
+      <w:pPr>
+        <w:spacing w:before="60" w:after="60" w:line="312" w:lineRule="auto"/>
+        <w:ind w:left="283" w:hanging="170"/>
+        <w:jc w:val="both"/>
+      </w:pPr>
+      <w:r>
+        <w:rPr>
+          <w:rFonts w:ascii="Times New Roman" w:hAnsi="Times New Roman"/>
+          <w:color w:val="000000"/>
+          <w:sz w:val="26"/>
+        </w:rPr>
+        <w:t xml:space="preserve">- </w:t>
+      </w:r>
+      <w:r>
+        <w:rPr>
+          <w:rFonts w:ascii="Times New Roman" w:hAnsi="Times New Roman"/>
+          <w:b w:val="0"/>
+          <w:i w:val="0"/>
+          <w:color w:val="000000"/>
+          <w:sz w:val="26"/>
+        </w:rPr>
+        <w:t xml:space="preserve">  </w:t>
+      </w:r>
+      <w:r>
+        <w:rPr>
+          <w:rFonts w:ascii="Times New Roman" w:hAnsi="Times New Roman"/>
+          <w:b/>
+          <w:i w:val="0"/>
+          <w:color w:val="000000"/>
+          <w:sz w:val="26"/>
+        </w:rPr>
+        <w:t>Nhiệm vụ 7 (Vận dụng thực tế):</w:t>
       </w:r>
       <w:r>
         <w:rPr>
@@ -2340,72 +2367,17 @@
     </w:p>
     <w:p>
       <w:pPr>
-        <w:spacing w:before="120" w:after="120" w:line="312" w:lineRule="auto"/>
-        <w:ind w:left="0" w:firstLine="567"/>
+        <w:spacing w:before="60" w:after="60" w:line="312" w:lineRule="auto"/>
+        <w:ind w:left="283" w:hanging="170"/>
         <w:jc w:val="both"/>
       </w:pPr>
       <w:r>
         <w:rPr>
           <w:rFonts w:ascii="Times New Roman" w:hAnsi="Times New Roman"/>
-          <w:b w:val="0"/>
-          <w:i w:val="0"/>
           <w:color w:val="000000"/>
           <w:sz w:val="26"/>
         </w:rPr>
-        <w:t>---</w:t>
-      </w:r>
-    </w:p>
-    <w:p>
-      <w:pPr>
-        <w:pStyle w:val="Heading1"/>
-        <w:keepNext/>
-        <w:spacing w:before="240" w:after="120"/>
-        <w:ind w:left="0" w:firstLine="0"/>
-      </w:pPr>
-      <w:r>
-        <w:rPr>
-          <w:rFonts w:ascii="Times New Roman" w:hAnsi="Times New Roman"/>
-          <w:b/>
-          <w:i w:val="0"/>
-          <w:color w:val="1F4E79"/>
-          <w:sz w:val="28"/>
-        </w:rPr>
-        <w:t>📍 ĐVKT 5: KHÁI NIỆM NHIỆT DUNG RIÊNG CỦA CHẤT</w:t>
-      </w:r>
-    </w:p>
-    <w:p>
-      <w:pPr>
-        <w:pStyle w:val="Heading2"/>
-        <w:keepNext/>
-        <w:spacing w:before="160" w:after="80"/>
-        <w:ind w:left="0" w:firstLine="0"/>
-      </w:pPr>
-      <w:r>
-        <w:rPr>
-          <w:rFonts w:ascii="Times New Roman" w:hAnsi="Times New Roman"/>
-          <w:b/>
-          <w:i w:val="0"/>
-          <w:color w:val="000000"/>
-          <w:sz w:val="26"/>
-        </w:rPr>
-        <w:t>1. Khám phá (Nhiệm vụ 5: Đun nóng nước và rượu)</w:t>
-      </w:r>
-    </w:p>
-    <w:p>
-      <w:pPr>
-        <w:spacing w:before="120" w:after="120" w:line="312" w:lineRule="auto"/>
-        <w:ind w:left="0" w:firstLine="567"/>
-        <w:jc w:val="both"/>
-      </w:pPr>
-      <w:r>
-        <w:rPr>
-          <w:rFonts w:ascii="Times New Roman" w:hAnsi="Times New Roman"/>
-          <w:b/>
-          <w:i w:val="0"/>
-          <w:color w:val="000000"/>
-          <w:sz w:val="26"/>
-        </w:rPr>
-        <w:t>Thực nghiệm:</w:t>
+        <w:t xml:space="preserve">- </w:t>
       </w:r>
       <w:r>
         <w:rPr>
@@ -2415,49 +2387,52 @@
           <w:color w:val="000000"/>
           <w:sz w:val="26"/>
         </w:rPr>
-        <w:t xml:space="preserve"> Đun nóng </w:t>
+        <w:t xml:space="preserve">  </w:t>
       </w:r>
       <w:r>
         <w:rPr>
           <w:rFonts w:ascii="Times New Roman" w:hAnsi="Times New Roman"/>
+          <w:b/>
+          <w:i w:val="0"/>
+          <w:color w:val="000000"/>
+          <w:sz w:val="26"/>
+        </w:rPr>
+        <w:t>Nhiệm vụ 8 (Mở rộng công nghệ):</w:t>
+      </w:r>
+    </w:p>
+    <w:p>
+      <w:pPr>
+        <w:pStyle w:val="Heading3"/>
+        <w:keepNext/>
+        <w:spacing w:before="120" w:after="60"/>
+        <w:ind w:left="0" w:firstLine="0"/>
+      </w:pPr>
+      <w:r>
+        <w:rPr>
+          <w:rFonts w:ascii="Times New Roman" w:hAnsi="Times New Roman"/>
+          <w:b w:val="0"/>
           <w:i/>
           <w:color w:val="000000"/>
           <w:sz w:val="26"/>
         </w:rPr>
-        <w:t>100</w:t>
-        <w:tab/>
-        <w:t>ext{ g}</w:t>
+        <w:t>Động cơ hơi nước của James Watt:</w:t>
       </w:r>
+    </w:p>
+    <w:p>
+      <w:pPr>
+        <w:spacing w:before="120" w:after="120" w:line="312" w:lineRule="auto"/>
+        <w:ind w:left="567" w:firstLine="0"/>
+        <w:jc w:val="both"/>
+      </w:pPr>
       <w:r>
         <w:rPr>
           <w:rFonts w:ascii="Times New Roman" w:hAnsi="Times New Roman"/>
           <w:b w:val="0"/>
-          <w:i w:val="0"/>
-          <w:color w:val="000000"/>
-          <w:sz w:val="26"/>
-        </w:rPr>
-        <w:t xml:space="preserve"> nước và </w:t>
-      </w:r>
-      <w:r>
-        <w:rPr>
-          <w:rFonts w:ascii="Times New Roman" w:hAnsi="Times New Roman"/>
           <w:i/>
           <w:color w:val="000000"/>
           <w:sz w:val="26"/>
         </w:rPr>
-        <w:t>100</w:t>
-        <w:tab/>
-        <w:t>ext{ g}</w:t>
-      </w:r>
-      <w:r>
-        <w:rPr>
-          <w:rFonts w:ascii="Times New Roman" w:hAnsi="Times New Roman"/>
-          <w:b w:val="0"/>
-          <w:i w:val="0"/>
-          <w:color w:val="000000"/>
-          <w:sz w:val="26"/>
-        </w:rPr>
-        <w:t xml:space="preserve"> rượu bằng hai nguồn nhiệt giống nhau trong cùng thời gian. Kết quả cho thấy rượu tăng nhiệt độ nhanh hơn nhiều so với nước.</w:t>
+        <w:t>Năm 1765, James Watt đã cải tiến động cơ hơi nước của Newcomen bằng cách thêm một bình ngưng độc lập. Phát minh này giúp giảm thiểu nhiệt lượng hao phí dùng để làm nóng xilanh liên tục, nâng hiệu suất lên gấp 4 lần. Đây là một ứng dụng vĩ đại của Nguyên lí I Nhiệt động lực học, trực tiếp châm ngòi cho cuộc Cách mạng Công nghiệp lần thứ nhất.</w:t>
       </w:r>
     </w:p>
     <w:p>
@@ -2492,251 +2467,7 @@
           <w:color w:val="000000"/>
           <w:sz w:val="26"/>
         </w:rPr>
-        <w:t>Câu hỏi:</w:t>
-      </w:r>
-      <w:r>
-        <w:rPr>
-          <w:rFonts w:ascii="Times New Roman" w:hAnsi="Times New Roman"/>
-          <w:b w:val="0"/>
-          <w:i w:val="0"/>
-          <w:color w:val="000000"/>
-          <w:sz w:val="26"/>
-        </w:rPr>
-        <w:t xml:space="preserve"> Tại sao cùng nhận một lượng nhiệt và cùng khối lượng, nhưng độ tăng nhiệt độ của rượu lại lớn hơn nước? Đại lượng nào đặc trưng cho tính chất này?</w:t>
-      </w:r>
-    </w:p>
-    <w:p>
-      <w:pPr>
-        <w:spacing w:before="40" w:after="40"/>
-        <w:ind w:left="567"/>
-        <w:jc w:val="left"/>
-      </w:pPr>
-      <w:r>
-        <w:rPr>
-          <w:rFonts w:ascii="Times New Roman" w:hAnsi="Times New Roman"/>
-          <w:color w:val="666666"/>
-          <w:sz w:val="22"/>
-        </w:rPr>
-        <w:t>..........................................................................................</w:t>
-      </w:r>
-    </w:p>
-    <w:p>
-      <w:pPr>
-        <w:spacing w:before="40" w:after="40"/>
-        <w:ind w:left="567"/>
-        <w:jc w:val="left"/>
-      </w:pPr>
-      <w:r>
-        <w:rPr>
-          <w:rFonts w:ascii="Times New Roman" w:hAnsi="Times New Roman"/>
-          <w:color w:val="666666"/>
-          <w:sz w:val="22"/>
-        </w:rPr>
-        <w:t>..........................................................................................</w:t>
-      </w:r>
-    </w:p>
-    <w:p>
-      <w:pPr>
-        <w:pStyle w:val="Heading2"/>
-        <w:keepNext/>
-        <w:spacing w:before="160" w:after="80"/>
-        <w:ind w:left="0" w:firstLine="0"/>
-      </w:pPr>
-      <w:r>
-        <w:rPr>
-          <w:rFonts w:ascii="Times New Roman" w:hAnsi="Times New Roman"/>
-          <w:b/>
-          <w:i w:val="0"/>
-          <w:color w:val="000000"/>
-          <w:sz w:val="26"/>
-        </w:rPr>
-        <w:t>2. Trọng tâm (Ý nghĩa nhiệt dung riêng)</w:t>
-      </w:r>
-    </w:p>
-    <w:p>
-      <w:pPr>
-        <w:spacing w:before="60" w:after="60" w:line="312" w:lineRule="auto"/>
-        <w:ind w:left="283" w:hanging="170"/>
-        <w:jc w:val="both"/>
-      </w:pPr>
-      <w:r>
-        <w:rPr>
-          <w:rFonts w:ascii="Times New Roman" w:hAnsi="Times New Roman"/>
-          <w:color w:val="000000"/>
-          <w:sz w:val="26"/>
-        </w:rPr>
-        <w:t xml:space="preserve">- </w:t>
-      </w:r>
-      <w:r>
-        <w:rPr>
-          <w:rFonts w:ascii="Times New Roman" w:hAnsi="Times New Roman"/>
-          <w:b w:val="0"/>
-          <w:i w:val="0"/>
-          <w:color w:val="000000"/>
-          <w:sz w:val="26"/>
-        </w:rPr>
-        <w:t xml:space="preserve">  Nhiệt dung riêng của một chất là lượng nhiệt cần truyền cho (1) .................... chất đó để tăng thêm (2) ....................</w:t>
-      </w:r>
-    </w:p>
-    <w:p>
-      <w:pPr>
-        <w:spacing w:before="60" w:after="60" w:line="312" w:lineRule="auto"/>
-        <w:ind w:left="283" w:hanging="170"/>
-        <w:jc w:val="both"/>
-      </w:pPr>
-      <w:r>
-        <w:rPr>
-          <w:rFonts w:ascii="Times New Roman" w:hAnsi="Times New Roman"/>
-          <w:color w:val="000000"/>
-          <w:sz w:val="26"/>
-        </w:rPr>
-        <w:t xml:space="preserve">- </w:t>
-      </w:r>
-      <w:r>
-        <w:rPr>
-          <w:rFonts w:ascii="Times New Roman" w:hAnsi="Times New Roman"/>
-          <w:b w:val="0"/>
-          <w:i w:val="0"/>
-          <w:color w:val="000000"/>
-          <w:sz w:val="26"/>
-        </w:rPr>
-        <w:t xml:space="preserve">  Đơn vị của nhiệt dung riêng là (3) ....................</w:t>
-      </w:r>
-    </w:p>
-    <w:p>
-      <w:pPr>
-        <w:spacing w:before="60" w:after="60" w:line="312" w:lineRule="auto"/>
-        <w:ind w:left="283" w:hanging="170"/>
-        <w:jc w:val="both"/>
-      </w:pPr>
-      <w:r>
-        <w:rPr>
-          <w:rFonts w:ascii="Times New Roman" w:hAnsi="Times New Roman"/>
-          <w:color w:val="000000"/>
-          <w:sz w:val="26"/>
-        </w:rPr>
-        <w:t xml:space="preserve">- </w:t>
-      </w:r>
-      <w:r>
-        <w:rPr>
-          <w:rFonts w:ascii="Times New Roman" w:hAnsi="Times New Roman"/>
-          <w:b w:val="0"/>
-          <w:i w:val="0"/>
-          <w:color w:val="000000"/>
-          <w:sz w:val="26"/>
-        </w:rPr>
-        <w:t xml:space="preserve">  *Gợi ý từ khóa:* 1 kg, 1 K (hoặc 1 độ C), J/kg.K.</w:t>
-      </w:r>
-    </w:p>
-    <w:p>
-      <w:pPr>
-        <w:pStyle w:val="Heading2"/>
-        <w:keepNext/>
-        <w:spacing w:before="160" w:after="80"/>
-        <w:ind w:left="0" w:firstLine="0"/>
-      </w:pPr>
-      <w:r>
-        <w:rPr>
-          <w:rFonts w:ascii="Times New Roman" w:hAnsi="Times New Roman"/>
-          <w:b/>
-          <w:i w:val="0"/>
-          <w:color w:val="000000"/>
-          <w:sz w:val="26"/>
-        </w:rPr>
-        <w:t>3. Vận dụng (Thời tiết và Địa lý)</w:t>
-      </w:r>
-    </w:p>
-    <w:p>
-      <w:pPr>
-        <w:spacing w:before="60" w:after="60" w:line="312" w:lineRule="auto"/>
-        <w:ind w:left="283" w:hanging="170"/>
-        <w:jc w:val="both"/>
-      </w:pPr>
-      <w:r>
-        <w:rPr>
-          <w:rFonts w:ascii="Times New Roman" w:hAnsi="Times New Roman"/>
-          <w:color w:val="000000"/>
-          <w:sz w:val="26"/>
-        </w:rPr>
-        <w:t xml:space="preserve">- </w:t>
-      </w:r>
-      <w:r>
-        <w:rPr>
-          <w:rFonts w:ascii="Times New Roman" w:hAnsi="Times New Roman"/>
-          <w:b w:val="0"/>
-          <w:i w:val="0"/>
-          <w:color w:val="000000"/>
-          <w:sz w:val="26"/>
-        </w:rPr>
-        <w:t xml:space="preserve">  </w:t>
-      </w:r>
-      <w:r>
-        <w:rPr>
-          <w:rFonts w:ascii="Times New Roman" w:hAnsi="Times New Roman"/>
-          <w:b/>
-          <w:i w:val="0"/>
-          <w:color w:val="000000"/>
-          <w:sz w:val="26"/>
-        </w:rPr>
-        <w:t>Câu hỏi:</w:t>
-      </w:r>
-      <w:r>
-        <w:rPr>
-          <w:rFonts w:ascii="Times New Roman" w:hAnsi="Times New Roman"/>
-          <w:b w:val="0"/>
-          <w:i w:val="0"/>
-          <w:color w:val="000000"/>
-          <w:sz w:val="26"/>
-        </w:rPr>
-        <w:t xml:space="preserve"> Ban ngày trời nắng, cát ở bãi biển rất nóng nhưng nước biển vẫn mát. Ban đêm thì ngược lại. Hãy giải thích hiện tượng này dựa vào nhiệt dung riêng của cát và nước.</w:t>
-      </w:r>
-    </w:p>
-    <w:p>
-      <w:pPr>
-        <w:spacing w:before="40" w:after="40"/>
-        <w:ind w:left="567"/>
-        <w:jc w:val="left"/>
-      </w:pPr>
-      <w:r>
-        <w:rPr>
-          <w:rFonts w:ascii="Times New Roman" w:hAnsi="Times New Roman"/>
-          <w:color w:val="666666"/>
-          <w:sz w:val="22"/>
-        </w:rPr>
-        <w:t>..........................................................................................</w:t>
-      </w:r>
-    </w:p>
-    <w:p>
-      <w:pPr>
-        <w:spacing w:before="40" w:after="40"/>
-        <w:ind w:left="567"/>
-        <w:jc w:val="left"/>
-      </w:pPr>
-      <w:r>
-        <w:rPr>
-          <w:rFonts w:ascii="Times New Roman" w:hAnsi="Times New Roman"/>
-          <w:color w:val="666666"/>
-          <w:sz w:val="22"/>
-        </w:rPr>
-        <w:t>..........................................................................................</w:t>
-      </w:r>
-    </w:p>
-    <w:p>
-      <w:pPr>
-        <w:pStyle w:val="Heading2"/>
-        <w:keepNext/>
-        <w:spacing w:before="160" w:after="80"/>
-        <w:ind w:left="0" w:firstLine="0"/>
-      </w:pPr>
-      <w:r>
-        <w:rPr>
-          <w:rFonts w:ascii="Times New Roman" w:hAnsi="Times New Roman"/>
-          <w:b/>
-          <w:i w:val="0"/>
-          <w:color w:val="000000"/>
-          <w:sz w:val="26"/>
-        </w:rPr>
-        <w:t>4. Mở rộng (STEM Connection)</w:t>
+        <w:t>Nhiệm vụ 9 (Mở rộng địa lý):</w:t>
       </w:r>
     </w:p>
     <w:p>
@@ -2792,7 +2523,7 @@
           <w:color w:val="000000"/>
           <w:sz w:val="26"/>
         </w:rPr>
-        <w:t>) làm ôn hòa khí hậu vùng biển. Ban ngày nước biển hấp thụ nhiệt tăng nhiệt độ chậm; ban đêm nước tỏa nhiệt giảm nhiệt độ từ từ. Sự chênh lệch nhiệt độ này tạo ra gió biển thổi luân phiên ngày và đêm.</w:t>
+        <w:t>) làm ôn hòa khí hậu vùng biển. Ban ngày nước biển hấp thụ nhiệt tăng nhiệt độ chậm; ban đêm nước biển tỏa nhiệt giảm nhiệt độ từ từ. Sự chênh lệch nhiệt dung riêng này tạo ra gió biển thổi luân phiên ngày và đêm giữa đất liền và biển cả.</w:t>
       </w:r>
     </w:p>
     <w:p>

</xml_diff>